<commit_message>
Sept 2026 refresh: founder era — Blind Bluff, NextGenix, Jarurat Care
- New resume (PDF + regenerated grey-template docx, one page)
- 10-card work row: 5 new founder-era cards with curated images
- Episodes rebuilt: 6 entries, 3 Seasons, experience moved above achievements
- Skills: Builder tile added; Coming Soon: Blind Bluff titles replace 'learning Python'
- Founder hero box, blindbluff.com links, mobile hero stat chips
- A11y: keyboard modals, focus lifecycle, aria-hidden marquee clones; lazy images
- admin.html synced to new modal keys with unknown-value guard

Co-Authored-By: Claude Fable 5 <noreply@anthropic.com>
</commit_message>
<xml_diff>
--- a/assets/Jeet_Jhawar_Resume.docx
+++ b/assets/Jeet_Jhawar_Resume.docx
@@ -5,10 +5,10 @@
     <w:p>
       <w:pPr>
         <w:widowControl w:val="0"/>
-        <w:spacing w:line="252" w:lineRule="auto"/>
+        <w:spacing w:line="240" w:lineRule="auto"/>
         <w:rPr>
-          <w:sz w:val="24"/>
-          <w:szCs w:val="24"/>
+          <w:sz w:val="20"/>
+          <w:szCs w:val="20"/>
         </w:rPr>
       </w:pPr>
     </w:p>
@@ -52,16 +52,16 @@
               <w:rPr>
                 <w:rFonts w:ascii="Garamond" w:eastAsia="Garamond" w:hAnsi="Garamond" w:cs="Garamond"/>
                 <w:b/>
-                <w:sz w:val="24"/>
-                <w:szCs w:val="24"/>
-              </w:rPr>
-            </w:pPr>
-            <w:r>
-              <w:rPr>
-                <w:rFonts w:ascii="Garamond" w:eastAsia="Garamond" w:hAnsi="Garamond" w:cs="Garamond"/>
-                <w:b/>
-                <w:sz w:val="24"/>
-                <w:szCs w:val="24"/>
+                <w:sz w:val="20"/>
+                <w:szCs w:val="20"/>
+              </w:rPr>
+            </w:pPr>
+            <w:r>
+              <w:rPr>
+                <w:rFonts w:ascii="Garamond" w:eastAsia="Garamond" w:hAnsi="Garamond" w:cs="Garamond"/>
+                <w:b/>
+                <w:sz w:val="20"/>
+                <w:szCs w:val="20"/>
               </w:rPr>
               <w:t>JEET JHAWAR</w:t>
             </w:r>
@@ -80,7 +80,7 @@
           </w:tcPr>
           <w:p>
             <w:pPr>
-              <w:spacing w:line="252" w:lineRule="auto"/>
+              <w:spacing w:line="240" w:lineRule="auto"/>
               <w:jc w:val="right"/>
               <w:rPr>
                 <w:rFonts w:ascii="Garamond" w:eastAsia="Garamond" w:hAnsi="Garamond" w:cs="Garamond"/>
@@ -108,7 +108,7 @@
           </w:tcPr>
           <w:p>
             <w:pPr>
-              <w:spacing w:line="252" w:lineRule="auto"/>
+              <w:spacing w:line="240" w:lineRule="auto"/>
               <w:jc w:val="center"/>
               <w:rPr>
                 <w:rFonts w:ascii="Garamond" w:eastAsia="Garamond" w:hAnsi="Garamond" w:cs="Garamond"/>
@@ -145,18 +145,18 @@
           </w:tcPr>
           <w:p>
             <w:pPr>
-              <w:spacing w:line="252" w:lineRule="auto"/>
-              <w:rPr>
-                <w:rFonts w:ascii="Garamond" w:eastAsia="Garamond" w:hAnsi="Garamond" w:cs="Garamond"/>
-                <w:sz w:val="24"/>
-                <w:szCs w:val="24"/>
-              </w:rPr>
-            </w:pPr>
-            <w:r>
-              <w:rPr>
-                <w:rFonts w:ascii="Garamond" w:eastAsia="Garamond" w:hAnsi="Garamond" w:cs="Garamond"/>
-                <w:sz w:val="24"/>
-                <w:szCs w:val="24"/>
+              <w:spacing w:line="240" w:lineRule="auto"/>
+              <w:rPr>
+                <w:rFonts w:ascii="Garamond" w:eastAsia="Garamond" w:hAnsi="Garamond" w:cs="Garamond"/>
+                <w:sz w:val="20"/>
+                <w:szCs w:val="20"/>
+              </w:rPr>
+            </w:pPr>
+            <w:r>
+              <w:rPr>
+                <w:rFonts w:ascii="Garamond" w:eastAsia="Garamond" w:hAnsi="Garamond" w:cs="Garamond"/>
+                <w:sz w:val="20"/>
+                <w:szCs w:val="20"/>
               </w:rPr>
               <w:t xml:space="preserve">Driven undergraduate student pursuing a </w:t>
             </w:r>
@@ -165,70 +165,52 @@
                 <w:rFonts w:ascii="Garamond" w:eastAsia="Garamond" w:hAnsi="Garamond" w:cs="Garamond"/>
                 <w:b/>
                 <w:bCs/>
-                <w:sz w:val="24"/>
-                <w:szCs w:val="24"/>
-              </w:rPr>
-              <w:t>BMS Honours at Indian Institute of Management Kozhikode</w:t>
-            </w:r>
-            <w:r>
-              <w:rPr>
-                <w:rFonts w:ascii="Garamond" w:eastAsia="Garamond" w:hAnsi="Garamond" w:cs="Garamond"/>
-                <w:sz w:val="24"/>
-                <w:szCs w:val="24"/>
-              </w:rPr>
-              <w:t xml:space="preserve">, blending a strong academic foundation with proven leadership experience. Currently serving as a </w:t>
-            </w:r>
-            <w:r>
-              <w:rPr>
-                <w:rFonts w:ascii="Garamond" w:eastAsia="Garamond" w:hAnsi="Garamond" w:cs="Garamond"/>
-                <w:b/>
-                <w:bCs/>
-                <w:sz w:val="24"/>
-                <w:szCs w:val="24"/>
-              </w:rPr>
-              <w:t>Council Member</w:t>
-            </w:r>
-            <w:r>
-              <w:rPr>
-                <w:rFonts w:ascii="Garamond" w:eastAsia="Garamond" w:hAnsi="Garamond" w:cs="Garamond"/>
-                <w:sz w:val="24"/>
-                <w:szCs w:val="24"/>
-              </w:rPr>
-              <w:t xml:space="preserve">, applying </w:t>
-            </w:r>
-            <w:r>
-              <w:rPr>
-                <w:rFonts w:ascii="Garamond" w:eastAsia="Garamond" w:hAnsi="Garamond" w:cs="Garamond"/>
-                <w:b/>
-                <w:bCs/>
-                <w:sz w:val="24"/>
-                <w:szCs w:val="24"/>
-              </w:rPr>
-              <w:t>analytical skills</w:t>
-            </w:r>
-            <w:r>
-              <w:rPr>
-                <w:rFonts w:ascii="Garamond" w:eastAsia="Garamond" w:hAnsi="Garamond" w:cs="Garamond"/>
-                <w:sz w:val="24"/>
-                <w:szCs w:val="24"/>
-              </w:rPr>
-              <w:t xml:space="preserve"> and a head for numbers to manage budgets, streamline communications, and organize large-scale events. Passionate about </w:t>
-            </w:r>
-            <w:r>
-              <w:rPr>
-                <w:rFonts w:ascii="Garamond" w:eastAsia="Garamond" w:hAnsi="Garamond" w:cs="Garamond"/>
-                <w:b/>
-                <w:bCs/>
-                <w:sz w:val="24"/>
-                <w:szCs w:val="24"/>
-              </w:rPr>
-              <w:t>entrepreneurship</w:t>
-            </w:r>
-            <w:r>
-              <w:rPr>
-                <w:rFonts w:ascii="Garamond" w:eastAsia="Garamond" w:hAnsi="Garamond" w:cs="Garamond"/>
-                <w:sz w:val="24"/>
-                <w:szCs w:val="24"/>
+                <w:sz w:val="20"/>
+                <w:szCs w:val="20"/>
+              </w:rPr>
+              <w:t xml:space="preserve">BMS Honours at Indian Institute of Management Kozhikode</w:t>
+            </w:r>
+            <w:r>
+              <w:rPr>
+                <w:rFonts w:ascii="Garamond" w:eastAsia="Garamond" w:hAnsi="Garamond" w:cs="Garamond"/>
+                <w:sz w:val="20"/>
+                <w:szCs w:val="20"/>
+              </w:rPr>
+              <w:t xml:space="preserve"> (95.60% in Class XII), currently building </w:t>
+            </w:r>
+            <w:r>
+              <w:rPr>
+                <w:rFonts w:ascii="Garamond" w:eastAsia="Garamond" w:hAnsi="Garamond" w:cs="Garamond"/>
+                <w:b/>
+                <w:bCs/>
+                <w:sz w:val="20"/>
+                <w:szCs w:val="20"/>
+              </w:rPr>
+              <w:t xml:space="preserve">Blind Bluff</w:t>
+            </w:r>
+            <w:r>
+              <w:rPr>
+                <w:rFonts w:ascii="Garamond" w:eastAsia="Garamond" w:hAnsi="Garamond" w:cs="Garamond"/>
+                <w:sz w:val="20"/>
+                <w:szCs w:val="20"/>
+              </w:rPr>
+              <w:t xml:space="preserve"> (a games brand with a live storefront) alongside roles as </w:t>
+            </w:r>
+            <w:r>
+              <w:rPr>
+                <w:rFonts w:ascii="Garamond" w:eastAsia="Garamond" w:hAnsi="Garamond" w:cs="Garamond"/>
+                <w:b/>
+                <w:bCs/>
+                <w:sz w:val="20"/>
+                <w:szCs w:val="20"/>
+              </w:rPr>
+              <w:t xml:space="preserve">Senior Marketing Manager at NextGenix</w:t>
+            </w:r>
+            <w:r>
+              <w:rPr>
+                <w:rFonts w:ascii="Garamond" w:eastAsia="Garamond" w:hAnsi="Garamond" w:cs="Garamond"/>
+                <w:sz w:val="20"/>
+                <w:szCs w:val="20"/>
               </w:rPr>
               <w:t xml:space="preserve">, </w:t>
             </w:r>
@@ -237,36 +219,108 @@
                 <w:rFonts w:ascii="Garamond" w:eastAsia="Garamond" w:hAnsi="Garamond" w:cs="Garamond"/>
                 <w:b/>
                 <w:bCs/>
-                <w:sz w:val="24"/>
-                <w:szCs w:val="24"/>
-              </w:rPr>
-              <w:t>problem-solving</w:t>
-            </w:r>
-            <w:r>
-              <w:rPr>
-                <w:rFonts w:ascii="Garamond" w:eastAsia="Garamond" w:hAnsi="Garamond" w:cs="Garamond"/>
-                <w:sz w:val="24"/>
-                <w:szCs w:val="24"/>
-              </w:rPr>
-              <w:t xml:space="preserve">, and </w:t>
-            </w:r>
-            <w:r>
-              <w:rPr>
-                <w:rFonts w:ascii="Garamond" w:eastAsia="Garamond" w:hAnsi="Garamond" w:cs="Garamond"/>
-                <w:b/>
-                <w:bCs/>
-                <w:sz w:val="24"/>
-                <w:szCs w:val="24"/>
-              </w:rPr>
-              <w:t>creating positive societal impact</w:t>
-            </w:r>
-            <w:r>
-              <w:rPr>
-                <w:rFonts w:ascii="Garamond" w:eastAsia="Garamond" w:hAnsi="Garamond" w:cs="Garamond"/>
-                <w:sz w:val="24"/>
-                <w:szCs w:val="24"/>
-              </w:rPr>
-              <w:t xml:space="preserve"> through strategic innovation.</w:t>
+                <w:sz w:val="20"/>
+                <w:szCs w:val="20"/>
+              </w:rPr>
+              <w:t xml:space="preserve">HR Intern at Jarurat Care Foundation</w:t>
+            </w:r>
+            <w:r>
+              <w:rPr>
+                <w:rFonts w:ascii="Garamond" w:eastAsia="Garamond" w:hAnsi="Garamond" w:cs="Garamond"/>
+                <w:sz w:val="20"/>
+                <w:szCs w:val="20"/>
+              </w:rPr>
+              <w:t xml:space="preserve"> and </w:t>
+            </w:r>
+            <w:r>
+              <w:rPr>
+                <w:rFonts w:ascii="Garamond" w:eastAsia="Garamond" w:hAnsi="Garamond" w:cs="Garamond"/>
+                <w:b/>
+                <w:bCs/>
+                <w:sz w:val="20"/>
+                <w:szCs w:val="20"/>
+              </w:rPr>
+              <w:t xml:space="preserve">Council Member at IIMK</w:t>
+            </w:r>
+            <w:r>
+              <w:rPr>
+                <w:rFonts w:ascii="Garamond" w:eastAsia="Garamond" w:hAnsi="Garamond" w:cs="Garamond"/>
+                <w:sz w:val="20"/>
+                <w:szCs w:val="20"/>
+              </w:rPr>
+              <w:t xml:space="preserve">. Manages budgets, sponsor pipelines and client relationships; builds small </w:t>
+            </w:r>
+            <w:r>
+              <w:rPr>
+                <w:rFonts w:ascii="Garamond" w:eastAsia="Garamond" w:hAnsi="Garamond" w:cs="Garamond"/>
+                <w:b/>
+                <w:bCs/>
+                <w:sz w:val="20"/>
+                <w:szCs w:val="20"/>
+              </w:rPr>
+              <w:t xml:space="preserve">Python/Selenium and Firebase tools</w:t>
+            </w:r>
+            <w:r>
+              <w:rPr>
+                <w:rFonts w:ascii="Garamond" w:eastAsia="Garamond" w:hAnsi="Garamond" w:cs="Garamond"/>
+                <w:sz w:val="20"/>
+                <w:szCs w:val="20"/>
+              </w:rPr>
+              <w:t xml:space="preserve"> to automate outreach and operations; passionate about </w:t>
+            </w:r>
+            <w:r>
+              <w:rPr>
+                <w:rFonts w:ascii="Garamond" w:eastAsia="Garamond" w:hAnsi="Garamond" w:cs="Garamond"/>
+                <w:b/>
+                <w:bCs/>
+                <w:sz w:val="20"/>
+                <w:szCs w:val="20"/>
+              </w:rPr>
+              <w:t xml:space="preserve">entrepreneurship</w:t>
+            </w:r>
+            <w:r>
+              <w:rPr>
+                <w:rFonts w:ascii="Garamond" w:eastAsia="Garamond" w:hAnsi="Garamond" w:cs="Garamond"/>
+                <w:sz w:val="20"/>
+                <w:szCs w:val="20"/>
+              </w:rPr>
+              <w:t xml:space="preserve">, </w:t>
+            </w:r>
+            <w:r>
+              <w:rPr>
+                <w:rFonts w:ascii="Garamond" w:eastAsia="Garamond" w:hAnsi="Garamond" w:cs="Garamond"/>
+                <w:b/>
+                <w:bCs/>
+                <w:sz w:val="20"/>
+                <w:szCs w:val="20"/>
+              </w:rPr>
+              <w:t xml:space="preserve">problem-solving</w:t>
+            </w:r>
+            <w:r>
+              <w:rPr>
+                <w:rFonts w:ascii="Garamond" w:eastAsia="Garamond" w:hAnsi="Garamond" w:cs="Garamond"/>
+                <w:sz w:val="20"/>
+                <w:szCs w:val="20"/>
+              </w:rPr>
+              <w:t xml:space="preserve"> and creating </w:t>
+            </w:r>
+            <w:r>
+              <w:rPr>
+                <w:rFonts w:ascii="Garamond" w:eastAsia="Garamond" w:hAnsi="Garamond" w:cs="Garamond"/>
+                <w:b/>
+                <w:bCs/>
+                <w:sz w:val="20"/>
+                <w:szCs w:val="20"/>
+              </w:rPr>
+              <w:t xml:space="preserve">positive societal impact</w:t>
+            </w:r>
+            <w:r>
+              <w:rPr>
+                <w:rFonts w:ascii="Garamond" w:eastAsia="Garamond" w:hAnsi="Garamond" w:cs="Garamond"/>
+                <w:sz w:val="20"/>
+                <w:szCs w:val="20"/>
+              </w:rPr>
+              <w:t xml:space="preserve">.</w:t>
             </w:r>
           </w:p>
         </w:tc>
@@ -305,14 +359,14 @@
           </w:tcPr>
           <w:p>
             <w:pPr>
-              <w:spacing w:line="252" w:lineRule="auto"/>
+              <w:spacing w:line="240" w:lineRule="auto"/>
               <w:jc w:val="center"/>
               <w:rPr>
                 <w:rFonts w:ascii="Garamond" w:eastAsia="Garamond" w:hAnsi="Garamond" w:cs="Garamond"/>
                 <w:b/>
                 <w:color w:val="000000"/>
-                <w:sz w:val="24"/>
-                <w:szCs w:val="24"/>
+                <w:sz w:val="20"/>
+                <w:szCs w:val="20"/>
               </w:rPr>
             </w:pPr>
             <w:r>
@@ -320,8 +374,8 @@
                 <w:rFonts w:ascii="Garamond" w:hAnsi="Garamond"/>
                 <w:b/>
                 <w:bCs/>
-                <w:sz w:val="24"/>
-                <w:szCs w:val="24"/>
+                <w:sz w:val="20"/>
+                <w:szCs w:val="20"/>
               </w:rPr>
               <w:t>Objective</w:t>
             </w:r>
@@ -371,18 +425,18 @@
           </w:tcPr>
           <w:p>
             <w:pPr>
-              <w:spacing w:line="252" w:lineRule="auto"/>
-              <w:rPr>
-                <w:rFonts w:ascii="Garamond" w:eastAsia="Garamond" w:hAnsi="Garamond" w:cs="Garamond"/>
-                <w:sz w:val="24"/>
-                <w:szCs w:val="24"/>
+              <w:spacing w:line="240" w:lineRule="auto"/>
+              <w:rPr>
+                <w:rFonts w:ascii="Garamond" w:eastAsia="Garamond" w:hAnsi="Garamond" w:cs="Garamond"/>
+                <w:sz w:val="20"/>
+                <w:szCs w:val="20"/>
               </w:rPr>
             </w:pPr>
             <w:r>
               <w:rPr>
                 <w:rFonts w:ascii="Garamond" w:hAnsi="Garamond"/>
-                <w:sz w:val="24"/>
-                <w:szCs w:val="24"/>
+                <w:sz w:val="20"/>
+                <w:szCs w:val="20"/>
               </w:rPr>
               <w:t xml:space="preserve">My Objective in life is to continuously </w:t>
             </w:r>
@@ -391,16 +445,16 @@
                 <w:rFonts w:ascii="Garamond" w:hAnsi="Garamond"/>
                 <w:b/>
                 <w:bCs/>
-                <w:sz w:val="24"/>
-                <w:szCs w:val="24"/>
+                <w:sz w:val="20"/>
+                <w:szCs w:val="20"/>
               </w:rPr>
               <w:t>acquire knowledge</w:t>
             </w:r>
             <w:r>
               <w:rPr>
                 <w:rFonts w:ascii="Garamond" w:hAnsi="Garamond"/>
-                <w:sz w:val="24"/>
-                <w:szCs w:val="24"/>
+                <w:sz w:val="20"/>
+                <w:szCs w:val="20"/>
               </w:rPr>
               <w:t xml:space="preserve">, </w:t>
             </w:r>
@@ -409,16 +463,16 @@
                 <w:rFonts w:ascii="Garamond" w:hAnsi="Garamond"/>
                 <w:b/>
                 <w:bCs/>
-                <w:sz w:val="24"/>
-                <w:szCs w:val="24"/>
+                <w:sz w:val="20"/>
+                <w:szCs w:val="20"/>
               </w:rPr>
               <w:t>work diligently</w:t>
             </w:r>
             <w:r>
               <w:rPr>
                 <w:rFonts w:ascii="Garamond" w:hAnsi="Garamond"/>
-                <w:sz w:val="24"/>
-                <w:szCs w:val="24"/>
+                <w:sz w:val="20"/>
+                <w:szCs w:val="20"/>
               </w:rPr>
               <w:t xml:space="preserve">, and have </w:t>
             </w:r>
@@ -427,16 +481,16 @@
                 <w:rFonts w:ascii="Garamond" w:hAnsi="Garamond"/>
                 <w:b/>
                 <w:bCs/>
-                <w:sz w:val="24"/>
-                <w:szCs w:val="24"/>
+                <w:sz w:val="20"/>
+                <w:szCs w:val="20"/>
               </w:rPr>
               <w:t>perseverance</w:t>
             </w:r>
             <w:r>
               <w:rPr>
                 <w:rFonts w:ascii="Garamond" w:hAnsi="Garamond"/>
-                <w:sz w:val="24"/>
-                <w:szCs w:val="24"/>
+                <w:sz w:val="20"/>
+                <w:szCs w:val="20"/>
               </w:rPr>
               <w:t xml:space="preserve">                                     to realise the great life</w:t>
             </w:r>
@@ -462,7 +516,7 @@
           </w:tcPr>
           <w:p>
             <w:pPr>
-              <w:spacing w:line="252" w:lineRule="auto"/>
+              <w:spacing w:line="240" w:lineRule="auto"/>
               <w:ind w:left="360"/>
               <w:jc w:val="center"/>
               <w:rPr>
@@ -496,21 +550,21 @@
           </w:tcPr>
           <w:p>
             <w:pPr>
-              <w:spacing w:line="252" w:lineRule="auto"/>
+              <w:spacing w:line="240" w:lineRule="auto"/>
               <w:jc w:val="center"/>
               <w:rPr>
                 <w:rFonts w:ascii="Garamond" w:eastAsia="Garamond" w:hAnsi="Garamond" w:cs="Garamond"/>
                 <w:b/>
-                <w:sz w:val="24"/>
-                <w:szCs w:val="24"/>
-              </w:rPr>
-            </w:pPr>
-            <w:r>
-              <w:rPr>
-                <w:rFonts w:ascii="Garamond" w:eastAsia="Garamond" w:hAnsi="Garamond" w:cs="Garamond"/>
-                <w:b/>
-                <w:sz w:val="24"/>
-                <w:szCs w:val="24"/>
+                <w:sz w:val="20"/>
+                <w:szCs w:val="20"/>
+              </w:rPr>
+            </w:pPr>
+            <w:r>
+              <w:rPr>
+                <w:rFonts w:ascii="Garamond" w:eastAsia="Garamond" w:hAnsi="Garamond" w:cs="Garamond"/>
+                <w:b/>
+                <w:sz w:val="20"/>
+                <w:szCs w:val="20"/>
               </w:rPr>
               <w:t>Year</w:t>
             </w:r>
@@ -525,21 +579,21 @@
           </w:tcPr>
           <w:p>
             <w:pPr>
-              <w:spacing w:line="252" w:lineRule="auto"/>
+              <w:spacing w:line="240" w:lineRule="auto"/>
               <w:jc w:val="center"/>
               <w:rPr>
                 <w:rFonts w:ascii="Garamond" w:eastAsia="Garamond" w:hAnsi="Garamond" w:cs="Garamond"/>
                 <w:b/>
-                <w:sz w:val="24"/>
-                <w:szCs w:val="24"/>
-              </w:rPr>
-            </w:pPr>
-            <w:r>
-              <w:rPr>
-                <w:rFonts w:ascii="Garamond" w:eastAsia="Garamond" w:hAnsi="Garamond" w:cs="Garamond"/>
-                <w:b/>
-                <w:sz w:val="24"/>
-                <w:szCs w:val="24"/>
+                <w:sz w:val="20"/>
+                <w:szCs w:val="20"/>
+              </w:rPr>
+            </w:pPr>
+            <w:r>
+              <w:rPr>
+                <w:rFonts w:ascii="Garamond" w:eastAsia="Garamond" w:hAnsi="Garamond" w:cs="Garamond"/>
+                <w:b/>
+                <w:sz w:val="20"/>
+                <w:szCs w:val="20"/>
               </w:rPr>
               <w:t>Qualification</w:t>
             </w:r>
@@ -553,21 +607,21 @@
           </w:tcPr>
           <w:p>
             <w:pPr>
-              <w:spacing w:line="252" w:lineRule="auto"/>
+              <w:spacing w:line="240" w:lineRule="auto"/>
               <w:jc w:val="center"/>
               <w:rPr>
                 <w:rFonts w:ascii="Garamond" w:eastAsia="Garamond" w:hAnsi="Garamond" w:cs="Garamond"/>
                 <w:b/>
-                <w:sz w:val="24"/>
-                <w:szCs w:val="24"/>
-              </w:rPr>
-            </w:pPr>
-            <w:r>
-              <w:rPr>
-                <w:rFonts w:ascii="Garamond" w:eastAsia="Garamond" w:hAnsi="Garamond" w:cs="Garamond"/>
-                <w:b/>
-                <w:sz w:val="24"/>
-                <w:szCs w:val="24"/>
+                <w:sz w:val="20"/>
+                <w:szCs w:val="20"/>
+              </w:rPr>
+            </w:pPr>
+            <w:r>
+              <w:rPr>
+                <w:rFonts w:ascii="Garamond" w:eastAsia="Garamond" w:hAnsi="Garamond" w:cs="Garamond"/>
+                <w:b/>
+                <w:sz w:val="20"/>
+                <w:szCs w:val="20"/>
               </w:rPr>
               <w:t>Institute</w:t>
             </w:r>
@@ -582,21 +636,21 @@
           </w:tcPr>
           <w:p>
             <w:pPr>
-              <w:spacing w:line="252" w:lineRule="auto"/>
+              <w:spacing w:line="240" w:lineRule="auto"/>
               <w:jc w:val="center"/>
               <w:rPr>
                 <w:rFonts w:ascii="Garamond" w:eastAsia="Garamond" w:hAnsi="Garamond" w:cs="Garamond"/>
                 <w:b/>
-                <w:sz w:val="24"/>
-                <w:szCs w:val="24"/>
-              </w:rPr>
-            </w:pPr>
-            <w:r>
-              <w:rPr>
-                <w:rFonts w:ascii="Garamond" w:eastAsia="Garamond" w:hAnsi="Garamond" w:cs="Garamond"/>
-                <w:b/>
-                <w:sz w:val="24"/>
-                <w:szCs w:val="24"/>
+                <w:sz w:val="20"/>
+                <w:szCs w:val="20"/>
+              </w:rPr>
+            </w:pPr>
+            <w:r>
+              <w:rPr>
+                <w:rFonts w:ascii="Garamond" w:eastAsia="Garamond" w:hAnsi="Garamond" w:cs="Garamond"/>
+                <w:b/>
+                <w:sz w:val="20"/>
+                <w:szCs w:val="20"/>
               </w:rPr>
               <w:t xml:space="preserve">% </w:t>
             </w:r>
@@ -613,19 +667,19 @@
           </w:tcPr>
           <w:p>
             <w:pPr>
-              <w:spacing w:line="252" w:lineRule="auto"/>
+              <w:spacing w:line="240" w:lineRule="auto"/>
               <w:jc w:val="center"/>
               <w:rPr>
                 <w:rFonts w:ascii="Garamond" w:eastAsia="Garamond" w:hAnsi="Garamond" w:cs="Garamond"/>
-                <w:sz w:val="24"/>
-                <w:szCs w:val="24"/>
-              </w:rPr>
-            </w:pPr>
-            <w:r>
-              <w:rPr>
-                <w:rFonts w:ascii="Garamond" w:eastAsia="Garamond" w:hAnsi="Garamond" w:cs="Garamond"/>
-                <w:sz w:val="24"/>
-                <w:szCs w:val="24"/>
+                <w:sz w:val="20"/>
+                <w:szCs w:val="20"/>
+              </w:rPr>
+            </w:pPr>
+            <w:r>
+              <w:rPr>
+                <w:rFonts w:ascii="Garamond" w:eastAsia="Garamond" w:hAnsi="Garamond" w:cs="Garamond"/>
+                <w:sz w:val="20"/>
+                <w:szCs w:val="20"/>
               </w:rPr>
               <w:t>2025-2029</w:t>
             </w:r>
@@ -638,19 +692,19 @@
           </w:tcPr>
           <w:p>
             <w:pPr>
-              <w:spacing w:line="252" w:lineRule="auto"/>
+              <w:spacing w:line="240" w:lineRule="auto"/>
               <w:jc w:val="center"/>
               <w:rPr>
                 <w:rFonts w:ascii="Garamond" w:eastAsia="Garamond" w:hAnsi="Garamond" w:cs="Garamond"/>
-                <w:sz w:val="24"/>
-                <w:szCs w:val="24"/>
-              </w:rPr>
-            </w:pPr>
-            <w:r>
-              <w:rPr>
-                <w:rFonts w:ascii="Garamond" w:eastAsia="Garamond" w:hAnsi="Garamond" w:cs="Garamond"/>
-                <w:sz w:val="24"/>
-                <w:szCs w:val="24"/>
+                <w:sz w:val="20"/>
+                <w:szCs w:val="20"/>
+              </w:rPr>
+            </w:pPr>
+            <w:r>
+              <w:rPr>
+                <w:rFonts w:ascii="Garamond" w:eastAsia="Garamond" w:hAnsi="Garamond" w:cs="Garamond"/>
+                <w:sz w:val="20"/>
+                <w:szCs w:val="20"/>
               </w:rPr>
               <w:t>BMS (Honours)</w:t>
             </w:r>
@@ -662,19 +716,19 @@
           </w:tcPr>
           <w:p>
             <w:pPr>
-              <w:spacing w:line="252" w:lineRule="auto"/>
+              <w:spacing w:line="240" w:lineRule="auto"/>
               <w:jc w:val="center"/>
               <w:rPr>
                 <w:rFonts w:ascii="Garamond" w:eastAsia="Garamond" w:hAnsi="Garamond" w:cs="Garamond"/>
-                <w:sz w:val="24"/>
-                <w:szCs w:val="24"/>
-              </w:rPr>
-            </w:pPr>
-            <w:r>
-              <w:rPr>
-                <w:rFonts w:ascii="Garamond" w:eastAsia="Garamond" w:hAnsi="Garamond" w:cs="Garamond"/>
-                <w:sz w:val="24"/>
-                <w:szCs w:val="24"/>
+                <w:sz w:val="20"/>
+                <w:szCs w:val="20"/>
+              </w:rPr>
+            </w:pPr>
+            <w:r>
+              <w:rPr>
+                <w:rFonts w:ascii="Garamond" w:eastAsia="Garamond" w:hAnsi="Garamond" w:cs="Garamond"/>
+                <w:sz w:val="20"/>
+                <w:szCs w:val="20"/>
               </w:rPr>
               <w:t xml:space="preserve">Indian Institute of Management Kozhikode</w:t>
             </w:r>
@@ -687,19 +741,19 @@
           </w:tcPr>
           <w:p>
             <w:pPr>
-              <w:spacing w:line="252" w:lineRule="auto"/>
+              <w:spacing w:line="240" w:lineRule="auto"/>
               <w:jc w:val="center"/>
               <w:rPr>
                 <w:rFonts w:ascii="Garamond" w:eastAsia="Garamond" w:hAnsi="Garamond" w:cs="Garamond"/>
-                <w:sz w:val="24"/>
-                <w:szCs w:val="24"/>
-              </w:rPr>
-            </w:pPr>
-            <w:r>
-              <w:rPr>
-                <w:rFonts w:ascii="Garamond" w:eastAsia="Garamond" w:hAnsi="Garamond" w:cs="Garamond"/>
-                <w:sz w:val="24"/>
-                <w:szCs w:val="24"/>
+                <w:sz w:val="20"/>
+                <w:szCs w:val="20"/>
+              </w:rPr>
+            </w:pPr>
+            <w:r>
+              <w:rPr>
+                <w:rFonts w:ascii="Garamond" w:eastAsia="Garamond" w:hAnsi="Garamond" w:cs="Garamond"/>
+                <w:sz w:val="20"/>
+                <w:szCs w:val="20"/>
               </w:rPr>
               <w:t>-</w:t>
             </w:r>
@@ -716,19 +770,19 @@
           </w:tcPr>
           <w:p>
             <w:pPr>
-              <w:spacing w:line="252" w:lineRule="auto"/>
+              <w:spacing w:line="240" w:lineRule="auto"/>
               <w:jc w:val="center"/>
               <w:rPr>
                 <w:rFonts w:ascii="Garamond" w:eastAsia="Garamond" w:hAnsi="Garamond" w:cs="Garamond"/>
-                <w:sz w:val="24"/>
-                <w:szCs w:val="24"/>
-              </w:rPr>
-            </w:pPr>
-            <w:r>
-              <w:rPr>
-                <w:rFonts w:ascii="Garamond" w:eastAsia="Garamond" w:hAnsi="Garamond" w:cs="Garamond"/>
-                <w:sz w:val="24"/>
-                <w:szCs w:val="24"/>
+                <w:sz w:val="20"/>
+                <w:szCs w:val="20"/>
+              </w:rPr>
+            </w:pPr>
+            <w:r>
+              <w:rPr>
+                <w:rFonts w:ascii="Garamond" w:eastAsia="Garamond" w:hAnsi="Garamond" w:cs="Garamond"/>
+                <w:sz w:val="20"/>
+                <w:szCs w:val="20"/>
               </w:rPr>
               <w:t>2025</w:t>
             </w:r>
@@ -741,19 +795,19 @@
           </w:tcPr>
           <w:p>
             <w:pPr>
-              <w:spacing w:line="252" w:lineRule="auto"/>
+              <w:spacing w:line="240" w:lineRule="auto"/>
               <w:jc w:val="center"/>
               <w:rPr>
                 <w:rFonts w:ascii="Garamond" w:eastAsia="Garamond" w:hAnsi="Garamond" w:cs="Garamond"/>
-                <w:sz w:val="24"/>
-                <w:szCs w:val="24"/>
-              </w:rPr>
-            </w:pPr>
-            <w:r>
-              <w:rPr>
-                <w:rFonts w:ascii="Garamond" w:eastAsia="Garamond" w:hAnsi="Garamond" w:cs="Garamond"/>
-                <w:sz w:val="24"/>
-                <w:szCs w:val="24"/>
+                <w:sz w:val="20"/>
+                <w:szCs w:val="20"/>
+              </w:rPr>
+            </w:pPr>
+            <w:r>
+              <w:rPr>
+                <w:rFonts w:ascii="Garamond" w:eastAsia="Garamond" w:hAnsi="Garamond" w:cs="Garamond"/>
+                <w:sz w:val="20"/>
+                <w:szCs w:val="20"/>
               </w:rPr>
               <w:t>Class XII (CBSE)</w:t>
             </w:r>
@@ -765,19 +819,19 @@
           </w:tcPr>
           <w:p>
             <w:pPr>
-              <w:spacing w:line="252" w:lineRule="auto"/>
+              <w:spacing w:line="240" w:lineRule="auto"/>
               <w:jc w:val="center"/>
               <w:rPr>
                 <w:rFonts w:ascii="Garamond" w:eastAsia="Garamond" w:hAnsi="Garamond" w:cs="Garamond"/>
-                <w:sz w:val="24"/>
-                <w:szCs w:val="24"/>
-              </w:rPr>
-            </w:pPr>
-            <w:r>
-              <w:rPr>
-                <w:rFonts w:ascii="Garamond" w:eastAsia="Garamond" w:hAnsi="Garamond" w:cs="Garamond"/>
-                <w:sz w:val="24"/>
-                <w:szCs w:val="24"/>
+                <w:sz w:val="20"/>
+                <w:szCs w:val="20"/>
+              </w:rPr>
+            </w:pPr>
+            <w:r>
+              <w:rPr>
+                <w:rFonts w:ascii="Garamond" w:eastAsia="Garamond" w:hAnsi="Garamond" w:cs="Garamond"/>
+                <w:sz w:val="20"/>
+                <w:szCs w:val="20"/>
               </w:rPr>
               <w:t>St. Arnold’s School, Indore</w:t>
             </w:r>
@@ -790,19 +844,19 @@
           </w:tcPr>
           <w:p>
             <w:pPr>
-              <w:spacing w:line="252" w:lineRule="auto"/>
+              <w:spacing w:line="240" w:lineRule="auto"/>
               <w:jc w:val="center"/>
               <w:rPr>
                 <w:rFonts w:ascii="Garamond" w:eastAsia="Garamond" w:hAnsi="Garamond" w:cs="Garamond"/>
-                <w:sz w:val="24"/>
-                <w:szCs w:val="24"/>
-              </w:rPr>
-            </w:pPr>
-            <w:r>
-              <w:rPr>
-                <w:rFonts w:ascii="Garamond" w:eastAsia="Garamond" w:hAnsi="Garamond" w:cs="Garamond"/>
-                <w:sz w:val="24"/>
-                <w:szCs w:val="24"/>
+                <w:sz w:val="20"/>
+                <w:szCs w:val="20"/>
+              </w:rPr>
+            </w:pPr>
+            <w:r>
+              <w:rPr>
+                <w:rFonts w:ascii="Garamond" w:eastAsia="Garamond" w:hAnsi="Garamond" w:cs="Garamond"/>
+                <w:sz w:val="20"/>
+                <w:szCs w:val="20"/>
               </w:rPr>
               <w:t>95.60%</w:t>
             </w:r>
@@ -819,19 +873,19 @@
           </w:tcPr>
           <w:p>
             <w:pPr>
-              <w:spacing w:line="252" w:lineRule="auto"/>
+              <w:spacing w:line="240" w:lineRule="auto"/>
               <w:jc w:val="center"/>
               <w:rPr>
                 <w:rFonts w:ascii="Garamond" w:eastAsia="Garamond" w:hAnsi="Garamond" w:cs="Garamond"/>
-                <w:sz w:val="24"/>
-                <w:szCs w:val="24"/>
-              </w:rPr>
-            </w:pPr>
-            <w:r>
-              <w:rPr>
-                <w:rFonts w:ascii="Garamond" w:eastAsia="Garamond" w:hAnsi="Garamond" w:cs="Garamond"/>
-                <w:sz w:val="24"/>
-                <w:szCs w:val="24"/>
+                <w:sz w:val="20"/>
+                <w:szCs w:val="20"/>
+              </w:rPr>
+            </w:pPr>
+            <w:r>
+              <w:rPr>
+                <w:rFonts w:ascii="Garamond" w:eastAsia="Garamond" w:hAnsi="Garamond" w:cs="Garamond"/>
+                <w:sz w:val="20"/>
+                <w:szCs w:val="20"/>
               </w:rPr>
               <w:t>2023</w:t>
             </w:r>
@@ -844,19 +898,19 @@
           </w:tcPr>
           <w:p>
             <w:pPr>
-              <w:spacing w:line="252" w:lineRule="auto"/>
+              <w:spacing w:line="240" w:lineRule="auto"/>
               <w:jc w:val="center"/>
               <w:rPr>
                 <w:rFonts w:ascii="Garamond" w:eastAsia="Garamond" w:hAnsi="Garamond" w:cs="Garamond"/>
-                <w:sz w:val="24"/>
-                <w:szCs w:val="24"/>
-              </w:rPr>
-            </w:pPr>
-            <w:r>
-              <w:rPr>
-                <w:rFonts w:ascii="Garamond" w:eastAsia="Garamond" w:hAnsi="Garamond" w:cs="Garamond"/>
-                <w:sz w:val="24"/>
-                <w:szCs w:val="24"/>
+                <w:sz w:val="20"/>
+                <w:szCs w:val="20"/>
+              </w:rPr>
+            </w:pPr>
+            <w:r>
+              <w:rPr>
+                <w:rFonts w:ascii="Garamond" w:eastAsia="Garamond" w:hAnsi="Garamond" w:cs="Garamond"/>
+                <w:sz w:val="20"/>
+                <w:szCs w:val="20"/>
               </w:rPr>
               <w:t>Class X (CBSE)</w:t>
             </w:r>
@@ -868,19 +922,19 @@
           </w:tcPr>
           <w:p>
             <w:pPr>
-              <w:spacing w:line="252" w:lineRule="auto"/>
+              <w:spacing w:line="240" w:lineRule="auto"/>
               <w:jc w:val="center"/>
               <w:rPr>
                 <w:rFonts w:ascii="Garamond" w:eastAsia="Garamond" w:hAnsi="Garamond" w:cs="Garamond"/>
-                <w:sz w:val="24"/>
-                <w:szCs w:val="24"/>
-              </w:rPr>
-            </w:pPr>
-            <w:r>
-              <w:rPr>
-                <w:rFonts w:ascii="Garamond" w:eastAsia="Garamond" w:hAnsi="Garamond" w:cs="Garamond"/>
-                <w:sz w:val="24"/>
-                <w:szCs w:val="24"/>
+                <w:sz w:val="20"/>
+                <w:szCs w:val="20"/>
+              </w:rPr>
+            </w:pPr>
+            <w:r>
+              <w:rPr>
+                <w:rFonts w:ascii="Garamond" w:eastAsia="Garamond" w:hAnsi="Garamond" w:cs="Garamond"/>
+                <w:sz w:val="20"/>
+                <w:szCs w:val="20"/>
               </w:rPr>
               <w:t>St. Arnold’s School, Indore</w:t>
             </w:r>
@@ -893,19 +947,19 @@
           </w:tcPr>
           <w:p>
             <w:pPr>
-              <w:spacing w:line="252" w:lineRule="auto"/>
+              <w:spacing w:line="240" w:lineRule="auto"/>
               <w:jc w:val="center"/>
               <w:rPr>
                 <w:rFonts w:ascii="Garamond" w:eastAsia="Garamond" w:hAnsi="Garamond" w:cs="Garamond"/>
-                <w:sz w:val="24"/>
-                <w:szCs w:val="24"/>
-              </w:rPr>
-            </w:pPr>
-            <w:r>
-              <w:rPr>
-                <w:rFonts w:ascii="Garamond" w:eastAsia="Garamond" w:hAnsi="Garamond" w:cs="Garamond"/>
-                <w:sz w:val="24"/>
-                <w:szCs w:val="24"/>
+                <w:sz w:val="20"/>
+                <w:szCs w:val="20"/>
+              </w:rPr>
+            </w:pPr>
+            <w:r>
+              <w:rPr>
+                <w:rFonts w:ascii="Garamond" w:eastAsia="Garamond" w:hAnsi="Garamond" w:cs="Garamond"/>
+                <w:sz w:val="20"/>
+                <w:szCs w:val="20"/>
               </w:rPr>
               <w:t>95.00%</w:t>
             </w:r>
@@ -925,7 +979,7 @@
           </w:tcPr>
           <w:p>
             <w:pPr>
-              <w:spacing w:line="252" w:lineRule="auto"/>
+              <w:spacing w:line="240" w:lineRule="auto"/>
               <w:jc w:val="center"/>
               <w:rPr>
                 <w:rFonts w:ascii="Garamond" w:eastAsia="Garamond" w:hAnsi="Garamond" w:cs="Garamond"/>
@@ -941,15 +995,12 @@
                 <w:sz w:val="26"/>
                 <w:szCs w:val="26"/>
               </w:rPr>
-              <w:t>POSITIONS OF RESPONSIBILITY</w:t>
+              <w:t>WORK EXPERIENCE</w:t>
             </w:r>
           </w:p>
         </w:tc>
       </w:tr>
       <w:tr>
-        <w:trPr>
-          <w:trHeight w:val="67"/>
-        </w:trPr>
         <w:tc>
           <w:tcPr>
             <w:tcW w:w="2078" w:type="dxa"/>
@@ -959,23 +1010,24 @@
           </w:tcPr>
           <w:p>
             <w:pPr>
-              <w:spacing w:line="252" w:lineRule="auto"/>
+              <w:spacing w:line="240" w:lineRule="auto"/>
               <w:ind w:left="360"/>
               <w:rPr>
                 <w:rFonts w:ascii="Garamond" w:eastAsia="Garamond" w:hAnsi="Garamond" w:cs="Garamond"/>
                 <w:b/>
-                <w:sz w:val="24"/>
-                <w:szCs w:val="24"/>
-              </w:rPr>
-            </w:pPr>
-            <w:r>
-              <w:rPr>
-                <w:rFonts w:ascii="Garamond" w:eastAsia="Garamond" w:hAnsi="Garamond" w:cs="Garamond"/>
-                <w:b/>
-                <w:sz w:val="24"/>
-                <w:szCs w:val="24"/>
-              </w:rPr>
-              <w:t xml:space="preserve">Council Member| IIMK  </w:t>
+                <w:sz w:val="20"/>
+                <w:szCs w:val="20"/>
+              </w:rPr>
+            </w:pPr>
+            <w:r>
+              <w:rPr>
+                <w:rFonts w:ascii="Garamond" w:eastAsia="Garamond" w:hAnsi="Garamond" w:cs="Garamond"/>
+                <w:b/>
+                <w:bCs/>
+                <w:sz w:val="20"/>
+                <w:szCs w:val="20"/>
+              </w:rPr>
+              <w:t xml:space="preserve">Founder | Blind Bluff</w:t>
             </w:r>
           </w:p>
         </w:tc>
@@ -989,68 +1041,75 @@
           </w:tcPr>
           <w:p>
             <w:pPr>
-              <w:spacing w:line="252" w:lineRule="auto"/>
+              <w:spacing w:line="240" w:lineRule="auto"/>
               <w:ind w:left="176"/>
               <w:rPr>
                 <w:rFonts w:ascii="Garamond" w:eastAsia="Garamond" w:hAnsi="Garamond" w:cs="Garamond"/>
-                <w:sz w:val="24"/>
-                <w:szCs w:val="24"/>
-                <w:lang w:val="en-IN"/>
-              </w:rPr>
-            </w:pPr>
-            <w:r>
-              <w:rPr>
-                <w:rFonts w:ascii="Garamond" w:eastAsia="Garamond" w:hAnsi="Garamond" w:cs="Garamond"/>
-                <w:b/>
-                <w:bCs/>
-                <w:sz w:val="24"/>
-                <w:szCs w:val="24"/>
-              </w:rPr>
-              <w:t xml:space="preserve">Spearhead </w:t>
-            </w:r>
-            <w:r>
-              <w:rPr>
-                <w:rFonts w:ascii="Garamond" w:eastAsia="Garamond" w:hAnsi="Garamond" w:cs="Garamond"/>
-                <w:sz w:val="24"/>
-                <w:szCs w:val="24"/>
-              </w:rPr>
-              <w:t>end-to-end logistics for campus events</w:t>
-            </w:r>
-            <w:r>
-              <w:rPr>
-                <w:rFonts w:ascii="Garamond" w:eastAsia="Garamond" w:hAnsi="Garamond" w:cs="Garamond"/>
-                <w:b/>
-                <w:bCs/>
-                <w:sz w:val="24"/>
-                <w:szCs w:val="24"/>
-              </w:rPr>
-              <w:t xml:space="preserve">, manage committee budgets </w:t>
-            </w:r>
-            <w:r>
-              <w:rPr>
-                <w:rFonts w:ascii="Garamond" w:eastAsia="Garamond" w:hAnsi="Garamond" w:cs="Garamond"/>
-                <w:sz w:val="24"/>
-                <w:szCs w:val="24"/>
-              </w:rPr>
-              <w:t xml:space="preserve">for optimal resource allocation, and drive </w:t>
-            </w:r>
-            <w:r>
-              <w:rPr>
-                <w:rFonts w:ascii="Garamond" w:eastAsia="Garamond" w:hAnsi="Garamond" w:cs="Garamond"/>
-                <w:b/>
-                <w:bCs/>
-                <w:sz w:val="24"/>
-                <w:szCs w:val="24"/>
-              </w:rPr>
-              <w:t xml:space="preserve">strategic communications </w:t>
-            </w:r>
-            <w:r>
-              <w:rPr>
-                <w:rFonts w:ascii="Garamond" w:eastAsia="Garamond" w:hAnsi="Garamond" w:cs="Garamond"/>
-                <w:sz w:val="24"/>
-                <w:szCs w:val="24"/>
-              </w:rPr>
-              <w:t>to maximize student engagement.</w:t>
+                <w:sz w:val="20"/>
+                <w:szCs w:val="20"/>
+              </w:rPr>
+            </w:pPr>
+            <w:r>
+              <w:rPr>
+                <w:rFonts w:ascii="Garamond" w:eastAsia="Garamond" w:hAnsi="Garamond" w:cs="Garamond"/>
+                <w:sz w:val="20"/>
+                <w:szCs w:val="20"/>
+              </w:rPr>
+              <w:t xml:space="preserve">Building </w:t>
+            </w:r>
+            <w:r>
+              <w:rPr>
+                <w:rFonts w:ascii="Garamond" w:eastAsia="Garamond" w:hAnsi="Garamond" w:cs="Garamond"/>
+                <w:b/>
+                <w:bCs/>
+                <w:sz w:val="20"/>
+                <w:szCs w:val="20"/>
+              </w:rPr>
+              <w:t xml:space="preserve">Blind Bluff (blindbluff.com)</w:t>
+            </w:r>
+            <w:r>
+              <w:rPr>
+                <w:rFonts w:ascii="Garamond" w:eastAsia="Garamond" w:hAnsi="Garamond" w:cs="Garamond"/>
+                <w:sz w:val="20"/>
+                <w:szCs w:val="20"/>
+              </w:rPr>
+              <w:t xml:space="preserve"> — a Kochi-based brand making </w:t>
+            </w:r>
+            <w:r>
+              <w:rPr>
+                <w:rFonts w:ascii="Garamond" w:eastAsia="Garamond" w:hAnsi="Garamond" w:cs="Garamond"/>
+                <w:b/>
+                <w:bCs/>
+                <w:sz w:val="20"/>
+                <w:szCs w:val="20"/>
+              </w:rPr>
+              <w:t xml:space="preserve">murder mystery, card and party games</w:t>
+            </w:r>
+            <w:r>
+              <w:rPr>
+                <w:rFonts w:ascii="Garamond" w:eastAsia="Garamond" w:hAnsi="Garamond" w:cs="Garamond"/>
+                <w:sz w:val="20"/>
+                <w:szCs w:val="20"/>
+              </w:rPr>
+              <w:t xml:space="preserve">, shipped across India. </w:t>
+            </w:r>
+            <w:r>
+              <w:rPr>
+                <w:rFonts w:ascii="Garamond" w:eastAsia="Garamond" w:hAnsi="Garamond" w:cs="Garamond"/>
+                <w:b/>
+                <w:bCs/>
+                <w:sz w:val="20"/>
+                <w:szCs w:val="20"/>
+              </w:rPr>
+              <w:t xml:space="preserve">Live storefront</w:t>
+            </w:r>
+            <w:r>
+              <w:rPr>
+                <w:rFonts w:ascii="Garamond" w:eastAsia="Garamond" w:hAnsi="Garamond" w:cs="Garamond"/>
+                <w:sz w:val="20"/>
+                <w:szCs w:val="20"/>
+              </w:rPr>
+              <w:t xml:space="preserve"> with 3 card games selling and 6 titles (incl. 3 murder mysteries) in production; custom mystery nights for private and corporate events.</w:t>
             </w:r>
           </w:p>
         </w:tc>
@@ -1066,29 +1125,26 @@
           </w:tcPr>
           <w:p>
             <w:pPr>
-              <w:spacing w:line="252" w:lineRule="auto"/>
+              <w:spacing w:line="240" w:lineRule="auto"/>
               <w:jc w:val="center"/>
               <w:rPr>
                 <w:rFonts w:ascii="Garamond" w:eastAsia="Garamond" w:hAnsi="Garamond" w:cs="Garamond"/>
-                <w:sz w:val="24"/>
-                <w:szCs w:val="24"/>
-              </w:rPr>
-            </w:pPr>
-            <w:r>
-              <w:rPr>
-                <w:rFonts w:ascii="Garamond" w:eastAsia="Garamond" w:hAnsi="Garamond" w:cs="Garamond"/>
-                <w:sz w:val="24"/>
-                <w:szCs w:val="24"/>
-              </w:rPr>
-              <w:t>2026</w:t>
+                <w:sz w:val="20"/>
+                <w:szCs w:val="20"/>
+              </w:rPr>
+            </w:pPr>
+            <w:r>
+              <w:rPr>
+                <w:rFonts w:ascii="Garamond" w:eastAsia="Garamond" w:hAnsi="Garamond" w:cs="Garamond"/>
+                <w:sz w:val="20"/>
+                <w:szCs w:val="20"/>
+              </w:rPr>
+              <w:t xml:space="preserve">2026 – Present</w:t>
             </w:r>
           </w:p>
         </w:tc>
       </w:tr>
       <w:tr>
-        <w:trPr>
-          <w:trHeight w:val="67"/>
-        </w:trPr>
         <w:tc>
           <w:tcPr>
             <w:tcW w:w="2078" w:type="dxa"/>
@@ -1098,25 +1154,24 @@
           </w:tcPr>
           <w:p>
             <w:pPr>
-              <w:spacing w:line="252" w:lineRule="auto"/>
+              <w:spacing w:line="240" w:lineRule="auto"/>
               <w:ind w:left="360"/>
               <w:rPr>
                 <w:rFonts w:ascii="Garamond" w:eastAsia="Garamond" w:hAnsi="Garamond" w:cs="Garamond"/>
                 <w:b/>
-                <w:sz w:val="24"/>
-                <w:szCs w:val="24"/>
-              </w:rPr>
-            </w:pPr>
-            <w:r>
-              <w:rPr>
-                <w:rFonts w:ascii="Garamond" w:eastAsia="Garamond" w:hAnsi="Garamond" w:cs="Garamond"/>
-                <w:b/>
-                <w:sz w:val="24"/>
-                <w:szCs w:val="24"/>
-              </w:rPr>
-              <w:t xml:space="preserve">Head Boy, </w:t>
-              <w:br/>
-              <w:t>St. Arnold’s School</w:t>
+                <w:sz w:val="20"/>
+                <w:szCs w:val="20"/>
+              </w:rPr>
+            </w:pPr>
+            <w:r>
+              <w:rPr>
+                <w:rFonts w:ascii="Garamond" w:eastAsia="Garamond" w:hAnsi="Garamond" w:cs="Garamond"/>
+                <w:b/>
+                <w:bCs/>
+                <w:sz w:val="20"/>
+                <w:szCs w:val="20"/>
+              </w:rPr>
+              <w:t xml:space="preserve">Senior Marketing Manager | NextGenix</w:t>
             </w:r>
           </w:p>
         </w:tc>
@@ -1130,156 +1185,85 @@
           </w:tcPr>
           <w:p>
             <w:pPr>
-              <w:spacing w:line="252" w:lineRule="auto"/>
+              <w:spacing w:line="240" w:lineRule="auto"/>
               <w:ind w:left="176"/>
               <w:rPr>
                 <w:rFonts w:ascii="Garamond" w:eastAsia="Garamond" w:hAnsi="Garamond" w:cs="Garamond"/>
-                <w:b/>
-                <w:bCs/>
-                <w:sz w:val="24"/>
-                <w:szCs w:val="24"/>
-                <w:lang w:val="en-IN"/>
-              </w:rPr>
-            </w:pPr>
-            <w:r>
-              <w:rPr>
-                <w:rFonts w:ascii="Garamond" w:eastAsia="Garamond" w:hAnsi="Garamond" w:cs="Garamond"/>
-                <w:b/>
-                <w:bCs/>
-                <w:sz w:val="24"/>
-                <w:szCs w:val="24"/>
-                <w:lang w:val="en-IN"/>
-              </w:rPr>
-              <w:t>Led</w:t>
-            </w:r>
-            <w:r>
-              <w:rPr>
-                <w:rFonts w:ascii="Garamond" w:eastAsia="Garamond" w:hAnsi="Garamond" w:cs="Garamond"/>
-                <w:sz w:val="24"/>
-                <w:szCs w:val="24"/>
-                <w:lang w:val="en-IN"/>
-              </w:rPr>
-              <w:t xml:space="preserve"> the student council to support school administration in maintaining </w:t>
-            </w:r>
-            <w:r>
-              <w:rPr>
-                <w:rFonts w:ascii="Garamond" w:eastAsia="Garamond" w:hAnsi="Garamond" w:cs="Garamond"/>
-                <w:b/>
-                <w:bCs/>
-                <w:sz w:val="24"/>
-                <w:szCs w:val="24"/>
-                <w:lang w:val="en-IN"/>
-              </w:rPr>
-              <w:t>discipline</w:t>
-            </w:r>
-            <w:r>
-              <w:rPr>
-                <w:rFonts w:ascii="Garamond" w:eastAsia="Garamond" w:hAnsi="Garamond" w:cs="Garamond"/>
-                <w:sz w:val="24"/>
-                <w:szCs w:val="24"/>
-                <w:lang w:val="en-IN"/>
-              </w:rPr>
-              <w:t xml:space="preserve"> and a </w:t>
-            </w:r>
-            <w:r>
-              <w:rPr>
-                <w:rFonts w:ascii="Garamond" w:eastAsia="Garamond" w:hAnsi="Garamond" w:cs="Garamond"/>
-                <w:b/>
-                <w:bCs/>
-                <w:sz w:val="24"/>
-                <w:szCs w:val="24"/>
-                <w:lang w:val="en-IN"/>
-              </w:rPr>
-              <w:t>positive environment</w:t>
-            </w:r>
-            <w:r>
-              <w:rPr>
-                <w:rFonts w:ascii="Garamond" w:eastAsia="Garamond" w:hAnsi="Garamond" w:cs="Garamond"/>
-                <w:sz w:val="24"/>
-                <w:szCs w:val="24"/>
-                <w:lang w:val="en-IN"/>
-              </w:rPr>
-              <w:t xml:space="preserve">, while actively </w:t>
-            </w:r>
-            <w:r>
-              <w:rPr>
-                <w:rFonts w:ascii="Garamond" w:eastAsia="Garamond" w:hAnsi="Garamond" w:cs="Garamond"/>
-                <w:b/>
-                <w:bCs/>
-                <w:sz w:val="24"/>
-                <w:szCs w:val="24"/>
-                <w:lang w:val="en-IN"/>
-              </w:rPr>
-              <w:t>organizing events</w:t>
-            </w:r>
-            <w:r>
-              <w:rPr>
-                <w:rFonts w:ascii="Garamond" w:eastAsia="Garamond" w:hAnsi="Garamond" w:cs="Garamond"/>
-                <w:sz w:val="24"/>
-                <w:szCs w:val="24"/>
-                <w:lang w:val="en-IN"/>
-              </w:rPr>
-              <w:t xml:space="preserve">, managing </w:t>
-            </w:r>
-            <w:r>
-              <w:rPr>
-                <w:rFonts w:ascii="Garamond" w:eastAsia="Garamond" w:hAnsi="Garamond" w:cs="Garamond"/>
-                <w:b/>
-                <w:bCs/>
-                <w:sz w:val="24"/>
-                <w:szCs w:val="24"/>
-                <w:lang w:val="en-IN"/>
-              </w:rPr>
-              <w:t>logistics</w:t>
-            </w:r>
-            <w:r>
-              <w:rPr>
-                <w:rFonts w:ascii="Garamond" w:eastAsia="Garamond" w:hAnsi="Garamond" w:cs="Garamond"/>
-                <w:sz w:val="24"/>
-                <w:szCs w:val="24"/>
-                <w:lang w:val="en-IN"/>
-              </w:rPr>
-              <w:t xml:space="preserve">, and promoting </w:t>
-            </w:r>
-            <w:r>
-              <w:rPr>
-                <w:rFonts w:ascii="Garamond" w:eastAsia="Garamond" w:hAnsi="Garamond" w:cs="Garamond"/>
-                <w:b/>
-                <w:bCs/>
-                <w:sz w:val="24"/>
-                <w:szCs w:val="24"/>
-                <w:lang w:val="en-IN"/>
-              </w:rPr>
-              <w:t>student engagement</w:t>
-            </w:r>
-            <w:r>
-              <w:rPr>
-                <w:rFonts w:ascii="Garamond" w:eastAsia="Garamond" w:hAnsi="Garamond" w:cs="Garamond"/>
-                <w:sz w:val="24"/>
-                <w:szCs w:val="24"/>
-                <w:lang w:val="en-IN"/>
-              </w:rPr>
-              <w:t xml:space="preserve"> through inclusive participation and a </w:t>
-            </w:r>
-            <w:r>
-              <w:rPr>
-                <w:rFonts w:ascii="Garamond" w:eastAsia="Garamond" w:hAnsi="Garamond" w:cs="Garamond"/>
-                <w:b/>
-                <w:bCs/>
-                <w:sz w:val="24"/>
-                <w:szCs w:val="24"/>
-                <w:lang w:val="en-IN"/>
-              </w:rPr>
-              <w:t>growth-oriented culture</w:t>
-            </w:r>
-            <w:r>
-              <w:rPr>
-                <w:rFonts w:ascii="Garamond" w:eastAsia="Garamond" w:hAnsi="Garamond" w:cs="Garamond"/>
-                <w:sz w:val="24"/>
-                <w:szCs w:val="24"/>
-                <w:lang w:val="en-IN"/>
-              </w:rPr>
-              <w:t>.</w:t>
+                <w:sz w:val="20"/>
+                <w:szCs w:val="20"/>
+              </w:rPr>
+            </w:pPr>
+            <w:r>
+              <w:rPr>
+                <w:rFonts w:ascii="Garamond" w:eastAsia="Garamond" w:hAnsi="Garamond" w:cs="Garamond"/>
+                <w:b/>
+                <w:bCs/>
+                <w:sz w:val="20"/>
+                <w:szCs w:val="20"/>
+              </w:rPr>
+              <w:t xml:space="preserve">Lead a sales team</w:t>
+            </w:r>
+            <w:r>
+              <w:rPr>
+                <w:rFonts w:ascii="Garamond" w:eastAsia="Garamond" w:hAnsi="Garamond" w:cs="Garamond"/>
+                <w:sz w:val="20"/>
+                <w:szCs w:val="20"/>
+              </w:rPr>
+              <w:t xml:space="preserve"> and coordinate with the CEO and marketing function — managing </w:t>
+            </w:r>
+            <w:r>
+              <w:rPr>
+                <w:rFonts w:ascii="Garamond" w:eastAsia="Garamond" w:hAnsi="Garamond" w:cs="Garamond"/>
+                <w:b/>
+                <w:bCs/>
+                <w:sz w:val="20"/>
+                <w:szCs w:val="20"/>
+              </w:rPr>
+              <w:t xml:space="preserve">client relationships</w:t>
+            </w:r>
+            <w:r>
+              <w:rPr>
+                <w:rFonts w:ascii="Garamond" w:eastAsia="Garamond" w:hAnsi="Garamond" w:cs="Garamond"/>
+                <w:sz w:val="20"/>
+                <w:szCs w:val="20"/>
+              </w:rPr>
+              <w:t xml:space="preserve">, social media, and </w:t>
+            </w:r>
+            <w:r>
+              <w:rPr>
+                <w:rFonts w:ascii="Garamond" w:eastAsia="Garamond" w:hAnsi="Garamond" w:cs="Garamond"/>
+                <w:b/>
+                <w:bCs/>
+                <w:sz w:val="20"/>
+                <w:szCs w:val="20"/>
+              </w:rPr>
+              <w:t xml:space="preserve">campaign execution</w:t>
+            </w:r>
+            <w:r>
+              <w:rPr>
+                <w:rFonts w:ascii="Garamond" w:eastAsia="Garamond" w:hAnsi="Garamond" w:cs="Garamond"/>
+                <w:sz w:val="20"/>
+                <w:szCs w:val="20"/>
+              </w:rPr>
+              <w:t xml:space="preserve"> for a website &amp; app development firm, extending beyond marketing into </w:t>
+            </w:r>
+            <w:r>
+              <w:rPr>
+                <w:rFonts w:ascii="Garamond" w:eastAsia="Garamond" w:hAnsi="Garamond" w:cs="Garamond"/>
+                <w:b/>
+                <w:bCs/>
+                <w:sz w:val="20"/>
+                <w:szCs w:val="20"/>
+              </w:rPr>
+              <w:t xml:space="preserve">sales strategy and client servicing</w:t>
+            </w:r>
+            <w:r>
+              <w:rPr>
+                <w:rFonts w:ascii="Garamond" w:eastAsia="Garamond" w:hAnsi="Garamond" w:cs="Garamond"/>
+                <w:sz w:val="20"/>
+                <w:szCs w:val="20"/>
+              </w:rPr>
+              <w:t xml:space="preserve">.</w:t>
             </w:r>
           </w:p>
         </w:tc>
@@ -1295,21 +1279,139 @@
           </w:tcPr>
           <w:p>
             <w:pPr>
-              <w:spacing w:line="252" w:lineRule="auto"/>
+              <w:spacing w:line="240" w:lineRule="auto"/>
               <w:jc w:val="center"/>
               <w:rPr>
                 <w:rFonts w:ascii="Garamond" w:eastAsia="Garamond" w:hAnsi="Garamond" w:cs="Garamond"/>
-                <w:sz w:val="24"/>
-                <w:szCs w:val="24"/>
-              </w:rPr>
-            </w:pPr>
-            <w:r>
-              <w:rPr>
-                <w:rFonts w:ascii="Garamond" w:eastAsia="Garamond" w:hAnsi="Garamond" w:cs="Garamond"/>
-                <w:sz w:val="24"/>
-                <w:szCs w:val="24"/>
-              </w:rPr>
-              <w:t>2024-25</w:t>
+                <w:sz w:val="20"/>
+                <w:szCs w:val="20"/>
+              </w:rPr>
+            </w:pPr>
+            <w:r>
+              <w:rPr>
+                <w:rFonts w:ascii="Garamond" w:eastAsia="Garamond" w:hAnsi="Garamond" w:cs="Garamond"/>
+                <w:sz w:val="20"/>
+                <w:szCs w:val="20"/>
+              </w:rPr>
+              <w:t xml:space="preserve">Jul 2026 – Present</w:t>
+            </w:r>
+          </w:p>
+        </w:tc>
+      </w:tr>
+      <w:tr>
+        <w:tc>
+          <w:tcPr>
+            <w:tcW w:w="2078" w:type="dxa"/>
+            <w:gridSpan w:val="2"/>
+            <w:shd w:val="clear" w:color="auto" w:fill="D9D9D9"/>
+            <w:vAlign w:val="center"/>
+          </w:tcPr>
+          <w:p>
+            <w:pPr>
+              <w:spacing w:line="240" w:lineRule="auto"/>
+              <w:ind w:left="360"/>
+              <w:rPr>
+                <w:rFonts w:ascii="Garamond" w:eastAsia="Garamond" w:hAnsi="Garamond" w:cs="Garamond"/>
+                <w:b/>
+                <w:sz w:val="20"/>
+                <w:szCs w:val="20"/>
+              </w:rPr>
+            </w:pPr>
+            <w:r>
+              <w:rPr>
+                <w:rFonts w:ascii="Garamond" w:eastAsia="Garamond" w:hAnsi="Garamond" w:cs="Garamond"/>
+                <w:b/>
+                <w:bCs/>
+                <w:sz w:val="20"/>
+                <w:szCs w:val="20"/>
+              </w:rPr>
+              <w:t xml:space="preserve">HR Intern | Jarurat Care Foundation</w:t>
+            </w:r>
+          </w:p>
+        </w:tc>
+        <w:tc>
+          <w:tcPr>
+            <w:tcW w:w="8232" w:type="dxa"/>
+            <w:gridSpan w:val="2"/>
+            <w:tcBorders>
+              <w:right w:val="nil"/>
+            </w:tcBorders>
+          </w:tcPr>
+          <w:p>
+            <w:pPr>
+              <w:spacing w:line="240" w:lineRule="auto"/>
+              <w:ind w:left="176"/>
+              <w:rPr>
+                <w:rFonts w:ascii="Garamond" w:eastAsia="Garamond" w:hAnsi="Garamond" w:cs="Garamond"/>
+                <w:sz w:val="20"/>
+                <w:szCs w:val="20"/>
+              </w:rPr>
+            </w:pPr>
+            <w:r>
+              <w:rPr>
+                <w:rFonts w:ascii="Garamond" w:eastAsia="Garamond" w:hAnsi="Garamond" w:cs="Garamond"/>
+                <w:b/>
+                <w:bCs/>
+                <w:sz w:val="20"/>
+                <w:szCs w:val="20"/>
+              </w:rPr>
+              <w:t xml:space="preserve">Support HR operations</w:t>
+            </w:r>
+            <w:r>
+              <w:rPr>
+                <w:rFonts w:ascii="Garamond" w:eastAsia="Garamond" w:hAnsi="Garamond" w:cs="Garamond"/>
+                <w:sz w:val="20"/>
+                <w:szCs w:val="20"/>
+              </w:rPr>
+              <w:t xml:space="preserve"> — candidate coordination, interview scheduling and confirmations — at a healthcare NGO supporting </w:t>
+            </w:r>
+            <w:r>
+              <w:rPr>
+                <w:rFonts w:ascii="Garamond" w:eastAsia="Garamond" w:hAnsi="Garamond" w:cs="Garamond"/>
+                <w:b/>
+                <w:bCs/>
+                <w:sz w:val="20"/>
+                <w:szCs w:val="20"/>
+              </w:rPr>
+              <w:t xml:space="preserve">cancer patients and caregivers</w:t>
+            </w:r>
+            <w:r>
+              <w:rPr>
+                <w:rFonts w:ascii="Garamond" w:eastAsia="Garamond" w:hAnsi="Garamond" w:cs="Garamond"/>
+                <w:sz w:val="20"/>
+                <w:szCs w:val="20"/>
+              </w:rPr>
+              <w:t xml:space="preserve"> across India.</w:t>
+            </w:r>
+          </w:p>
+        </w:tc>
+        <w:tc>
+          <w:tcPr>
+            <w:tcW w:w="1015" w:type="dxa"/>
+            <w:gridSpan w:val="2"/>
+            <w:tcBorders>
+              <w:left w:val="nil"/>
+              <w:bottom w:val="single" w:sz="4" w:space="0" w:color="000000"/>
+            </w:tcBorders>
+            <w:vAlign w:val="center"/>
+          </w:tcPr>
+          <w:p>
+            <w:pPr>
+              <w:spacing w:line="240" w:lineRule="auto"/>
+              <w:jc w:val="center"/>
+              <w:rPr>
+                <w:rFonts w:ascii="Garamond" w:eastAsia="Garamond" w:hAnsi="Garamond" w:cs="Garamond"/>
+                <w:sz w:val="20"/>
+                <w:szCs w:val="20"/>
+              </w:rPr>
+            </w:pPr>
+            <w:r>
+              <w:rPr>
+                <w:rFonts w:ascii="Garamond" w:eastAsia="Garamond" w:hAnsi="Garamond" w:cs="Garamond"/>
+                <w:sz w:val="20"/>
+                <w:szCs w:val="20"/>
+              </w:rPr>
+              <w:t xml:space="preserve">Jul – Oct 2026</w:t>
             </w:r>
           </w:p>
         </w:tc>
@@ -1327,7 +1429,7 @@
           </w:tcPr>
           <w:p>
             <w:pPr>
-              <w:spacing w:line="252" w:lineRule="auto"/>
+              <w:spacing w:line="240" w:lineRule="auto"/>
               <w:jc w:val="center"/>
               <w:rPr>
                 <w:rFonts w:ascii="Garamond" w:eastAsia="Garamond" w:hAnsi="Garamond" w:cs="Garamond"/>
@@ -1343,7 +1445,7 @@
                 <w:sz w:val="26"/>
                 <w:szCs w:val="26"/>
               </w:rPr>
-              <w:t>ACHIEVEMENTS &amp; EXTRA-CURRICULARS</w:t>
+              <w:t>POSITIONS OF RESPONSIBILITY</w:t>
             </w:r>
           </w:p>
         </w:tc>
@@ -1361,23 +1463,23 @@
           </w:tcPr>
           <w:p>
             <w:pPr>
-              <w:spacing w:line="252" w:lineRule="auto"/>
-              <w:jc w:val="center"/>
-              <w:rPr>
-                <w:rFonts w:ascii="Garamond" w:eastAsia="Garamond" w:hAnsi="Garamond" w:cs="Garamond"/>
-                <w:b/>
-                <w:sz w:val="24"/>
-                <w:szCs w:val="24"/>
-              </w:rPr>
-            </w:pPr>
-            <w:r>
-              <w:rPr>
-                <w:rFonts w:ascii="Garamond" w:eastAsia="Garamond" w:hAnsi="Garamond" w:cs="Garamond"/>
-                <w:b/>
-                <w:sz w:val="24"/>
-                <w:szCs w:val="24"/>
-              </w:rPr>
-              <w:t>Competitions</w:t>
+              <w:spacing w:line="240" w:lineRule="auto"/>
+              <w:ind w:left="360"/>
+              <w:rPr>
+                <w:rFonts w:ascii="Garamond" w:eastAsia="Garamond" w:hAnsi="Garamond" w:cs="Garamond"/>
+                <w:b/>
+                <w:sz w:val="20"/>
+                <w:szCs w:val="20"/>
+              </w:rPr>
+            </w:pPr>
+            <w:r>
+              <w:rPr>
+                <w:rFonts w:ascii="Garamond" w:eastAsia="Garamond" w:hAnsi="Garamond" w:cs="Garamond"/>
+                <w:b/>
+                <w:sz w:val="20"/>
+                <w:szCs w:val="20"/>
+              </w:rPr>
+              <w:t xml:space="preserve">Council Member| IIMK  </w:t>
             </w:r>
           </w:p>
         </w:tc>
@@ -1391,36 +1493,402 @@
           </w:tcPr>
           <w:p>
             <w:pPr>
+              <w:spacing w:line="240" w:lineRule="auto"/>
+              <w:ind w:left="176"/>
+              <w:rPr>
+                <w:rFonts w:ascii="Garamond" w:eastAsia="Garamond" w:hAnsi="Garamond" w:cs="Garamond"/>
+                <w:sz w:val="20"/>
+                <w:szCs w:val="20"/>
+              </w:rPr>
+            </w:pPr>
+            <w:r>
+              <w:rPr>
+                <w:rFonts w:ascii="Garamond" w:eastAsia="Garamond" w:hAnsi="Garamond" w:cs="Garamond"/>
+                <w:b/>
+                <w:bCs/>
+                <w:sz w:val="20"/>
+                <w:szCs w:val="20"/>
+              </w:rPr>
+              <w:t xml:space="preserve">Spearhead end-to-end logistics</w:t>
+            </w:r>
+            <w:r>
+              <w:rPr>
+                <w:rFonts w:ascii="Garamond" w:eastAsia="Garamond" w:hAnsi="Garamond" w:cs="Garamond"/>
+                <w:sz w:val="20"/>
+                <w:szCs w:val="20"/>
+              </w:rPr>
+              <w:t xml:space="preserve"> for campus events and </w:t>
+            </w:r>
+            <w:r>
+              <w:rPr>
+                <w:rFonts w:ascii="Garamond" w:eastAsia="Garamond" w:hAnsi="Garamond" w:cs="Garamond"/>
+                <w:b/>
+                <w:bCs/>
+                <w:sz w:val="20"/>
+                <w:szCs w:val="20"/>
+              </w:rPr>
+              <w:t xml:space="preserve">manage committee budgets</w:t>
+            </w:r>
+            <w:r>
+              <w:rPr>
+                <w:rFonts w:ascii="Garamond" w:eastAsia="Garamond" w:hAnsi="Garamond" w:cs="Garamond"/>
+                <w:sz w:val="20"/>
+                <w:szCs w:val="20"/>
+              </w:rPr>
+              <w:t xml:space="preserve"> — maintain a </w:t>
+            </w:r>
+            <w:r>
+              <w:rPr>
+                <w:rFonts w:ascii="Garamond" w:eastAsia="Garamond" w:hAnsi="Garamond" w:cs="Garamond"/>
+                <w:b/>
+                <w:bCs/>
+                <w:sz w:val="20"/>
+                <w:szCs w:val="20"/>
+              </w:rPr>
+              <w:t xml:space="preserve">100+ contact B2B sponsor outreach pipeline</w:t>
+            </w:r>
+            <w:r>
+              <w:rPr>
+                <w:rFonts w:ascii="Garamond" w:eastAsia="Garamond" w:hAnsi="Garamond" w:cs="Garamond"/>
+                <w:sz w:val="20"/>
+                <w:szCs w:val="20"/>
+              </w:rPr>
+              <w:t xml:space="preserve">, document event </w:t>
+            </w:r>
+            <w:r>
+              <w:rPr>
+                <w:rFonts w:ascii="Garamond" w:eastAsia="Garamond" w:hAnsi="Garamond" w:cs="Garamond"/>
+                <w:b/>
+                <w:bCs/>
+                <w:sz w:val="20"/>
+                <w:szCs w:val="20"/>
+              </w:rPr>
+              <w:t xml:space="preserve">P&amp;L</w:t>
+            </w:r>
+            <w:r>
+              <w:rPr>
+                <w:rFonts w:ascii="Garamond" w:eastAsia="Garamond" w:hAnsi="Garamond" w:cs="Garamond"/>
+                <w:sz w:val="20"/>
+                <w:szCs w:val="20"/>
+              </w:rPr>
+              <w:t xml:space="preserve"> (budget vs actual, turnout) for council leadership, and drive </w:t>
+            </w:r>
+            <w:r>
+              <w:rPr>
+                <w:rFonts w:ascii="Garamond" w:eastAsia="Garamond" w:hAnsi="Garamond" w:cs="Garamond"/>
+                <w:b/>
+                <w:bCs/>
+                <w:sz w:val="20"/>
+                <w:szCs w:val="20"/>
+              </w:rPr>
+              <w:t xml:space="preserve">strategic communications</w:t>
+            </w:r>
+            <w:r>
+              <w:rPr>
+                <w:rFonts w:ascii="Garamond" w:eastAsia="Garamond" w:hAnsi="Garamond" w:cs="Garamond"/>
+                <w:sz w:val="20"/>
+                <w:szCs w:val="20"/>
+              </w:rPr>
+              <w:t xml:space="preserve"> to maximize student engagement.</w:t>
+            </w:r>
+          </w:p>
+        </w:tc>
+        <w:tc>
+          <w:tcPr>
+            <w:tcW w:w="1015" w:type="dxa"/>
+            <w:gridSpan w:val="2"/>
+            <w:tcBorders>
+              <w:left w:val="nil"/>
+              <w:bottom w:val="single" w:sz="4" w:space="0" w:color="000000"/>
+            </w:tcBorders>
+            <w:vAlign w:val="center"/>
+          </w:tcPr>
+          <w:p>
+            <w:pPr>
+              <w:spacing w:line="240" w:lineRule="auto"/>
+              <w:jc w:val="center"/>
+              <w:rPr>
+                <w:rFonts w:ascii="Garamond" w:eastAsia="Garamond" w:hAnsi="Garamond" w:cs="Garamond"/>
+                <w:sz w:val="20"/>
+                <w:szCs w:val="20"/>
+              </w:rPr>
+            </w:pPr>
+            <w:r>
+              <w:rPr>
+                <w:rFonts w:ascii="Garamond" w:eastAsia="Garamond" w:hAnsi="Garamond" w:cs="Garamond"/>
+                <w:sz w:val="20"/>
+                <w:szCs w:val="20"/>
+              </w:rPr>
+              <w:t xml:space="preserve">2026</w:t>
+            </w:r>
+          </w:p>
+        </w:tc>
+      </w:tr>
+      <w:tr>
+        <w:trPr>
+          <w:trHeight w:val="67"/>
+        </w:trPr>
+        <w:tc>
+          <w:tcPr>
+            <w:tcW w:w="2078" w:type="dxa"/>
+            <w:gridSpan w:val="2"/>
+            <w:shd w:val="clear" w:color="auto" w:fill="D9D9D9"/>
+            <w:vAlign w:val="center"/>
+          </w:tcPr>
+          <w:p>
+            <w:pPr>
+              <w:spacing w:line="240" w:lineRule="auto"/>
+              <w:ind w:left="360"/>
+              <w:rPr>
+                <w:rFonts w:ascii="Garamond" w:eastAsia="Garamond" w:hAnsi="Garamond" w:cs="Garamond"/>
+                <w:b/>
+                <w:sz w:val="20"/>
+                <w:szCs w:val="20"/>
+              </w:rPr>
+            </w:pPr>
+            <w:r>
+              <w:rPr>
+                <w:rFonts w:ascii="Garamond" w:eastAsia="Garamond" w:hAnsi="Garamond" w:cs="Garamond"/>
+                <w:b/>
+                <w:sz w:val="20"/>
+                <w:szCs w:val="20"/>
+              </w:rPr>
+              <w:t xml:space="preserve">Head Boy, </w:t>
+              <w:br/>
+              <w:t>St. Arnold’s School</w:t>
+            </w:r>
+          </w:p>
+        </w:tc>
+        <w:tc>
+          <w:tcPr>
+            <w:tcW w:w="8232" w:type="dxa"/>
+            <w:gridSpan w:val="2"/>
+            <w:tcBorders>
+              <w:right w:val="nil"/>
+            </w:tcBorders>
+          </w:tcPr>
+          <w:p>
+            <w:pPr>
+              <w:spacing w:line="240" w:lineRule="auto"/>
+              <w:ind w:left="176"/>
+              <w:rPr>
+                <w:rFonts w:ascii="Garamond" w:eastAsia="Garamond" w:hAnsi="Garamond" w:cs="Garamond"/>
+                <w:sz w:val="20"/>
+                <w:szCs w:val="20"/>
+              </w:rPr>
+            </w:pPr>
+            <w:r>
+              <w:rPr>
+                <w:rFonts w:ascii="Garamond" w:eastAsia="Garamond" w:hAnsi="Garamond" w:cs="Garamond"/>
+                <w:b/>
+                <w:bCs/>
+                <w:sz w:val="20"/>
+                <w:szCs w:val="20"/>
+              </w:rPr>
+              <w:t xml:space="preserve">Led the student council</w:t>
+            </w:r>
+            <w:r>
+              <w:rPr>
+                <w:rFonts w:ascii="Garamond" w:eastAsia="Garamond" w:hAnsi="Garamond" w:cs="Garamond"/>
+                <w:sz w:val="20"/>
+                <w:szCs w:val="20"/>
+              </w:rPr>
+              <w:t xml:space="preserve"> of 1,000+ students — event budgets, task delegation and stakeholder communication across faculty and administration; </w:t>
+            </w:r>
+            <w:r>
+              <w:rPr>
+                <w:rFonts w:ascii="Garamond" w:eastAsia="Garamond" w:hAnsi="Garamond" w:cs="Garamond"/>
+                <w:b/>
+                <w:bCs/>
+                <w:sz w:val="20"/>
+                <w:szCs w:val="20"/>
+              </w:rPr>
+              <w:t xml:space="preserve">shortlisted 20 MUN delegates</w:t>
+            </w:r>
+            <w:r>
+              <w:rPr>
+                <w:rFonts w:ascii="Garamond" w:eastAsia="Garamond" w:hAnsi="Garamond" w:cs="Garamond"/>
+                <w:sz w:val="20"/>
+                <w:szCs w:val="20"/>
+              </w:rPr>
+              <w:t xml:space="preserve"> from 100+ applicants via rubric-based evaluation, promoting </w:t>
+            </w:r>
+            <w:r>
+              <w:rPr>
+                <w:rFonts w:ascii="Garamond" w:eastAsia="Garamond" w:hAnsi="Garamond" w:cs="Garamond"/>
+                <w:b/>
+                <w:bCs/>
+                <w:sz w:val="20"/>
+                <w:szCs w:val="20"/>
+              </w:rPr>
+              <w:t xml:space="preserve">discipline</w:t>
+            </w:r>
+            <w:r>
+              <w:rPr>
+                <w:rFonts w:ascii="Garamond" w:eastAsia="Garamond" w:hAnsi="Garamond" w:cs="Garamond"/>
+                <w:sz w:val="20"/>
+                <w:szCs w:val="20"/>
+              </w:rPr>
+              <w:t xml:space="preserve"> and a </w:t>
+            </w:r>
+            <w:r>
+              <w:rPr>
+                <w:rFonts w:ascii="Garamond" w:eastAsia="Garamond" w:hAnsi="Garamond" w:cs="Garamond"/>
+                <w:b/>
+                <w:bCs/>
+                <w:sz w:val="20"/>
+                <w:szCs w:val="20"/>
+              </w:rPr>
+              <w:t xml:space="preserve">growth-oriented culture</w:t>
+            </w:r>
+            <w:r>
+              <w:rPr>
+                <w:rFonts w:ascii="Garamond" w:eastAsia="Garamond" w:hAnsi="Garamond" w:cs="Garamond"/>
+                <w:sz w:val="20"/>
+                <w:szCs w:val="20"/>
+              </w:rPr>
+              <w:t xml:space="preserve">.</w:t>
+            </w:r>
+          </w:p>
+        </w:tc>
+        <w:tc>
+          <w:tcPr>
+            <w:tcW w:w="1015" w:type="dxa"/>
+            <w:gridSpan w:val="2"/>
+            <w:tcBorders>
+              <w:left w:val="nil"/>
+              <w:bottom w:val="single" w:sz="4" w:space="0" w:color="000000"/>
+            </w:tcBorders>
+            <w:vAlign w:val="center"/>
+          </w:tcPr>
+          <w:p>
+            <w:pPr>
+              <w:spacing w:line="240" w:lineRule="auto"/>
+              <w:jc w:val="center"/>
+              <w:rPr>
+                <w:rFonts w:ascii="Garamond" w:eastAsia="Garamond" w:hAnsi="Garamond" w:cs="Garamond"/>
+                <w:sz w:val="20"/>
+                <w:szCs w:val="20"/>
+              </w:rPr>
+            </w:pPr>
+            <w:r>
+              <w:rPr>
+                <w:rFonts w:ascii="Garamond" w:eastAsia="Garamond" w:hAnsi="Garamond" w:cs="Garamond"/>
+                <w:sz w:val="20"/>
+                <w:szCs w:val="20"/>
+              </w:rPr>
+              <w:t xml:space="preserve">2024-25</w:t>
+            </w:r>
+          </w:p>
+        </w:tc>
+      </w:tr>
+      <w:tr>
+        <w:trPr>
+          <w:trHeight w:val="67"/>
+        </w:trPr>
+        <w:tc>
+          <w:tcPr>
+            <w:tcW w:w="11325" w:type="dxa"/>
+            <w:gridSpan w:val="6"/>
+            <w:shd w:val="clear" w:color="auto" w:fill="BFBFBF"/>
+            <w:vAlign w:val="center"/>
+          </w:tcPr>
+          <w:p>
+            <w:pPr>
+              <w:spacing w:line="240" w:lineRule="auto"/>
+              <w:jc w:val="center"/>
+              <w:rPr>
+                <w:rFonts w:ascii="Garamond" w:eastAsia="Garamond" w:hAnsi="Garamond" w:cs="Garamond"/>
+                <w:b/>
+                <w:sz w:val="26"/>
+                <w:szCs w:val="26"/>
+              </w:rPr>
+            </w:pPr>
+            <w:r>
+              <w:rPr>
+                <w:rFonts w:ascii="Garamond" w:eastAsia="Garamond" w:hAnsi="Garamond" w:cs="Garamond"/>
+                <w:b/>
+                <w:sz w:val="26"/>
+                <w:szCs w:val="26"/>
+              </w:rPr>
+              <w:t>ACHIEVEMENTS &amp; EXTRA-CURRICULARS</w:t>
+            </w:r>
+          </w:p>
+        </w:tc>
+      </w:tr>
+      <w:tr>
+        <w:trPr>
+          <w:trHeight w:val="67"/>
+        </w:trPr>
+        <w:tc>
+          <w:tcPr>
+            <w:tcW w:w="2078" w:type="dxa"/>
+            <w:gridSpan w:val="2"/>
+            <w:shd w:val="clear" w:color="auto" w:fill="D9D9D9"/>
+            <w:vAlign w:val="center"/>
+          </w:tcPr>
+          <w:p>
+            <w:pPr>
+              <w:spacing w:line="240" w:lineRule="auto"/>
+              <w:jc w:val="center"/>
+              <w:rPr>
+                <w:rFonts w:ascii="Garamond" w:eastAsia="Garamond" w:hAnsi="Garamond" w:cs="Garamond"/>
+                <w:b/>
+                <w:sz w:val="20"/>
+                <w:szCs w:val="20"/>
+              </w:rPr>
+            </w:pPr>
+            <w:r>
+              <w:rPr>
+                <w:rFonts w:ascii="Garamond" w:eastAsia="Garamond" w:hAnsi="Garamond" w:cs="Garamond"/>
+                <w:b/>
+                <w:sz w:val="20"/>
+                <w:szCs w:val="20"/>
+              </w:rPr>
+              <w:t>Competitions</w:t>
+            </w:r>
+          </w:p>
+        </w:tc>
+        <w:tc>
+          <w:tcPr>
+            <w:tcW w:w="8232" w:type="dxa"/>
+            <w:gridSpan w:val="2"/>
+            <w:tcBorders>
+              <w:right w:val="nil"/>
+            </w:tcBorders>
+          </w:tcPr>
+          <w:p>
+            <w:pPr>
               <w:numPr>
                 <w:ilvl w:val="0"/>
                 <w:numId w:val="3"/>
               </w:numPr>
-              <w:spacing w:line="252" w:lineRule="auto"/>
+              <w:spacing w:line="240" w:lineRule="auto"/>
               <w:ind w:left="176"/>
               <w:rPr>
                 <w:rFonts w:ascii="Garamond" w:eastAsia="Garamond" w:hAnsi="Garamond" w:cs="Garamond"/>
                 <w:bCs/>
-                <w:sz w:val="24"/>
-                <w:szCs w:val="24"/>
-              </w:rPr>
-            </w:pPr>
-            <w:r>
-              <w:rPr>
-                <w:rFonts w:ascii="Garamond" w:eastAsia="Garamond" w:hAnsi="Garamond" w:cs="Garamond"/>
-                <w:b/>
-                <w:sz w:val="24"/>
-                <w:szCs w:val="24"/>
-              </w:rPr>
-              <w:t xml:space="preserve">Ranked in Rapid Chess Tournaments: </w:t>
-            </w:r>
-            <w:r>
-              <w:rPr>
-                <w:rFonts w:ascii="Garamond" w:eastAsia="Garamond" w:hAnsi="Garamond" w:cs="Garamond"/>
-                <w:bCs/>
-                <w:sz w:val="24"/>
-                <w:szCs w:val="24"/>
-              </w:rPr>
-              <w:t>2nd at U-19 State Level (2025) and 10th at U-18 UICC Trophy (2024).</w:t>
+                <w:sz w:val="20"/>
+                <w:szCs w:val="20"/>
+              </w:rPr>
+            </w:pPr>
+            <w:r>
+              <w:rPr>
+                <w:rFonts w:ascii="Garamond" w:eastAsia="Garamond" w:hAnsi="Garamond" w:cs="Garamond"/>
+                <w:b/>
+                <w:bCs/>
+                <w:sz w:val="20"/>
+                <w:szCs w:val="20"/>
+              </w:rPr>
+              <w:t xml:space="preserve">Rapid Chess:</w:t>
+            </w:r>
+            <w:r>
+              <w:rPr>
+                <w:rFonts w:ascii="Garamond" w:eastAsia="Garamond" w:hAnsi="Garamond" w:cs="Garamond"/>
+                <w:sz w:val="20"/>
+                <w:szCs w:val="20"/>
+              </w:rPr>
+              <w:t xml:space="preserve"> 2nd at U-19 State Level (2025); 10th in Under-18 Boys at UICC Trophy (2024).</w:t>
             </w:r>
           </w:p>
           <w:p>
@@ -1429,56 +1897,32 @@
                 <w:ilvl w:val="0"/>
                 <w:numId w:val="3"/>
               </w:numPr>
-              <w:spacing w:line="252" w:lineRule="auto"/>
+              <w:spacing w:line="240" w:lineRule="auto"/>
               <w:ind w:left="176"/>
               <w:rPr>
                 <w:rFonts w:ascii="Garamond" w:eastAsia="Garamond" w:hAnsi="Garamond" w:cs="Garamond"/>
-                <w:b/>
-                <w:sz w:val="24"/>
-                <w:szCs w:val="24"/>
-              </w:rPr>
-            </w:pPr>
-            <w:r>
-              <w:rPr>
-                <w:rFonts w:ascii="Garamond" w:eastAsia="Garamond" w:hAnsi="Garamond" w:cs="Garamond"/>
-                <w:sz w:val="24"/>
-                <w:szCs w:val="24"/>
-              </w:rPr>
-              <w:t xml:space="preserve">Stood 3</w:t>
-            </w:r>
-            <w:r>
-              <w:rPr>
-                <w:rFonts w:ascii="Garamond" w:eastAsia="Garamond" w:hAnsi="Garamond" w:cs="Garamond"/>
-                <w:sz w:val="24"/>
-                <w:szCs w:val="24"/>
-                <w:vertAlign w:val="superscript"/>
-              </w:rPr>
-              <w:t>rd</w:t>
-            </w:r>
-            <w:r>
-              <w:rPr>
-                <w:rFonts w:ascii="Garamond" w:eastAsia="Garamond" w:hAnsi="Garamond" w:cs="Garamond"/>
-                <w:sz w:val="24"/>
-                <w:szCs w:val="24"/>
-              </w:rPr>
-              <w:t xml:space="preserve"> at ‘</w:t>
-            </w:r>
-            <w:r>
-              <w:rPr>
-                <w:rFonts w:ascii="Garamond" w:eastAsia="Garamond" w:hAnsi="Garamond" w:cs="Garamond"/>
-                <w:b/>
-                <w:sz w:val="24"/>
-                <w:szCs w:val="24"/>
-              </w:rPr>
-              <w:t>MU20 Opportunity summit 2024’</w:t>
-            </w:r>
-            <w:r>
-              <w:rPr>
-                <w:rFonts w:ascii="Garamond" w:eastAsia="Garamond" w:hAnsi="Garamond" w:cs="Garamond"/>
-                <w:sz w:val="24"/>
-                <w:szCs w:val="24"/>
-              </w:rPr>
-              <w:t xml:space="preserve">- AIPPM (International MUN)</w:t>
+                <w:bCs/>
+                <w:sz w:val="20"/>
+                <w:szCs w:val="20"/>
+              </w:rPr>
+            </w:pPr>
+            <w:r>
+              <w:rPr>
+                <w:rFonts w:ascii="Garamond" w:eastAsia="Garamond" w:hAnsi="Garamond" w:cs="Garamond"/>
+                <w:b/>
+                <w:bCs/>
+                <w:sz w:val="20"/>
+                <w:szCs w:val="20"/>
+              </w:rPr>
+              <w:t xml:space="preserve">MUN:</w:t>
+            </w:r>
+            <w:r>
+              <w:rPr>
+                <w:rFonts w:ascii="Garamond" w:eastAsia="Garamond" w:hAnsi="Garamond" w:cs="Garamond"/>
+                <w:sz w:val="20"/>
+                <w:szCs w:val="20"/>
+              </w:rPr>
+              <w:t xml:space="preserve"> Best Delegate at Masters’ Summit MUN (2024 &amp; 2025; ₹15k cash prize); 3rd at ‘MU20 Opportunity Summit 2024’ – AIPPM (International); 2nd at Sahodaya MUN (ECOSOC).</w:t>
             </w:r>
           </w:p>
           <w:p>
@@ -1487,380 +1931,32 @@
                 <w:ilvl w:val="0"/>
                 <w:numId w:val="3"/>
               </w:numPr>
-              <w:spacing w:line="252" w:lineRule="auto"/>
+              <w:spacing w:line="240" w:lineRule="auto"/>
               <w:ind w:left="176"/>
               <w:rPr>
                 <w:rFonts w:ascii="Garamond" w:eastAsia="Garamond" w:hAnsi="Garamond" w:cs="Garamond"/>
-                <w:sz w:val="24"/>
-                <w:szCs w:val="24"/>
-              </w:rPr>
-            </w:pPr>
-            <w:r>
-              <w:rPr>
-                <w:rFonts w:ascii="Garamond" w:eastAsia="Garamond" w:hAnsi="Garamond" w:cs="Garamond"/>
-                <w:sz w:val="24"/>
-                <w:szCs w:val="24"/>
-              </w:rPr>
-              <w:t xml:space="preserve">Received </w:t>
-            </w:r>
-            <w:r>
-              <w:rPr>
-                <w:rFonts w:ascii="Garamond" w:eastAsia="Garamond" w:hAnsi="Garamond" w:cs="Garamond"/>
-                <w:b/>
-                <w:bCs/>
-                <w:sz w:val="24"/>
-                <w:szCs w:val="24"/>
-              </w:rPr>
-              <w:t>Best Research and Project</w:t>
-            </w:r>
-            <w:r>
-              <w:rPr>
-                <w:rFonts w:ascii="Garamond" w:eastAsia="Garamond" w:hAnsi="Garamond" w:cs="Garamond"/>
-                <w:sz w:val="24"/>
-                <w:szCs w:val="24"/>
-              </w:rPr>
-              <w:t xml:space="preserve"> at Balvigyan – Commerce (Inter-School)</w:t>
-            </w:r>
-          </w:p>
-          <w:p>
-            <w:pPr>
-              <w:numPr>
-                <w:ilvl w:val="0"/>
-                <w:numId w:val="3"/>
-              </w:numPr>
-              <w:spacing w:line="252" w:lineRule="auto"/>
-              <w:ind w:left="176"/>
-              <w:rPr>
-                <w:rFonts w:ascii="Garamond" w:eastAsia="Garamond" w:hAnsi="Garamond" w:cs="Garamond"/>
-                <w:bCs/>
-                <w:sz w:val="24"/>
-                <w:szCs w:val="24"/>
-              </w:rPr>
-            </w:pPr>
-            <w:r>
-              <w:rPr>
-                <w:rFonts w:ascii="Garamond" w:eastAsia="Garamond" w:hAnsi="Garamond" w:cs="Garamond"/>
-                <w:bCs/>
-                <w:sz w:val="24"/>
-                <w:szCs w:val="24"/>
-                <w:lang w:val="en-IN"/>
-              </w:rPr>
-              <w:t xml:space="preserve">Ranked </w:t>
-            </w:r>
-            <w:r>
-              <w:rPr>
-                <w:rFonts w:ascii="Garamond" w:eastAsia="Garamond" w:hAnsi="Garamond" w:cs="Garamond"/>
-                <w:b/>
-                <w:bCs/>
-                <w:sz w:val="24"/>
-                <w:szCs w:val="24"/>
-                <w:lang w:val="en-IN"/>
-              </w:rPr>
-              <w:t>10</w:t>
-            </w:r>
-            <w:r>
-              <w:rPr>
-                <w:rFonts w:ascii="Garamond" w:eastAsia="Garamond" w:hAnsi="Garamond" w:cs="Garamond"/>
-                <w:b/>
-                <w:bCs/>
-                <w:sz w:val="24"/>
-                <w:szCs w:val="24"/>
-                <w:vertAlign w:val="superscript"/>
-                <w:lang w:val="en-IN"/>
-              </w:rPr>
-              <w:t>th</w:t>
-            </w:r>
-            <w:r>
-              <w:rPr>
-                <w:rFonts w:ascii="Garamond" w:eastAsia="Garamond" w:hAnsi="Garamond" w:cs="Garamond"/>
-                <w:b/>
-                <w:bCs/>
-                <w:sz w:val="24"/>
-                <w:szCs w:val="24"/>
-                <w:lang w:val="en-IN"/>
-              </w:rPr>
-              <w:t xml:space="preserve"> in Under-18 Boys</w:t>
-            </w:r>
-            <w:r>
-              <w:rPr>
-                <w:rFonts w:ascii="Garamond" w:eastAsia="Garamond" w:hAnsi="Garamond" w:cs="Garamond"/>
-                <w:bCs/>
-                <w:sz w:val="24"/>
-                <w:szCs w:val="24"/>
-                <w:lang w:val="en-IN"/>
-              </w:rPr>
-              <w:t xml:space="preserve"> at UICC</w:t>
-            </w:r>
-            <w:r>
-              <w:rPr>
-                <w:rFonts w:ascii="Garamond" w:eastAsia="Garamond" w:hAnsi="Garamond" w:cs="Garamond"/>
-                <w:bCs/>
-                <w:i/>
-                <w:iCs/>
-                <w:sz w:val="24"/>
-                <w:szCs w:val="24"/>
-                <w:lang w:val="en-IN"/>
-              </w:rPr>
-              <w:t xml:space="preserve"> </w:t>
-            </w:r>
-            <w:r>
-              <w:rPr>
-                <w:rFonts w:ascii="Garamond" w:eastAsia="Garamond" w:hAnsi="Garamond" w:cs="Garamond"/>
-                <w:bCs/>
-                <w:sz w:val="24"/>
-                <w:szCs w:val="24"/>
-                <w:lang w:val="en-IN"/>
-              </w:rPr>
-              <w:t>Trophy</w:t>
-            </w:r>
-            <w:r>
-              <w:rPr>
-                <w:rFonts w:ascii="Garamond" w:eastAsia="Garamond" w:hAnsi="Garamond" w:cs="Garamond"/>
-                <w:bCs/>
-                <w:i/>
-                <w:iCs/>
-                <w:sz w:val="24"/>
-                <w:szCs w:val="24"/>
-                <w:lang w:val="en-IN"/>
-              </w:rPr>
-              <w:t xml:space="preserve"> – </w:t>
-            </w:r>
-            <w:r>
-              <w:rPr>
-                <w:rFonts w:ascii="Garamond" w:eastAsia="Garamond" w:hAnsi="Garamond" w:cs="Garamond"/>
-                <w:bCs/>
-                <w:sz w:val="24"/>
-                <w:szCs w:val="24"/>
-                <w:lang w:val="en-IN"/>
-              </w:rPr>
-              <w:t xml:space="preserve">Rapid Chess Tournament </w:t>
-            </w:r>
-          </w:p>
-          <w:p>
-            <w:pPr>
-              <w:numPr>
-                <w:ilvl w:val="0"/>
-                <w:numId w:val="3"/>
-              </w:numPr>
-              <w:spacing w:line="252" w:lineRule="auto"/>
-              <w:ind w:left="176"/>
-              <w:rPr>
-                <w:rFonts w:ascii="Garamond" w:eastAsia="Garamond" w:hAnsi="Garamond" w:cs="Garamond"/>
-                <w:bCs/>
-                <w:sz w:val="24"/>
-                <w:szCs w:val="24"/>
-              </w:rPr>
-            </w:pPr>
-            <w:r>
-              <w:rPr>
-                <w:rFonts w:ascii="Garamond" w:eastAsia="Garamond" w:hAnsi="Garamond" w:cs="Garamond"/>
-                <w:bCs/>
-                <w:sz w:val="24"/>
-                <w:szCs w:val="24"/>
-              </w:rPr>
-              <w:t xml:space="preserve">Secured Best Delegate at Masters’ Summit MUN (2024 &amp; 2025; </w:t>
-            </w:r>
-            <w:r>
-              <w:rPr>
-                <w:rFonts w:ascii="Times New Roman" w:eastAsia="Garamond" w:hAnsi="Times New Roman" w:cs="Times New Roman"/>
-                <w:bCs/>
-                <w:sz w:val="24"/>
-                <w:szCs w:val="24"/>
-              </w:rPr>
-              <w:t>₹</w:t>
-            </w:r>
-            <w:r>
-              <w:rPr>
-                <w:rFonts w:ascii="Garamond" w:eastAsia="Garamond" w:hAnsi="Garamond" w:cs="Garamond"/>
-                <w:bCs/>
-                <w:sz w:val="24"/>
-                <w:szCs w:val="24"/>
-              </w:rPr>
-              <w:t xml:space="preserve">15k cash prize) and 2nd position at Sahodaya MUN (ECOSOC).</w:t>
-            </w:r>
-          </w:p>
-          <w:p>
-            <w:pPr>
-              <w:numPr>
-                <w:ilvl w:val="0"/>
-                <w:numId w:val="3"/>
-              </w:numPr>
-              <w:spacing w:line="252" w:lineRule="auto"/>
-              <w:ind w:left="176"/>
-              <w:rPr>
-                <w:rFonts w:ascii="Garamond" w:eastAsia="Garamond" w:hAnsi="Garamond" w:cs="Garamond"/>
-                <w:bCs/>
-                <w:sz w:val="24"/>
-                <w:szCs w:val="24"/>
-              </w:rPr>
-            </w:pPr>
-            <w:r>
-              <w:rPr>
-                <w:rFonts w:ascii="Garamond" w:eastAsia="Garamond" w:hAnsi="Garamond" w:cs="Garamond"/>
-                <w:bCs/>
-                <w:sz w:val="24"/>
-                <w:szCs w:val="24"/>
-              </w:rPr>
-              <w:t xml:space="preserve">Won </w:t>
-            </w:r>
-            <w:r>
-              <w:rPr>
-                <w:rFonts w:ascii="Garamond" w:eastAsia="Garamond" w:hAnsi="Garamond" w:cs="Garamond"/>
-                <w:b/>
-                <w:sz w:val="24"/>
-                <w:szCs w:val="24"/>
-              </w:rPr>
-              <w:t>Spandan</w:t>
-            </w:r>
-            <w:r>
-              <w:rPr>
-                <w:rFonts w:ascii="Garamond" w:eastAsia="Garamond" w:hAnsi="Garamond" w:cs="Garamond"/>
-                <w:bCs/>
-                <w:i/>
-                <w:iCs/>
-                <w:sz w:val="24"/>
-                <w:szCs w:val="24"/>
-              </w:rPr>
-              <w:t xml:space="preserve"> </w:t>
-            </w:r>
-            <w:r>
-              <w:rPr>
-                <w:rFonts w:ascii="Garamond" w:eastAsia="Garamond" w:hAnsi="Garamond" w:cs="Garamond"/>
-                <w:b/>
-                <w:sz w:val="24"/>
-                <w:szCs w:val="24"/>
-              </w:rPr>
-              <w:t>Competition</w:t>
-            </w:r>
-            <w:r>
-              <w:rPr>
-                <w:rFonts w:ascii="Garamond" w:eastAsia="Garamond" w:hAnsi="Garamond" w:cs="Garamond"/>
-                <w:bCs/>
-                <w:sz w:val="24"/>
-                <w:szCs w:val="24"/>
-              </w:rPr>
-              <w:t xml:space="preserve"> (</w:t>
-            </w:r>
-            <w:r>
-              <w:rPr>
-                <w:rFonts w:ascii="Garamond" w:eastAsia="Garamond" w:hAnsi="Garamond" w:cs="Garamond"/>
-                <w:sz w:val="24"/>
-                <w:szCs w:val="24"/>
-              </w:rPr>
-              <w:t>GK</w:t>
-            </w:r>
-            <w:r>
-              <w:rPr>
-                <w:rFonts w:ascii="Garamond" w:eastAsia="Garamond" w:hAnsi="Garamond" w:cs="Garamond"/>
-                <w:b/>
-                <w:bCs/>
-                <w:sz w:val="24"/>
-                <w:szCs w:val="24"/>
-              </w:rPr>
-              <w:t>/</w:t>
-            </w:r>
-            <w:r>
-              <w:rPr>
-                <w:rFonts w:ascii="Garamond" w:eastAsia="Garamond" w:hAnsi="Garamond" w:cs="Garamond"/>
-                <w:sz w:val="24"/>
-                <w:szCs w:val="24"/>
-              </w:rPr>
-              <w:t>Quiz</w:t>
-            </w:r>
-            <w:r>
-              <w:rPr>
-                <w:rFonts w:ascii="Garamond" w:eastAsia="Garamond" w:hAnsi="Garamond" w:cs="Garamond"/>
-                <w:b/>
-                <w:bCs/>
-                <w:sz w:val="24"/>
-                <w:szCs w:val="24"/>
-              </w:rPr>
-              <w:t>/</w:t>
-            </w:r>
-            <w:r>
-              <w:rPr>
-                <w:rFonts w:ascii="Garamond" w:eastAsia="Garamond" w:hAnsi="Garamond" w:cs="Garamond"/>
-                <w:sz w:val="24"/>
-                <w:szCs w:val="24"/>
-              </w:rPr>
-              <w:t>Debate</w:t>
-            </w:r>
-            <w:r>
-              <w:rPr>
-                <w:rFonts w:ascii="Garamond" w:eastAsia="Garamond" w:hAnsi="Garamond" w:cs="Garamond"/>
-                <w:bCs/>
-                <w:sz w:val="24"/>
-                <w:szCs w:val="24"/>
-              </w:rPr>
-              <w:t xml:space="preserve">) – </w:t>
-            </w:r>
-            <w:r>
-              <w:rPr>
-                <w:rFonts w:ascii="Garamond" w:eastAsia="Garamond" w:hAnsi="Garamond" w:cs="Garamond"/>
-                <w:sz w:val="24"/>
-                <w:szCs w:val="24"/>
-              </w:rPr>
-              <w:t xml:space="preserve">Cash Prize </w:t>
-            </w:r>
-            <w:r>
-              <w:rPr>
-                <w:rFonts w:ascii="Times New Roman" w:eastAsia="Garamond" w:hAnsi="Times New Roman" w:cs="Times New Roman"/>
-                <w:sz w:val="24"/>
-                <w:szCs w:val="24"/>
-              </w:rPr>
-              <w:t>₹</w:t>
-            </w:r>
-            <w:r>
-              <w:rPr>
-                <w:rFonts w:ascii="Garamond" w:eastAsia="Garamond" w:hAnsi="Garamond" w:cs="Garamond"/>
-                <w:sz w:val="24"/>
-                <w:szCs w:val="24"/>
-              </w:rPr>
-              <w:t>3100</w:t>
-            </w:r>
-          </w:p>
-          <w:p>
-            <w:pPr>
-              <w:numPr>
-                <w:ilvl w:val="0"/>
-                <w:numId w:val="3"/>
-              </w:numPr>
-              <w:spacing w:line="252" w:lineRule="auto"/>
-              <w:ind w:left="176"/>
-              <w:rPr>
-                <w:rFonts w:ascii="Garamond" w:eastAsia="Garamond" w:hAnsi="Garamond" w:cs="Garamond"/>
-                <w:bCs/>
-                <w:sz w:val="24"/>
-                <w:szCs w:val="24"/>
-              </w:rPr>
-            </w:pPr>
-            <w:r>
-              <w:rPr>
-                <w:rFonts w:ascii="Garamond" w:eastAsia="Garamond" w:hAnsi="Garamond" w:cs="Garamond"/>
-                <w:bCs/>
-                <w:sz w:val="24"/>
-                <w:szCs w:val="24"/>
-              </w:rPr>
-              <w:t xml:space="preserve">Achieved </w:t>
-            </w:r>
-            <w:r>
-              <w:rPr>
-                <w:rFonts w:ascii="Garamond" w:eastAsia="Garamond" w:hAnsi="Garamond" w:cs="Garamond"/>
-                <w:b/>
-                <w:bCs/>
-                <w:sz w:val="24"/>
-                <w:szCs w:val="24"/>
-              </w:rPr>
-              <w:t>1st Position</w:t>
-            </w:r>
-            <w:r>
-              <w:rPr>
-                <w:rFonts w:ascii="Garamond" w:eastAsia="Garamond" w:hAnsi="Garamond" w:cs="Garamond"/>
-                <w:bCs/>
-                <w:sz w:val="24"/>
-                <w:szCs w:val="24"/>
-              </w:rPr>
-              <w:t xml:space="preserve"> in English Debate, English Elocution, and Young TV Reporter competitions – School level</w:t>
+                <w:bCs/>
+                <w:sz w:val="20"/>
+                <w:szCs w:val="20"/>
+              </w:rPr>
+            </w:pPr>
+            <w:r>
+              <w:rPr>
+                <w:rFonts w:ascii="Garamond" w:eastAsia="Garamond" w:hAnsi="Garamond" w:cs="Garamond"/>
+                <w:b/>
+                <w:bCs/>
+                <w:sz w:val="20"/>
+                <w:szCs w:val="20"/>
+              </w:rPr>
+              <w:t xml:space="preserve">Research &amp; Speaking:</w:t>
+            </w:r>
+            <w:r>
+              <w:rPr>
+                <w:rFonts w:ascii="Garamond" w:eastAsia="Garamond" w:hAnsi="Garamond" w:cs="Garamond"/>
+                <w:sz w:val="20"/>
+                <w:szCs w:val="20"/>
+              </w:rPr>
+              <w:t xml:space="preserve"> Best Research and Project at Balvigyan – Commerce (Inter-School); won Spandan (GK/Quiz/Debate; ₹3,100 cash prize); 1st in English Debate, English Elocution and Young TV Reporter (school level).</w:t>
             </w:r>
           </w:p>
         </w:tc>
@@ -1874,154 +1970,231 @@
           </w:tcPr>
           <w:p>
             <w:pPr>
-              <w:spacing w:line="252" w:lineRule="auto"/>
-              <w:jc w:val="right"/>
-              <w:rPr>
-                <w:rFonts w:ascii="Garamond" w:eastAsia="Garamond" w:hAnsi="Garamond" w:cs="Garamond"/>
-                <w:sz w:val="24"/>
-                <w:szCs w:val="24"/>
-              </w:rPr>
-            </w:pPr>
-            <w:r>
-              <w:rPr>
-                <w:rFonts w:ascii="Garamond" w:eastAsia="Garamond" w:hAnsi="Garamond" w:cs="Garamond"/>
-                <w:sz w:val="24"/>
-                <w:szCs w:val="24"/>
-              </w:rPr>
-              <w:t>2024-25</w:t>
-            </w:r>
-          </w:p>
-          <w:p>
-            <w:pPr>
-              <w:spacing w:line="252" w:lineRule="auto"/>
-              <w:jc w:val="right"/>
-              <w:rPr>
-                <w:rFonts w:ascii="Garamond" w:eastAsia="Garamond" w:hAnsi="Garamond" w:cs="Garamond"/>
-                <w:sz w:val="24"/>
-                <w:szCs w:val="24"/>
-              </w:rPr>
-            </w:pPr>
-            <w:r>
-              <w:rPr>
-                <w:rFonts w:ascii="Garamond" w:eastAsia="Garamond" w:hAnsi="Garamond" w:cs="Garamond"/>
-                <w:sz w:val="24"/>
-                <w:szCs w:val="24"/>
-              </w:rPr>
-              <w:t>2024</w:t>
-            </w:r>
-          </w:p>
-          <w:p>
-            <w:pPr>
-              <w:spacing w:line="252" w:lineRule="auto"/>
-              <w:jc w:val="right"/>
-              <w:rPr>
-                <w:rFonts w:ascii="Garamond" w:eastAsia="Garamond" w:hAnsi="Garamond" w:cs="Garamond"/>
-                <w:sz w:val="24"/>
-                <w:szCs w:val="24"/>
-              </w:rPr>
-            </w:pPr>
-            <w:r>
-              <w:rPr>
-                <w:rFonts w:ascii="Garamond" w:eastAsia="Garamond" w:hAnsi="Garamond" w:cs="Garamond"/>
-                <w:sz w:val="24"/>
-                <w:szCs w:val="24"/>
-              </w:rPr>
-              <w:t>2024</w:t>
-            </w:r>
-          </w:p>
-          <w:p>
-            <w:pPr>
-              <w:spacing w:line="252" w:lineRule="auto"/>
-              <w:jc w:val="right"/>
-              <w:rPr>
-                <w:rFonts w:ascii="Garamond" w:eastAsia="Garamond" w:hAnsi="Garamond" w:cs="Garamond"/>
-                <w:sz w:val="24"/>
-                <w:szCs w:val="24"/>
-              </w:rPr>
-            </w:pPr>
-            <w:r>
-              <w:rPr>
-                <w:rFonts w:ascii="Garamond" w:eastAsia="Garamond" w:hAnsi="Garamond" w:cs="Garamond"/>
-                <w:sz w:val="24"/>
-                <w:szCs w:val="24"/>
-              </w:rPr>
-              <w:t>2024</w:t>
-            </w:r>
-          </w:p>
-          <w:p>
-            <w:pPr>
-              <w:spacing w:line="252" w:lineRule="auto"/>
-              <w:jc w:val="right"/>
-              <w:rPr>
-                <w:rFonts w:ascii="Garamond" w:eastAsia="Garamond" w:hAnsi="Garamond" w:cs="Garamond"/>
-                <w:sz w:val="24"/>
-                <w:szCs w:val="24"/>
-              </w:rPr>
-            </w:pPr>
-            <w:r>
-              <w:rPr>
-                <w:rFonts w:ascii="Garamond" w:eastAsia="Garamond" w:hAnsi="Garamond" w:cs="Garamond"/>
-                <w:sz w:val="24"/>
-                <w:szCs w:val="24"/>
-              </w:rPr>
-              <w:t>2024</w:t>
-            </w:r>
-          </w:p>
-          <w:p>
-            <w:pPr>
-              <w:spacing w:line="252" w:lineRule="auto"/>
-              <w:jc w:val="right"/>
-              <w:rPr>
-                <w:rFonts w:ascii="Garamond" w:eastAsia="Garamond" w:hAnsi="Garamond" w:cs="Garamond"/>
-                <w:sz w:val="24"/>
-                <w:szCs w:val="24"/>
-              </w:rPr>
-            </w:pPr>
-            <w:r>
-              <w:rPr>
-                <w:rFonts w:ascii="Garamond" w:eastAsia="Garamond" w:hAnsi="Garamond" w:cs="Garamond"/>
-                <w:sz w:val="24"/>
-                <w:szCs w:val="24"/>
-              </w:rPr>
-              <w:t>2024</w:t>
-            </w:r>
-          </w:p>
-          <w:p>
-            <w:pPr>
-              <w:spacing w:line="252" w:lineRule="auto"/>
-              <w:jc w:val="right"/>
-              <w:rPr>
-                <w:rFonts w:ascii="Garamond" w:eastAsia="Garamond" w:hAnsi="Garamond" w:cs="Garamond"/>
-                <w:sz w:val="24"/>
-                <w:szCs w:val="24"/>
-              </w:rPr>
-            </w:pPr>
-            <w:r>
-              <w:rPr>
-                <w:rFonts w:ascii="Garamond" w:eastAsia="Garamond" w:hAnsi="Garamond" w:cs="Garamond"/>
-                <w:sz w:val="24"/>
-                <w:szCs w:val="24"/>
-              </w:rPr>
-              <w:t>2024</w:t>
-            </w:r>
-          </w:p>
-          <w:p>
-            <w:pPr>
-              <w:spacing w:line="252" w:lineRule="auto"/>
-              <w:jc w:val="right"/>
-              <w:rPr>
-                <w:rFonts w:ascii="Garamond" w:eastAsia="Garamond" w:hAnsi="Garamond" w:cs="Garamond"/>
-                <w:sz w:val="24"/>
-                <w:szCs w:val="24"/>
-              </w:rPr>
-            </w:pPr>
-            <w:r>
-              <w:rPr>
-                <w:rFonts w:ascii="Garamond" w:eastAsia="Garamond" w:hAnsi="Garamond" w:cs="Garamond"/>
-                <w:sz w:val="24"/>
-                <w:szCs w:val="24"/>
-              </w:rPr>
-              <w:t>2024-25</w:t>
+              <w:spacing w:line="240" w:lineRule="auto"/>
+              <w:jc w:val="center"/>
+              <w:rPr>
+                <w:rFonts w:ascii="Garamond" w:eastAsia="Garamond" w:hAnsi="Garamond" w:cs="Garamond"/>
+                <w:sz w:val="20"/>
+                <w:szCs w:val="20"/>
+              </w:rPr>
+            </w:pPr>
+            <w:r>
+              <w:rPr>
+                <w:rFonts w:ascii="Garamond" w:eastAsia="Garamond" w:hAnsi="Garamond" w:cs="Garamond"/>
+                <w:sz w:val="20"/>
+                <w:szCs w:val="20"/>
+              </w:rPr>
+              <w:t xml:space="preserve">2024-25</w:t>
+            </w:r>
+          </w:p>
+        </w:tc>
+      </w:tr>
+      <w:tr>
+        <w:tc>
+          <w:tcPr>
+            <w:tcW w:w="2078" w:type="dxa"/>
+            <w:gridSpan w:val="2"/>
+            <w:shd w:val="clear" w:color="auto" w:fill="D9D9D9"/>
+            <w:vAlign w:val="center"/>
+          </w:tcPr>
+          <w:p>
+            <w:pPr>
+              <w:spacing w:line="240" w:lineRule="auto"/>
+              <w:ind w:left="360"/>
+              <w:rPr>
+                <w:rFonts w:ascii="Garamond" w:eastAsia="Garamond" w:hAnsi="Garamond" w:cs="Garamond"/>
+                <w:b/>
+                <w:sz w:val="20"/>
+                <w:szCs w:val="20"/>
+              </w:rPr>
+            </w:pPr>
+            <w:r>
+              <w:rPr>
+                <w:rFonts w:ascii="Garamond" w:eastAsia="Garamond" w:hAnsi="Garamond" w:cs="Garamond"/>
+                <w:b/>
+                <w:bCs/>
+                <w:sz w:val="20"/>
+                <w:szCs w:val="20"/>
+              </w:rPr>
+              <w:t xml:space="preserve">Projects</w:t>
+            </w:r>
+          </w:p>
+        </w:tc>
+        <w:tc>
+          <w:tcPr>
+            <w:tcW w:w="8232" w:type="dxa"/>
+            <w:gridSpan w:val="2"/>
+            <w:tcBorders>
+              <w:right w:val="nil"/>
+            </w:tcBorders>
+          </w:tcPr>
+          <w:p>
+            <w:pPr>
+              <w:numPr>
+                <w:ilvl w:val="0"/>
+                <w:numId w:val="3"/>
+              </w:numPr>
+              <w:spacing w:line="240" w:lineRule="auto"/>
+              <w:ind w:left="176"/>
+              <w:rPr>
+                <w:rFonts w:ascii="Garamond" w:eastAsia="Garamond" w:hAnsi="Garamond" w:cs="Garamond"/>
+                <w:bCs/>
+                <w:sz w:val="20"/>
+                <w:szCs w:val="20"/>
+              </w:rPr>
+            </w:pPr>
+            <w:r>
+              <w:rPr>
+                <w:rFonts w:ascii="Garamond" w:eastAsia="Garamond" w:hAnsi="Garamond" w:cs="Garamond"/>
+                <w:b/>
+                <w:bCs/>
+                <w:sz w:val="20"/>
+                <w:szCs w:val="20"/>
+              </w:rPr>
+              <w:t xml:space="preserve">Built small tools:</w:t>
+            </w:r>
+            <w:r>
+              <w:rPr>
+                <w:rFonts w:ascii="Garamond" w:eastAsia="Garamond" w:hAnsi="Garamond" w:cs="Garamond"/>
+                <w:sz w:val="20"/>
+                <w:szCs w:val="20"/>
+              </w:rPr>
+              <w:t xml:space="preserve"> induction-week browser games (escape room, murder mystery, live 100-player quiz); Firebase/React app for Student Council meeting records; lead-enrichment pipeline, Google Maps scraper and 76-college contact database for NextGenix; Python/Selenium WhatsApp automation for interview confirmations at Jarurat Care.</w:t>
+            </w:r>
+          </w:p>
+        </w:tc>
+        <w:tc>
+          <w:tcPr>
+            <w:tcW w:w="1015" w:type="dxa"/>
+            <w:gridSpan w:val="2"/>
+            <w:tcBorders>
+              <w:left w:val="nil"/>
+              <w:bottom w:val="single" w:sz="4" w:space="0" w:color="000000"/>
+            </w:tcBorders>
+            <w:vAlign w:val="center"/>
+          </w:tcPr>
+          <w:p>
+            <w:pPr>
+              <w:spacing w:line="240" w:lineRule="auto"/>
+              <w:jc w:val="center"/>
+              <w:rPr>
+                <w:rFonts w:ascii="Garamond" w:eastAsia="Garamond" w:hAnsi="Garamond" w:cs="Garamond"/>
+                <w:sz w:val="20"/>
+                <w:szCs w:val="20"/>
+              </w:rPr>
+            </w:pPr>
+            <w:r>
+              <w:rPr>
+                <w:rFonts w:ascii="Garamond" w:eastAsia="Garamond" w:hAnsi="Garamond" w:cs="Garamond"/>
+                <w:sz w:val="20"/>
+                <w:szCs w:val="20"/>
+              </w:rPr>
+              <w:t xml:space="preserve">2026</w:t>
+            </w:r>
+          </w:p>
+        </w:tc>
+      </w:tr>
+      <w:tr>
+        <w:tc>
+          <w:tcPr>
+            <w:tcW w:w="2078" w:type="dxa"/>
+            <w:gridSpan w:val="2"/>
+            <w:shd w:val="clear" w:color="auto" w:fill="D9D9D9"/>
+            <w:vAlign w:val="center"/>
+          </w:tcPr>
+          <w:p>
+            <w:pPr>
+              <w:spacing w:line="240" w:lineRule="auto"/>
+              <w:ind w:left="360"/>
+              <w:rPr>
+                <w:rFonts w:ascii="Garamond" w:eastAsia="Garamond" w:hAnsi="Garamond" w:cs="Garamond"/>
+                <w:b/>
+                <w:sz w:val="20"/>
+                <w:szCs w:val="20"/>
+              </w:rPr>
+            </w:pPr>
+            <w:r>
+              <w:rPr>
+                <w:rFonts w:ascii="Garamond" w:eastAsia="Garamond" w:hAnsi="Garamond" w:cs="Garamond"/>
+                <w:b/>
+                <w:bCs/>
+                <w:sz w:val="20"/>
+                <w:szCs w:val="20"/>
+              </w:rPr>
+              <w:t xml:space="preserve">Initiatives</w:t>
+            </w:r>
+          </w:p>
+        </w:tc>
+        <w:tc>
+          <w:tcPr>
+            <w:tcW w:w="8232" w:type="dxa"/>
+            <w:gridSpan w:val="2"/>
+            <w:tcBorders>
+              <w:right w:val="nil"/>
+            </w:tcBorders>
+          </w:tcPr>
+          <w:p>
+            <w:pPr>
+              <w:numPr>
+                <w:ilvl w:val="0"/>
+                <w:numId w:val="3"/>
+              </w:numPr>
+              <w:spacing w:line="240" w:lineRule="auto"/>
+              <w:ind w:left="176"/>
+              <w:rPr>
+                <w:rFonts w:ascii="Garamond" w:eastAsia="Garamond" w:hAnsi="Garamond" w:cs="Garamond"/>
+                <w:bCs/>
+                <w:sz w:val="20"/>
+                <w:szCs w:val="20"/>
+              </w:rPr>
+            </w:pPr>
+            <w:r>
+              <w:rPr>
+                <w:rFonts w:ascii="Garamond" w:eastAsia="Garamond" w:hAnsi="Garamond" w:cs="Garamond"/>
+                <w:b/>
+                <w:bCs/>
+                <w:sz w:val="20"/>
+                <w:szCs w:val="20"/>
+              </w:rPr>
+              <w:t xml:space="preserve">Organised and ran:</w:t>
+            </w:r>
+            <w:r>
+              <w:rPr>
+                <w:rFonts w:ascii="Garamond" w:eastAsia="Garamond" w:hAnsi="Garamond" w:cs="Garamond"/>
+                <w:sz w:val="20"/>
+                <w:szCs w:val="20"/>
+              </w:rPr>
+              <w:t xml:space="preserve"> the freshers’ event for the second BMS batch (naming, run-of-show, automated sponsor outreach); fest sponsorship strategy with a 64-organisation tracker and outreach playbook (Nov 2026); a 12-player Swiss-system chess tournament; a weather-alert automation project (Python/Selenium, 200+ Indian cities, WhatsApp broadcast; team of three).</w:t>
+            </w:r>
+          </w:p>
+        </w:tc>
+        <w:tc>
+          <w:tcPr>
+            <w:tcW w:w="1015" w:type="dxa"/>
+            <w:gridSpan w:val="2"/>
+            <w:tcBorders>
+              <w:left w:val="nil"/>
+              <w:bottom w:val="single" w:sz="4" w:space="0" w:color="000000"/>
+            </w:tcBorders>
+            <w:vAlign w:val="center"/>
+          </w:tcPr>
+          <w:p>
+            <w:pPr>
+              <w:spacing w:line="240" w:lineRule="auto"/>
+              <w:jc w:val="center"/>
+              <w:rPr>
+                <w:rFonts w:ascii="Garamond" w:eastAsia="Garamond" w:hAnsi="Garamond" w:cs="Garamond"/>
+                <w:sz w:val="20"/>
+                <w:szCs w:val="20"/>
+              </w:rPr>
+            </w:pPr>
+            <w:r>
+              <w:rPr>
+                <w:rFonts w:ascii="Garamond" w:eastAsia="Garamond" w:hAnsi="Garamond" w:cs="Garamond"/>
+                <w:sz w:val="20"/>
+                <w:szCs w:val="20"/>
+              </w:rPr>
+              <w:t xml:space="preserve">2026</w:t>
             </w:r>
           </w:p>
         </w:tc>
@@ -2039,21 +2212,21 @@
           </w:tcPr>
           <w:p>
             <w:pPr>
-              <w:spacing w:line="252" w:lineRule="auto"/>
+              <w:spacing w:line="240" w:lineRule="auto"/>
               <w:jc w:val="center"/>
               <w:rPr>
                 <w:rFonts w:ascii="Garamond" w:eastAsia="Garamond" w:hAnsi="Garamond" w:cs="Garamond"/>
                 <w:b/>
-                <w:sz w:val="24"/>
-                <w:szCs w:val="24"/>
-              </w:rPr>
-            </w:pPr>
-            <w:r>
-              <w:rPr>
-                <w:rFonts w:ascii="Garamond" w:eastAsia="Garamond" w:hAnsi="Garamond" w:cs="Garamond"/>
-                <w:b/>
-                <w:sz w:val="24"/>
-                <w:szCs w:val="24"/>
+                <w:sz w:val="20"/>
+                <w:szCs w:val="20"/>
+              </w:rPr>
+            </w:pPr>
+            <w:r>
+              <w:rPr>
+                <w:rFonts w:ascii="Garamond" w:eastAsia="Garamond" w:hAnsi="Garamond" w:cs="Garamond"/>
+                <w:b/>
+                <w:sz w:val="20"/>
+                <w:szCs w:val="20"/>
               </w:rPr>
               <w:t>Others</w:t>
             </w:r>
@@ -2073,67 +2246,68 @@
                 <w:ilvl w:val="0"/>
                 <w:numId w:val="3"/>
               </w:numPr>
-              <w:spacing w:line="252" w:lineRule="auto"/>
+              <w:spacing w:line="240" w:lineRule="auto"/>
               <w:ind w:left="176"/>
               <w:rPr>
                 <w:rFonts w:ascii="Garamond" w:eastAsia="Garamond" w:hAnsi="Garamond" w:cs="Garamond"/>
-                <w:sz w:val="24"/>
-                <w:szCs w:val="24"/>
-              </w:rPr>
-            </w:pPr>
-            <w:r>
-              <w:rPr>
-                <w:rFonts w:ascii="Garamond" w:eastAsia="Garamond" w:hAnsi="Garamond" w:cs="Garamond"/>
-                <w:b/>
-                <w:bCs/>
-                <w:sz w:val="24"/>
-                <w:szCs w:val="24"/>
-              </w:rPr>
-              <w:t>Sports &amp; Training:</w:t>
-            </w:r>
-            <w:r>
-              <w:rPr>
-                <w:rFonts w:ascii="Garamond" w:eastAsia="Garamond" w:hAnsi="Garamond" w:cs="Garamond"/>
-                <w:sz w:val="24"/>
-                <w:szCs w:val="24"/>
-              </w:rPr>
-              <w:t xml:space="preserve"> Secured Silver in the </w:t>
-            </w:r>
-            <w:r>
-              <w:rPr>
-                <w:rFonts w:ascii="Garamond" w:eastAsia="Garamond" w:hAnsi="Garamond" w:cs="Garamond"/>
-                <w:b/>
-                <w:bCs/>
-                <w:sz w:val="24"/>
-                <w:szCs w:val="24"/>
-              </w:rPr>
-              <w:t>Inter-IPM College Badminton</w:t>
-            </w:r>
-            <w:r>
-              <w:rPr>
-                <w:rFonts w:ascii="Garamond" w:eastAsia="Garamond" w:hAnsi="Garamond" w:cs="Garamond"/>
-                <w:sz w:val="24"/>
-                <w:szCs w:val="24"/>
-              </w:rPr>
-              <w:t xml:space="preserve"> Tournament; Participated in Inter-School </w:t>
-            </w:r>
-            <w:r>
-              <w:rPr>
-                <w:rFonts w:ascii="Garamond" w:eastAsia="Garamond" w:hAnsi="Garamond" w:cs="Garamond"/>
-                <w:b/>
-                <w:bCs/>
-                <w:sz w:val="24"/>
-                <w:szCs w:val="24"/>
-              </w:rPr>
-              <w:t>NCC/Military Training</w:t>
-            </w:r>
-            <w:r>
-              <w:rPr>
-                <w:rFonts w:ascii="Garamond" w:eastAsia="Garamond" w:hAnsi="Garamond" w:cs="Garamond"/>
-                <w:sz w:val="24"/>
-                <w:szCs w:val="24"/>
-              </w:rPr>
-              <w:t xml:space="preserve"> (2023)</w:t>
+                <w:bCs/>
+                <w:sz w:val="20"/>
+                <w:szCs w:val="20"/>
+              </w:rPr>
+            </w:pPr>
+            <w:r>
+              <w:rPr>
+                <w:rFonts w:ascii="Garamond" w:eastAsia="Garamond" w:hAnsi="Garamond" w:cs="Garamond"/>
+                <w:b/>
+                <w:bCs/>
+                <w:sz w:val="20"/>
+                <w:szCs w:val="20"/>
+              </w:rPr>
+              <w:t xml:space="preserve">Sports &amp; Training:</w:t>
+            </w:r>
+            <w:r>
+              <w:rPr>
+                <w:rFonts w:ascii="Garamond" w:eastAsia="Garamond" w:hAnsi="Garamond" w:cs="Garamond"/>
+                <w:sz w:val="20"/>
+                <w:szCs w:val="20"/>
+              </w:rPr>
+              <w:t xml:space="preserve"> Silver in the </w:t>
+            </w:r>
+            <w:r>
+              <w:rPr>
+                <w:rFonts w:ascii="Garamond" w:eastAsia="Garamond" w:hAnsi="Garamond" w:cs="Garamond"/>
+                <w:b/>
+                <w:bCs/>
+                <w:sz w:val="20"/>
+                <w:szCs w:val="20"/>
+              </w:rPr>
+              <w:t xml:space="preserve">Inter-IPM College Badminton Tournament</w:t>
+            </w:r>
+            <w:r>
+              <w:rPr>
+                <w:rFonts w:ascii="Garamond" w:eastAsia="Garamond" w:hAnsi="Garamond" w:cs="Garamond"/>
+                <w:sz w:val="20"/>
+                <w:szCs w:val="20"/>
+              </w:rPr>
+              <w:t xml:space="preserve">; participated in Inter-School </w:t>
+            </w:r>
+            <w:r>
+              <w:rPr>
+                <w:rFonts w:ascii="Garamond" w:eastAsia="Garamond" w:hAnsi="Garamond" w:cs="Garamond"/>
+                <w:b/>
+                <w:bCs/>
+                <w:sz w:val="20"/>
+                <w:szCs w:val="20"/>
+              </w:rPr>
+              <w:t xml:space="preserve">NCC/Military Training</w:t>
+            </w:r>
+            <w:r>
+              <w:rPr>
+                <w:rFonts w:ascii="Garamond" w:eastAsia="Garamond" w:hAnsi="Garamond" w:cs="Garamond"/>
+                <w:sz w:val="20"/>
+                <w:szCs w:val="20"/>
+              </w:rPr>
+              <w:t xml:space="preserve"> (2023).</w:t>
             </w:r>
           </w:p>
         </w:tc>
@@ -2147,21 +2321,21 @@
           </w:tcPr>
           <w:p>
             <w:pPr>
-              <w:spacing w:line="252" w:lineRule="auto"/>
-              <w:jc w:val="right"/>
-              <w:rPr>
-                <w:rFonts w:ascii="Garamond" w:eastAsia="Garamond" w:hAnsi="Garamond" w:cs="Garamond"/>
-                <w:sz w:val="24"/>
-                <w:szCs w:val="24"/>
-              </w:rPr>
-            </w:pPr>
-            <w:r>
-              <w:rPr>
-                <w:rFonts w:ascii="Garamond" w:eastAsia="Garamond" w:hAnsi="Garamond" w:cs="Garamond"/>
-                <w:sz w:val="24"/>
-                <w:szCs w:val="24"/>
-              </w:rPr>
-              <w:t>2026</w:t>
+              <w:spacing w:line="240" w:lineRule="auto"/>
+              <w:jc w:val="center"/>
+              <w:rPr>
+                <w:rFonts w:ascii="Garamond" w:eastAsia="Garamond" w:hAnsi="Garamond" w:cs="Garamond"/>
+                <w:sz w:val="20"/>
+                <w:szCs w:val="20"/>
+              </w:rPr>
+            </w:pPr>
+            <w:r>
+              <w:rPr>
+                <w:rFonts w:ascii="Garamond" w:eastAsia="Garamond" w:hAnsi="Garamond" w:cs="Garamond"/>
+                <w:sz w:val="20"/>
+                <w:szCs w:val="20"/>
+              </w:rPr>
+              <w:t xml:space="preserve">2026</w:t>
             </w:r>
           </w:p>
         </w:tc>
@@ -2179,21 +2353,21 @@
           </w:tcPr>
           <w:p>
             <w:pPr>
-              <w:spacing w:line="252" w:lineRule="auto"/>
+              <w:spacing w:line="240" w:lineRule="auto"/>
               <w:jc w:val="center"/>
               <w:rPr>
                 <w:rFonts w:ascii="Garamond" w:eastAsia="Garamond" w:hAnsi="Garamond" w:cs="Garamond"/>
                 <w:b/>
-                <w:sz w:val="24"/>
-                <w:szCs w:val="24"/>
-              </w:rPr>
-            </w:pPr>
-            <w:r>
-              <w:rPr>
-                <w:rFonts w:ascii="Garamond" w:eastAsia="Garamond" w:hAnsi="Garamond" w:cs="Garamond"/>
-                <w:b/>
-                <w:sz w:val="24"/>
-                <w:szCs w:val="24"/>
+                <w:sz w:val="20"/>
+                <w:szCs w:val="20"/>
+              </w:rPr>
+            </w:pPr>
+            <w:r>
+              <w:rPr>
+                <w:rFonts w:ascii="Garamond" w:eastAsia="Garamond" w:hAnsi="Garamond" w:cs="Garamond"/>
+                <w:b/>
+                <w:sz w:val="20"/>
+                <w:szCs w:val="20"/>
               </w:rPr>
               <w:t>SKILLS</w:t>
             </w:r>
@@ -2216,22 +2390,22 @@
           </w:tcPr>
           <w:p>
             <w:pPr>
-              <w:spacing w:line="252" w:lineRule="auto"/>
+              <w:spacing w:line="240" w:lineRule="auto"/>
               <w:jc w:val="center"/>
               <w:rPr>
                 <w:rFonts w:ascii="Garamond" w:eastAsia="Garamond" w:hAnsi="Garamond" w:cs="Garamond"/>
                 <w:b/>
-                <w:sz w:val="24"/>
-                <w:szCs w:val="24"/>
-              </w:rPr>
-            </w:pPr>
-            <w:r>
-              <w:rPr>
-                <w:rFonts w:ascii="Garamond" w:eastAsia="Garamond" w:hAnsi="Garamond" w:cs="Garamond"/>
-                <w:b/>
-                <w:bCs/>
-                <w:sz w:val="24"/>
-                <w:szCs w:val="24"/>
+                <w:sz w:val="20"/>
+                <w:szCs w:val="20"/>
+              </w:rPr>
+            </w:pPr>
+            <w:r>
+              <w:rPr>
+                <w:rFonts w:ascii="Garamond" w:eastAsia="Garamond" w:hAnsi="Garamond" w:cs="Garamond"/>
+                <w:b/>
+                <w:bCs/>
+                <w:sz w:val="20"/>
+                <w:szCs w:val="20"/>
               </w:rPr>
               <w:t>Core Competencies</w:t>
             </w:r>
@@ -2251,23 +2425,24 @@
                 <w:ilvl w:val="0"/>
                 <w:numId w:val="3"/>
               </w:numPr>
-              <w:spacing w:line="252" w:lineRule="auto"/>
-              <w:jc w:val="both"/>
-              <w:rPr>
-                <w:rFonts w:ascii="Garamond" w:eastAsia="Garamond" w:hAnsi="Garamond" w:cs="Garamond"/>
-                <w:b/>
-                <w:sz w:val="24"/>
-                <w:szCs w:val="24"/>
-              </w:rPr>
-            </w:pPr>
-            <w:r>
-              <w:rPr>
-                <w:rFonts w:ascii="Garamond" w:eastAsia="Garamond" w:hAnsi="Garamond" w:cs="Garamond"/>
-                <w:b/>
-                <w:sz w:val="24"/>
-                <w:szCs w:val="24"/>
-              </w:rPr>
-              <w:t>Event Management, Budgeting &amp; Financial Tracking, Strategic Thinking, Public Speaking.</w:t>
+              <w:spacing w:line="240" w:lineRule="auto"/>
+              <w:ind w:left="176"/>
+              <w:rPr>
+                <w:rFonts w:ascii="Garamond" w:eastAsia="Garamond" w:hAnsi="Garamond" w:cs="Garamond"/>
+                <w:bCs/>
+                <w:sz w:val="20"/>
+                <w:szCs w:val="20"/>
+              </w:rPr>
+            </w:pPr>
+            <w:r>
+              <w:rPr>
+                <w:rFonts w:ascii="Garamond" w:eastAsia="Garamond" w:hAnsi="Garamond" w:cs="Garamond"/>
+                <w:b/>
+                <w:bCs/>
+                <w:sz w:val="20"/>
+                <w:szCs w:val="20"/>
+              </w:rPr>
+              <w:t xml:space="preserve">Event Management, Budgeting &amp; P&amp;L Tracking, B2B Outreach &amp; Sales Coordination, Data Analysis &amp; Reporting, Strategic Thinking, Public Speaking.</w:t>
             </w:r>
           </w:p>
         </w:tc>
@@ -2288,23 +2463,23 @@
           </w:tcPr>
           <w:p>
             <w:pPr>
-              <w:spacing w:line="252" w:lineRule="auto"/>
+              <w:spacing w:line="240" w:lineRule="auto"/>
               <w:jc w:val="center"/>
               <w:rPr>
                 <w:rFonts w:ascii="Garamond" w:eastAsia="Garamond" w:hAnsi="Garamond" w:cs="Garamond"/>
                 <w:b/>
                 <w:bCs/>
-                <w:sz w:val="24"/>
-                <w:szCs w:val="24"/>
-              </w:rPr>
-            </w:pPr>
-            <w:r>
-              <w:rPr>
-                <w:rFonts w:ascii="Garamond" w:eastAsia="Garamond" w:hAnsi="Garamond" w:cs="Garamond"/>
-                <w:b/>
-                <w:bCs/>
-                <w:sz w:val="24"/>
-                <w:szCs w:val="24"/>
+                <w:sz w:val="20"/>
+                <w:szCs w:val="20"/>
+              </w:rPr>
+            </w:pPr>
+            <w:r>
+              <w:rPr>
+                <w:rFonts w:ascii="Garamond" w:eastAsia="Garamond" w:hAnsi="Garamond" w:cs="Garamond"/>
+                <w:b/>
+                <w:bCs/>
+                <w:sz w:val="20"/>
+                <w:szCs w:val="20"/>
               </w:rPr>
               <w:t>Technical Skills</w:t>
             </w:r>
@@ -2324,23 +2499,86 @@
                 <w:ilvl w:val="0"/>
                 <w:numId w:val="3"/>
               </w:numPr>
-              <w:spacing w:line="252" w:lineRule="auto"/>
-              <w:jc w:val="both"/>
-              <w:rPr>
-                <w:rFonts w:ascii="Garamond" w:eastAsia="Garamond" w:hAnsi="Garamond" w:cs="Garamond"/>
-                <w:b/>
-                <w:sz w:val="24"/>
-                <w:szCs w:val="24"/>
-              </w:rPr>
-            </w:pPr>
-            <w:r>
-              <w:rPr>
-                <w:rFonts w:ascii="Garamond" w:eastAsia="Garamond" w:hAnsi="Garamond" w:cs="Garamond"/>
-                <w:b/>
-                <w:sz w:val="24"/>
-                <w:szCs w:val="24"/>
-              </w:rPr>
-              <w:t>Video Editing (DaVinci Resolve): Experienced in editing videos, including cutting, adding effects, and color correction.</w:t>
+              <w:spacing w:line="240" w:lineRule="auto"/>
+              <w:ind w:left="176"/>
+              <w:rPr>
+                <w:rFonts w:ascii="Garamond" w:eastAsia="Garamond" w:hAnsi="Garamond" w:cs="Garamond"/>
+                <w:bCs/>
+                <w:sz w:val="20"/>
+                <w:szCs w:val="20"/>
+              </w:rPr>
+            </w:pPr>
+            <w:r>
+              <w:rPr>
+                <w:rFonts w:ascii="Garamond" w:eastAsia="Garamond" w:hAnsi="Garamond" w:cs="Garamond"/>
+                <w:b/>
+                <w:bCs/>
+                <w:sz w:val="20"/>
+                <w:szCs w:val="20"/>
+              </w:rPr>
+              <w:t xml:space="preserve">Python (Selenium, BeautifulSoup, REST APIs), Firebase &amp; React, HTML/JS</w:t>
+            </w:r>
+            <w:r>
+              <w:rPr>
+                <w:rFonts w:ascii="Garamond" w:eastAsia="Garamond" w:hAnsi="Garamond" w:cs="Garamond"/>
+                <w:sz w:val="20"/>
+                <w:szCs w:val="20"/>
+              </w:rPr>
+              <w:t xml:space="preserve">; Advanced </w:t>
+            </w:r>
+            <w:r>
+              <w:rPr>
+                <w:rFonts w:ascii="Garamond" w:eastAsia="Garamond" w:hAnsi="Garamond" w:cs="Garamond"/>
+                <w:b/>
+                <w:bCs/>
+                <w:sz w:val="20"/>
+                <w:szCs w:val="20"/>
+              </w:rPr>
+              <w:t xml:space="preserve">Excel/Google Sheets</w:t>
+            </w:r>
+            <w:r>
+              <w:rPr>
+                <w:rFonts w:ascii="Garamond" w:eastAsia="Garamond" w:hAnsi="Garamond" w:cs="Garamond"/>
+                <w:sz w:val="20"/>
+                <w:szCs w:val="20"/>
+              </w:rPr>
+              <w:t xml:space="preserve"> (Pivot Tables, XLOOKUP); Video Editing (</w:t>
+            </w:r>
+            <w:r>
+              <w:rPr>
+                <w:rFonts w:ascii="Garamond" w:eastAsia="Garamond" w:hAnsi="Garamond" w:cs="Garamond"/>
+                <w:b/>
+                <w:bCs/>
+                <w:sz w:val="20"/>
+                <w:szCs w:val="20"/>
+              </w:rPr>
+              <w:t xml:space="preserve">DaVinci Resolve</w:t>
+            </w:r>
+            <w:r>
+              <w:rPr>
+                <w:rFonts w:ascii="Garamond" w:eastAsia="Garamond" w:hAnsi="Garamond" w:cs="Garamond"/>
+                <w:sz w:val="20"/>
+                <w:szCs w:val="20"/>
+              </w:rPr>
+              <w:t xml:space="preserve">); </w:t>
+            </w:r>
+            <w:r>
+              <w:rPr>
+                <w:rFonts w:ascii="Garamond" w:eastAsia="Garamond" w:hAnsi="Garamond" w:cs="Garamond"/>
+                <w:b/>
+                <w:bCs/>
+                <w:sz w:val="20"/>
+                <w:szCs w:val="20"/>
+              </w:rPr>
+              <w:t xml:space="preserve">SQL &amp; Google Data Analytics</w:t>
+            </w:r>
+            <w:r>
+              <w:rPr>
+                <w:rFonts w:ascii="Garamond" w:eastAsia="Garamond" w:hAnsi="Garamond" w:cs="Garamond"/>
+                <w:sz w:val="20"/>
+                <w:szCs w:val="20"/>
+              </w:rPr>
+              <w:t xml:space="preserve"> (Coursera) in progress.</w:t>
             </w:r>
           </w:p>
         </w:tc>
@@ -2358,21 +2596,21 @@
           </w:tcPr>
           <w:p>
             <w:pPr>
-              <w:spacing w:line="252" w:lineRule="auto"/>
+              <w:spacing w:line="240" w:lineRule="auto"/>
               <w:jc w:val="center"/>
               <w:rPr>
                 <w:rFonts w:ascii="Garamond" w:eastAsia="Garamond" w:hAnsi="Garamond" w:cs="Garamond"/>
                 <w:b/>
-                <w:sz w:val="24"/>
-                <w:szCs w:val="24"/>
-              </w:rPr>
-            </w:pPr>
-            <w:r>
-              <w:rPr>
-                <w:rFonts w:ascii="Garamond" w:eastAsia="Garamond" w:hAnsi="Garamond" w:cs="Garamond"/>
-                <w:b/>
-                <w:sz w:val="24"/>
-                <w:szCs w:val="24"/>
+                <w:sz w:val="20"/>
+                <w:szCs w:val="20"/>
+              </w:rPr>
+            </w:pPr>
+            <w:r>
+              <w:rPr>
+                <w:rFonts w:ascii="Garamond" w:eastAsia="Garamond" w:hAnsi="Garamond" w:cs="Garamond"/>
+                <w:b/>
+                <w:sz w:val="20"/>
+                <w:szCs w:val="20"/>
               </w:rPr>
               <w:t>Soft Skills</w:t>
             </w:r>
@@ -2389,58 +2627,24 @@
                 <w:ilvl w:val="0"/>
                 <w:numId w:val="3"/>
               </w:numPr>
-              <w:spacing w:line="252" w:lineRule="auto"/>
-              <w:rPr>
-                <w:rFonts w:ascii="Garamond" w:eastAsia="Garamond" w:hAnsi="Garamond" w:cs="Garamond"/>
-                <w:sz w:val="24"/>
-                <w:szCs w:val="24"/>
-              </w:rPr>
-            </w:pPr>
-            <w:r>
-              <w:rPr>
-                <w:rFonts w:ascii="Garamond" w:eastAsia="Garamond" w:hAnsi="Garamond" w:cs="Garamond"/>
-                <w:b/>
-                <w:bCs/>
-                <w:sz w:val="24"/>
-                <w:szCs w:val="24"/>
-              </w:rPr>
-              <w:t>Problem-Solving</w:t>
-            </w:r>
-            <w:r>
-              <w:rPr>
-                <w:rFonts w:ascii="Garamond" w:eastAsia="Garamond" w:hAnsi="Garamond" w:cs="Garamond"/>
-                <w:sz w:val="24"/>
-                <w:szCs w:val="24"/>
-              </w:rPr>
-              <w:t xml:space="preserve">, </w:t>
-            </w:r>
-            <w:r>
-              <w:rPr>
-                <w:rFonts w:ascii="Garamond" w:eastAsia="Garamond" w:hAnsi="Garamond" w:cs="Garamond"/>
-                <w:b/>
-                <w:bCs/>
-                <w:sz w:val="24"/>
-                <w:szCs w:val="24"/>
-              </w:rPr>
-              <w:t>Cross-functional Collaboration</w:t>
-            </w:r>
-            <w:r>
-              <w:rPr>
-                <w:rFonts w:ascii="Garamond" w:eastAsia="Garamond" w:hAnsi="Garamond" w:cs="Garamond"/>
-                <w:sz w:val="24"/>
-                <w:szCs w:val="24"/>
-              </w:rPr>
-              <w:t xml:space="preserve">, </w:t>
-            </w:r>
-            <w:r>
-              <w:rPr>
-                <w:rFonts w:ascii="Garamond" w:eastAsia="Garamond" w:hAnsi="Garamond" w:cs="Garamond"/>
-                <w:b/>
-                <w:bCs/>
-                <w:sz w:val="24"/>
-                <w:szCs w:val="24"/>
-              </w:rPr>
-              <w:t>Clear Verbal &amp; Written Communication.</w:t>
+              <w:spacing w:line="240" w:lineRule="auto"/>
+              <w:ind w:left="176"/>
+              <w:rPr>
+                <w:rFonts w:ascii="Garamond" w:eastAsia="Garamond" w:hAnsi="Garamond" w:cs="Garamond"/>
+                <w:bCs/>
+                <w:sz w:val="20"/>
+                <w:szCs w:val="20"/>
+              </w:rPr>
+            </w:pPr>
+            <w:r>
+              <w:rPr>
+                <w:rFonts w:ascii="Garamond" w:eastAsia="Garamond" w:hAnsi="Garamond" w:cs="Garamond"/>
+                <w:b/>
+                <w:bCs/>
+                <w:sz w:val="20"/>
+                <w:szCs w:val="20"/>
+              </w:rPr>
+              <w:t xml:space="preserve">Problem-Solving, Cross-functional Collaboration, Stakeholder Management, Clear Verbal &amp; Written Communication.</w:t>
             </w:r>
           </w:p>
         </w:tc>
@@ -2478,21 +2682,21 @@
           </w:tcPr>
           <w:p>
             <w:pPr>
-              <w:spacing w:line="252" w:lineRule="auto"/>
+              <w:spacing w:line="240" w:lineRule="auto"/>
               <w:jc w:val="center"/>
               <w:rPr>
                 <w:rFonts w:ascii="Garamond" w:eastAsia="Garamond" w:hAnsi="Garamond" w:cs="Garamond"/>
                 <w:b/>
-                <w:sz w:val="24"/>
-                <w:szCs w:val="24"/>
-              </w:rPr>
-            </w:pPr>
-            <w:r>
-              <w:rPr>
-                <w:rFonts w:ascii="Garamond" w:eastAsia="Garamond" w:hAnsi="Garamond" w:cs="Garamond"/>
-                <w:b/>
-                <w:sz w:val="24"/>
-                <w:szCs w:val="24"/>
+                <w:sz w:val="20"/>
+                <w:szCs w:val="20"/>
+              </w:rPr>
+            </w:pPr>
+            <w:r>
+              <w:rPr>
+                <w:rFonts w:ascii="Garamond" w:eastAsia="Garamond" w:hAnsi="Garamond" w:cs="Garamond"/>
+                <w:b/>
+                <w:sz w:val="20"/>
+                <w:szCs w:val="20"/>
               </w:rPr>
               <w:t>Hobbies</w:t>
             </w:r>
@@ -2514,21 +2718,21 @@
           </w:tcPr>
           <w:p>
             <w:pPr>
-              <w:spacing w:line="252" w:lineRule="auto"/>
+              <w:spacing w:line="240" w:lineRule="auto"/>
               <w:jc w:val="center"/>
               <w:rPr>
                 <w:rFonts w:ascii="Garamond" w:eastAsia="Garamond" w:hAnsi="Garamond" w:cs="Garamond"/>
                 <w:b/>
-                <w:sz w:val="24"/>
-                <w:szCs w:val="24"/>
-              </w:rPr>
-            </w:pPr>
-            <w:r>
-              <w:rPr>
-                <w:rFonts w:ascii="Garamond" w:eastAsia="Garamond" w:hAnsi="Garamond" w:cs="Garamond"/>
-                <w:b/>
-                <w:sz w:val="24"/>
-                <w:szCs w:val="24"/>
+                <w:sz w:val="20"/>
+                <w:szCs w:val="20"/>
+              </w:rPr>
+            </w:pPr>
+            <w:r>
+              <w:rPr>
+                <w:rFonts w:ascii="Garamond" w:eastAsia="Garamond" w:hAnsi="Garamond" w:cs="Garamond"/>
+                <w:b/>
+                <w:sz w:val="20"/>
+                <w:szCs w:val="20"/>
               </w:rPr>
               <w:t>Playing Chess</w:t>
             </w:r>
@@ -2547,20 +2751,20 @@
                 <w:ilvl w:val="0"/>
                 <w:numId w:val="3"/>
               </w:numPr>
-              <w:spacing w:line="252" w:lineRule="auto"/>
+              <w:spacing w:line="240" w:lineRule="auto"/>
               <w:jc w:val="both"/>
               <w:rPr>
                 <w:rFonts w:ascii="Garamond" w:eastAsia="Garamond" w:hAnsi="Garamond" w:cs="Garamond"/>
                 <w:b/>
-                <w:sz w:val="24"/>
-                <w:szCs w:val="24"/>
+                <w:sz w:val="20"/>
+                <w:szCs w:val="20"/>
               </w:rPr>
             </w:pPr>
             <w:r>
               <w:rPr>
                 <w:rFonts w:ascii="Garamond" w:hAnsi="Garamond"/>
-                <w:sz w:val="24"/>
-                <w:szCs w:val="24"/>
+                <w:sz w:val="20"/>
+                <w:szCs w:val="20"/>
               </w:rPr>
               <w:t xml:space="preserve">Enhances </w:t>
             </w:r>
@@ -2569,16 +2773,16 @@
                 <w:rFonts w:ascii="Garamond" w:hAnsi="Garamond"/>
                 <w:b/>
                 <w:bCs/>
-                <w:sz w:val="24"/>
-                <w:szCs w:val="24"/>
+                <w:sz w:val="20"/>
+                <w:szCs w:val="20"/>
               </w:rPr>
               <w:t>strategic thinking</w:t>
             </w:r>
             <w:r>
               <w:rPr>
                 <w:rFonts w:ascii="Garamond" w:hAnsi="Garamond"/>
-                <w:sz w:val="24"/>
-                <w:szCs w:val="24"/>
+                <w:sz w:val="20"/>
+                <w:szCs w:val="20"/>
               </w:rPr>
               <w:t xml:space="preserve"> and helps stay </w:t>
             </w:r>
@@ -2587,16 +2791,16 @@
                 <w:rFonts w:ascii="Garamond" w:hAnsi="Garamond"/>
                 <w:b/>
                 <w:bCs/>
-                <w:sz w:val="24"/>
-                <w:szCs w:val="24"/>
+                <w:sz w:val="20"/>
+                <w:szCs w:val="20"/>
               </w:rPr>
               <w:t>calm</w:t>
             </w:r>
             <w:r>
               <w:rPr>
                 <w:rFonts w:ascii="Garamond" w:hAnsi="Garamond"/>
-                <w:sz w:val="24"/>
-                <w:szCs w:val="24"/>
+                <w:sz w:val="20"/>
+                <w:szCs w:val="20"/>
               </w:rPr>
               <w:t xml:space="preserve"> under pressure.</w:t>
             </w:r>
@@ -2616,7 +2820,7 @@
     <w:sectPr>
       <w:footerReference w:type="default" r:id="rId8"/>
       <w:pgSz w:w="12240" w:h="15840"/>
-      <w:pgMar w:top="0" w:right="1620" w:bottom="2070" w:left="270" w:header="720" w:footer="720" w:gutter="0"/>
+      <w:pgMar w:top="0" w:right="1620" w:bottom="630" w:left="270" w:header="720" w:footer="340" w:gutter="0"/>
       <w:pgNumType w:start="1"/>
       <w:cols w:space="720"/>
     </w:sectPr>
@@ -2665,37 +2869,37 @@
       <w:rPr>
         <w:rFonts w:ascii="Garamond" w:eastAsia="Garamond" w:hAnsi="Garamond" w:cs="Garamond"/>
       </w:rPr>
-      <w:t>Email:</w:t>
+      <w:t>Email: bms25jeet@iimk.ac.in | Phone: +91-93296 41726 | LinkedIn: linkedin.com/in/jeetjhawar | Portfolio: jeetjhawar.github.io | GitHub: github.com/JEETJHAWAR</w:t>
     </w:r>
     <w:r>
       <w:rPr>
         <w:rFonts w:ascii="Garamond" w:eastAsia="Garamond" w:hAnsi="Garamond" w:cs="Garamond"/>
       </w:rPr>
-      <w:t xml:space="preserve"> bms25jeet@iimk.ac.in</w:t>
+      <w:t xml:space="preserve"/>
     </w:r>
     <w:r>
       <w:rPr>
         <w:rFonts w:ascii="Garamond" w:eastAsia="Garamond" w:hAnsi="Garamond" w:cs="Garamond"/>
       </w:rPr>
-      <w:t xml:space="preserve"> | Phone: +91-</w:t>
+      <w:t xml:space="preserve"/>
     </w:r>
     <w:r>
       <w:rPr>
         <w:rFonts w:ascii="Garamond" w:eastAsia="Garamond" w:hAnsi="Garamond" w:cs="Garamond"/>
       </w:rPr>
-      <w:t>9329641726</w:t>
+      <w:t/>
     </w:r>
     <w:r>
       <w:rPr>
         <w:rFonts w:ascii="Garamond" w:eastAsia="Garamond" w:hAnsi="Garamond" w:cs="Garamond"/>
       </w:rPr>
-      <w:t xml:space="preserve"> | LinkedIn Profile: </w:t>
+      <w:t xml:space="preserve"/>
     </w:r>
     <w:r>
       <w:rPr>
         <w:rFonts w:ascii="Garamond" w:eastAsia="Garamond" w:hAnsi="Garamond" w:cs="Garamond"/>
       </w:rPr>
-      <w:t>www.linkedin.com/in/jeetjhawar</w:t>
+      <w:t/>
     </w:r>
   </w:p>
 </w:ftr>

</xml_diff>

<commit_message>
Add SEQUEL 26 numbers to the site and CV
- New work card + popup for SEQUEL 26 (overall lead): 150+ passes,
  ₹1.67 lakh in ticket sales, self-built QR-pass site, P&L in 2 days
- Hero box "₹1.67L — SEQUEL 26 ticket sales"; event-execution popup
  now cites the same numbers; admin knows the new "sequel" popup
- CV (docx + PDF): SEQUEL line with numbers in Initiatives; collapsed
  the stray run of spaces in the Objective line so Word keeps one page

Co-Authored-By: Claude Opus 5.5 <noreply@anthropic.com>
</commit_message>
<xml_diff>
--- a/assets/Jeet_Jhawar_Resume.docx
+++ b/assets/Jeet_Jhawar_Resume.docx
@@ -492,7 +492,7 @@
                 <w:sz w:val="20"/>
                 <w:szCs w:val="20"/>
               </w:rPr>
-              <w:t xml:space="preserve">                                     to realise the great life</w:t>
+              <w:t xml:space="preserve"> to realise the great life</w:t>
             </w:r>
             <w:r>
               <w:t>.</w:t>
@@ -2164,7 +2164,7 @@
                 <w:sz w:val="20"/>
                 <w:szCs w:val="20"/>
               </w:rPr>
-              <w:t xml:space="preserve"> the freshers’ event for the second BMS batch (naming, run-of-show, automated sponsor outreach); fest sponsorship strategy with a 64-organisation tracker and outreach playbook (Nov 2026); a 12-player Swiss-system chess tournament; a weather-alert automation project (Python/Selenium, 200+ Indian cities, WhatsApp broadcast; team of three).</w:t>
+              <w:t xml:space="preserve"> SEQUEL 26, the freshers’ night for the second BMS batch, as overall lead (150+ passes, ₹1.67 lakh in ticket sales via a self-built QR-pass site; P&amp;L closed within 2 days); fest sponsorship strategy with a 64-organisation tracker and outreach playbook (Nov 2026); a 12-player Swiss-system chess tournament; a weather-alert automation project (Python/Selenium, 200+ Indian cities, WhatsApp broadcast; team of three).</w:t>
             </w:r>
           </w:p>
         </w:tc>

</xml_diff>

<commit_message>
CV: competition lines match the certificates
Chess: 2nd, International Chess Day Trophy U-19 (2025); MUN: Special Mention
at MU20 and High Commendation at Sahodaya MUN; Best Performance at Sahodaya
Balvigyan; 2nd at Spandan; NCC 'A' Certificate (A Grade) and 4x100 m relay 2nd.
Still one page in Word (105 lines, same as before).

Co-Authored-By: Claude Opus 5.5 <noreply@anthropic.com>
</commit_message>
<xml_diff>
--- a/assets/Jeet_Jhawar_Resume.docx
+++ b/assets/Jeet_Jhawar_Resume.docx
@@ -1888,7 +1888,7 @@
                 <w:sz w:val="20"/>
                 <w:szCs w:val="20"/>
               </w:rPr>
-              <w:t xml:space="preserve"> 2nd at U-19 State Level (2025); 10th in Under-18 Boys at UICC Trophy (2024).</w:t>
+              <w:t xml:space="preserve"> 2nd, International Chess Day Trophy U-19 (2025); 10th, UICC Trophy U-18 (2024).</w:t>
             </w:r>
           </w:p>
           <w:p>
@@ -1922,7 +1922,7 @@
                 <w:sz w:val="20"/>
                 <w:szCs w:val="20"/>
               </w:rPr>
-              <w:t xml:space="preserve"> Best Delegate at Masters’ Summit MUN (2024 &amp; 2025; ₹15k cash prize); 3rd at ‘MU20 Opportunity Summit 2024’ – AIPPM (International); 2nd at Sahodaya MUN (ECOSOC).</w:t>
+              <w:t xml:space="preserve"> Best Delegate at Masters’ Summit MUN (2024 &amp; 2025; ₹15k cash prize); Special Mention at MU20 Opportunity Summit 2024 – AIPPM; High Commendation at Sahodaya MUN (ECOSOC).</w:t>
             </w:r>
           </w:p>
           <w:p>
@@ -1956,7 +1956,7 @@
                 <w:sz w:val="20"/>
                 <w:szCs w:val="20"/>
               </w:rPr>
-              <w:t xml:space="preserve"> Best Research and Project at Balvigyan – Commerce (Inter-School); won Spandan (GK/Quiz/Debate; ₹3,100 cash prize); 1st in English Debate, English Elocution and Young TV Reporter (school level).</w:t>
+              <w:t xml:space="preserve"> Best Performance at Sahodaya Balvigyan – Commerce (Inter-School); 2nd at Spandan (QA/GK/Debate; ₹3,100 cash prize); 1st in English Debate, English Elocution and Young TV Reporter (school level).</w:t>
             </w:r>
           </w:p>
         </w:tc>
@@ -2289,25 +2289,25 @@
                 <w:sz w:val="20"/>
                 <w:szCs w:val="20"/>
               </w:rPr>
-              <w:t xml:space="preserve">; participated in Inter-School </w:t>
-            </w:r>
-            <w:r>
-              <w:rPr>
-                <w:rFonts w:ascii="Garamond" w:eastAsia="Garamond" w:hAnsi="Garamond" w:cs="Garamond"/>
-                <w:b/>
-                <w:bCs/>
-                <w:sz w:val="20"/>
-                <w:szCs w:val="20"/>
-              </w:rPr>
-              <w:t xml:space="preserve">NCC/Military Training</w:t>
-            </w:r>
-            <w:r>
-              <w:rPr>
-                <w:rFonts w:ascii="Garamond" w:eastAsia="Garamond" w:hAnsi="Garamond" w:cs="Garamond"/>
-                <w:sz w:val="20"/>
-                <w:szCs w:val="20"/>
-              </w:rPr>
-              <w:t xml:space="preserve"> (2023).</w:t>
+              <w:t xml:space="preserve">; </w:t>
+            </w:r>
+            <w:r>
+              <w:rPr>
+                <w:rFonts w:ascii="Garamond" w:eastAsia="Garamond" w:hAnsi="Garamond" w:cs="Garamond"/>
+                <w:b/>
+                <w:bCs/>
+                <w:sz w:val="20"/>
+                <w:szCs w:val="20"/>
+              </w:rPr>
+              <w:t xml:space="preserve">NCC ‘A’ Certificate</w:t>
+            </w:r>
+            <w:r>
+              <w:rPr>
+                <w:rFonts w:ascii="Garamond" w:eastAsia="Garamond" w:hAnsi="Garamond" w:cs="Garamond"/>
+                <w:sz w:val="20"/>
+                <w:szCs w:val="20"/>
+              </w:rPr>
+              <w:t xml:space="preserve"> (A Grade, 2023); 2nd in the 4×100 m relay (school).</w:t>
             </w:r>
           </w:p>
         </w:tc>

</xml_diff>

<commit_message>
2026 chess win as proof; Blind Bluff described as a venture he started
- Add the 2nd International Chess Day Trophy 2026 certificate (1st, Under-20, 6/6)
  to the certificates row, the chess achievement, the hero box, skills and the PDF pack
- Drop "Founder" wording and emphasis: hero eyebrow/badge/description, Blind Bluff
  card, episode and modal, Operations tile, meta tags, admin label
- CV: "Own Venture | Blind Bluff", 3 card games on sale, chess line leads with the 2026 win

Co-Authored-By: Claude Opus 5.5 <noreply@anthropic.com>
</commit_message>
<xml_diff>
--- a/assets/Jeet_Jhawar_Resume.docx
+++ b/assets/Jeet_Jhawar_Resume.docx
@@ -1027,7 +1027,7 @@
                 <w:sz w:val="20"/>
                 <w:szCs w:val="20"/>
               </w:rPr>
-              <w:t xml:space="preserve">Founder | Blind Bluff</w:t>
+              <w:t xml:space="preserve">Own Venture | Blind Bluff</w:t>
             </w:r>
           </w:p>
         </w:tc>
@@ -1091,7 +1091,7 @@
                 <w:sz w:val="20"/>
                 <w:szCs w:val="20"/>
               </w:rPr>
-              <w:t xml:space="preserve">, shipped across India. </w:t>
+              <w:t xml:space="preserve">, shipping across India. </w:t>
             </w:r>
             <w:r>
               <w:rPr>
@@ -1109,7 +1109,7 @@
                 <w:sz w:val="20"/>
                 <w:szCs w:val="20"/>
               </w:rPr>
-              <w:t xml:space="preserve"> with 3 card games selling and 6 titles (incl. 3 murder mysteries) in production; custom mystery nights for private and corporate events.</w:t>
+              <w:t xml:space="preserve"> with 3 card games on sale and 6 titles (incl. 3 murder mysteries) in production; custom mystery nights for private and corporate events.</w:t>
             </w:r>
           </w:p>
         </w:tc>
@@ -1888,7 +1888,7 @@
                 <w:sz w:val="20"/>
                 <w:szCs w:val="20"/>
               </w:rPr>
-              <w:t xml:space="preserve"> 2nd, International Chess Day Trophy U-19 (2025); 10th, UICC Trophy U-18 (2024).</w:t>
+              <w:t xml:space="preserve"> 1st (6/6), International Chess Day Trophy U-20 (2026); 2nd, U-19 (2025).</w:t>
             </w:r>
           </w:p>
           <w:p>

</xml_diff>

<commit_message>
CV: council web app + games up front; Readable readability tool
- CV (one page): Students' Council web app, live guessing game and browser games in
  Projects; AI-assisted development in skills; Objective, Soft Skills and Hobbies removed
- New /readability/: paste text, get a Flesch score and the five hardest sentences highlighted

Co-Authored-By: Claude Opus 5.5 <noreply@anthropic.com>
</commit_message>
<xml_diff>
--- a/assets/Jeet_Jhawar_Resume.docx
+++ b/assets/Jeet_Jhawar_Resume.docx
@@ -15,7 +15,7 @@
     <w:tbl>
       <w:tblPr>
         <w:tblStyle w:val="a"/>
-        <w:tblW w:w="11325" w:type="dxa"/>
+        <w:tblW w:w="11335" w:type="dxa"/>
         <w:tblInd w:w="180" w:type="dxa"/>
         <w:tblBorders>
           <w:top w:val="single" w:sz="8" w:space="0" w:color="000000"/>
@@ -29,16 +29,25 @@
         <w:tblLook w:val="0400" w:firstRow="0" w:lastRow="0" w:firstColumn="0" w:lastColumn="0" w:noHBand="0" w:noVBand="1"/>
       </w:tblPr>
       <w:tblGrid>
-        <w:gridCol w:w="5625"/>
-        <w:gridCol w:w="5700"/>
+        <w:gridCol w:w="10"/>
+        <w:gridCol w:w="1665"/>
+        <w:gridCol w:w="413"/>
+        <w:gridCol w:w="2272"/>
+        <w:gridCol w:w="1265"/>
+        <w:gridCol w:w="4695"/>
+        <w:gridCol w:w="1005"/>
+        <w:gridCol w:w="10"/>
       </w:tblGrid>
       <w:tr>
         <w:trPr>
+          <w:gridAfter w:val="1"/>
+          <w:wAfter w:w="10" w:type="dxa"/>
           <w:trHeight w:val="321"/>
         </w:trPr>
         <w:tc>
           <w:tcPr>
             <w:tcW w:w="5625" w:type="dxa"/>
+            <w:gridSpan w:val="5"/>
             <w:tcBorders>
               <w:top w:val="nil"/>
               <w:left w:val="nil"/>
@@ -70,6 +79,7 @@
         <w:tc>
           <w:tcPr>
             <w:tcW w:w="5700" w:type="dxa"/>
+            <w:gridSpan w:val="2"/>
             <w:tcBorders>
               <w:top w:val="nil"/>
               <w:left w:val="nil"/>
@@ -94,12 +104,14 @@
       </w:tr>
       <w:tr>
         <w:trPr>
+          <w:gridAfter w:val="1"/>
+          <w:wAfter w:w="10" w:type="dxa"/>
           <w:trHeight w:val="67"/>
         </w:trPr>
         <w:tc>
           <w:tcPr>
             <w:tcW w:w="11325" w:type="dxa"/>
-            <w:gridSpan w:val="2"/>
+            <w:gridSpan w:val="7"/>
             <w:tcBorders>
               <w:bottom w:val="single" w:sz="4" w:space="0" w:color="000000"/>
             </w:tcBorders>
@@ -131,12 +143,14 @@
       </w:tr>
       <w:tr>
         <w:trPr>
+          <w:gridAfter w:val="1"/>
+          <w:wAfter w:w="10" w:type="dxa"/>
           <w:trHeight w:val="67"/>
         </w:trPr>
         <w:tc>
           <w:tcPr>
             <w:tcW w:w="11325" w:type="dxa"/>
-            <w:gridSpan w:val="2"/>
+            <w:gridSpan w:val="7"/>
             <w:tcBorders>
               <w:bottom w:val="single" w:sz="4" w:space="0" w:color="000000"/>
             </w:tcBorders>
@@ -155,202 +169,101 @@
             <w:r>
               <w:rPr>
                 <w:rFonts w:ascii="Garamond" w:eastAsia="Garamond" w:hAnsi="Garamond" w:cs="Garamond"/>
-                <w:sz w:val="20"/>
-                <w:szCs w:val="20"/>
-              </w:rPr>
-              <w:t xml:space="preserve">Driven undergraduate student pursuing a </w:t>
-            </w:r>
-            <w:r>
-              <w:rPr>
-                <w:rFonts w:ascii="Garamond" w:eastAsia="Garamond" w:hAnsi="Garamond" w:cs="Garamond"/>
-                <w:b/>
-                <w:bCs/>
-                <w:sz w:val="20"/>
-                <w:szCs w:val="20"/>
-              </w:rPr>
-              <w:t xml:space="preserve">BMS Honours at Indian Institute of Management Kozhikode</w:t>
-            </w:r>
-            <w:r>
-              <w:rPr>
-                <w:rFonts w:ascii="Garamond" w:eastAsia="Garamond" w:hAnsi="Garamond" w:cs="Garamond"/>
-                <w:sz w:val="20"/>
-                <w:szCs w:val="20"/>
-              </w:rPr>
-              <w:t xml:space="preserve"> (95.60% in Class XII), currently building </w:t>
-            </w:r>
-            <w:r>
-              <w:rPr>
-                <w:rFonts w:ascii="Garamond" w:eastAsia="Garamond" w:hAnsi="Garamond" w:cs="Garamond"/>
-                <w:b/>
-                <w:bCs/>
-                <w:sz w:val="20"/>
-                <w:szCs w:val="20"/>
-              </w:rPr>
-              <w:t xml:space="preserve">Blind Bluff</w:t>
-            </w:r>
-            <w:r>
-              <w:rPr>
-                <w:rFonts w:ascii="Garamond" w:eastAsia="Garamond" w:hAnsi="Garamond" w:cs="Garamond"/>
-                <w:sz w:val="20"/>
-                <w:szCs w:val="20"/>
-              </w:rPr>
-              <w:t xml:space="preserve"> (a games brand with a live storefront) alongside roles as </w:t>
-            </w:r>
-            <w:r>
-              <w:rPr>
-                <w:rFonts w:ascii="Garamond" w:eastAsia="Garamond" w:hAnsi="Garamond" w:cs="Garamond"/>
-                <w:b/>
-                <w:bCs/>
-                <w:sz w:val="20"/>
-                <w:szCs w:val="20"/>
-              </w:rPr>
-              <w:t xml:space="preserve">Senior Marketing Manager at NextGenix</w:t>
-            </w:r>
-            <w:r>
-              <w:rPr>
-                <w:rFonts w:ascii="Garamond" w:eastAsia="Garamond" w:hAnsi="Garamond" w:cs="Garamond"/>
-                <w:sz w:val="20"/>
-                <w:szCs w:val="20"/>
-              </w:rPr>
-              <w:t xml:space="preserve">, </w:t>
-            </w:r>
-            <w:r>
-              <w:rPr>
-                <w:rFonts w:ascii="Garamond" w:eastAsia="Garamond" w:hAnsi="Garamond" w:cs="Garamond"/>
-                <w:b/>
-                <w:bCs/>
-                <w:sz w:val="20"/>
-                <w:szCs w:val="20"/>
-              </w:rPr>
-              <w:t xml:space="preserve">HR Intern at Jarurat Care Foundation</w:t>
-            </w:r>
-            <w:r>
-              <w:rPr>
-                <w:rFonts w:ascii="Garamond" w:eastAsia="Garamond" w:hAnsi="Garamond" w:cs="Garamond"/>
-                <w:sz w:val="20"/>
-                <w:szCs w:val="20"/>
-              </w:rPr>
-              <w:t xml:space="preserve"> and </w:t>
-            </w:r>
-            <w:r>
-              <w:rPr>
-                <w:rFonts w:ascii="Garamond" w:eastAsia="Garamond" w:hAnsi="Garamond" w:cs="Garamond"/>
-                <w:b/>
-                <w:bCs/>
-                <w:sz w:val="20"/>
-                <w:szCs w:val="20"/>
-              </w:rPr>
-              <w:t xml:space="preserve">Council Member at IIMK</w:t>
-            </w:r>
-            <w:r>
-              <w:rPr>
-                <w:rFonts w:ascii="Garamond" w:eastAsia="Garamond" w:hAnsi="Garamond" w:cs="Garamond"/>
-                <w:sz w:val="20"/>
-                <w:szCs w:val="20"/>
-              </w:rPr>
-              <w:t xml:space="preserve">. Manages budgets, sponsor pipelines and client relationships; builds small </w:t>
-            </w:r>
-            <w:r>
-              <w:rPr>
-                <w:rFonts w:ascii="Garamond" w:eastAsia="Garamond" w:hAnsi="Garamond" w:cs="Garamond"/>
-                <w:b/>
-                <w:bCs/>
-                <w:sz w:val="20"/>
-                <w:szCs w:val="20"/>
-              </w:rPr>
-              <w:t xml:space="preserve">Python/Selenium and Firebase tools</w:t>
-            </w:r>
-            <w:r>
-              <w:rPr>
-                <w:rFonts w:ascii="Garamond" w:eastAsia="Garamond" w:hAnsi="Garamond" w:cs="Garamond"/>
-                <w:sz w:val="20"/>
-                <w:szCs w:val="20"/>
-              </w:rPr>
-              <w:t xml:space="preserve"> to automate outreach and operations; passionate about </w:t>
-            </w:r>
-            <w:r>
-              <w:rPr>
-                <w:rFonts w:ascii="Garamond" w:eastAsia="Garamond" w:hAnsi="Garamond" w:cs="Garamond"/>
-                <w:b/>
-                <w:bCs/>
-                <w:sz w:val="20"/>
-                <w:szCs w:val="20"/>
-              </w:rPr>
-              <w:t xml:space="preserve">entrepreneurship</w:t>
-            </w:r>
-            <w:r>
-              <w:rPr>
-                <w:rFonts w:ascii="Garamond" w:eastAsia="Garamond" w:hAnsi="Garamond" w:cs="Garamond"/>
-                <w:sz w:val="20"/>
-                <w:szCs w:val="20"/>
-              </w:rPr>
-              <w:t xml:space="preserve">, </w:t>
-            </w:r>
-            <w:r>
-              <w:rPr>
-                <w:rFonts w:ascii="Garamond" w:eastAsia="Garamond" w:hAnsi="Garamond" w:cs="Garamond"/>
-                <w:b/>
-                <w:bCs/>
-                <w:sz w:val="20"/>
-                <w:szCs w:val="20"/>
-              </w:rPr>
-              <w:t xml:space="preserve">problem-solving</w:t>
-            </w:r>
-            <w:r>
-              <w:rPr>
-                <w:rFonts w:ascii="Garamond" w:eastAsia="Garamond" w:hAnsi="Garamond" w:cs="Garamond"/>
-                <w:sz w:val="20"/>
-                <w:szCs w:val="20"/>
-              </w:rPr>
-              <w:t xml:space="preserve"> and creating </w:t>
-            </w:r>
-            <w:r>
-              <w:rPr>
-                <w:rFonts w:ascii="Garamond" w:eastAsia="Garamond" w:hAnsi="Garamond" w:cs="Garamond"/>
-                <w:b/>
-                <w:bCs/>
-                <w:sz w:val="20"/>
-                <w:szCs w:val="20"/>
-              </w:rPr>
-              <w:t xml:space="preserve">positive societal impact</w:t>
-            </w:r>
-            <w:r>
-              <w:rPr>
-                <w:rFonts w:ascii="Garamond" w:eastAsia="Garamond" w:hAnsi="Garamond" w:cs="Garamond"/>
-                <w:sz w:val="20"/>
-                <w:szCs w:val="20"/>
-              </w:rPr>
-              <w:t xml:space="preserve">.</w:t>
+                <w:b/>
+                <w:sz w:val="20"/>
+                <w:szCs w:val="20"/>
+              </w:rPr>
+              <w:t>BMS (Honours)</w:t>
+            </w:r>
+            <w:r>
+              <w:rPr>
+                <w:rFonts w:ascii="Garamond" w:eastAsia="Garamond" w:hAnsi="Garamond" w:cs="Garamond"/>
+                <w:sz w:val="20"/>
+                <w:szCs w:val="20"/>
+              </w:rPr>
+              <w:t xml:space="preserve"> student at </w:t>
+            </w:r>
+            <w:r>
+              <w:rPr>
+                <w:rFonts w:ascii="Garamond" w:eastAsia="Garamond" w:hAnsi="Garamond" w:cs="Garamond"/>
+                <w:b/>
+                <w:sz w:val="20"/>
+                <w:szCs w:val="20"/>
+              </w:rPr>
+              <w:t>IIM Kozhikode</w:t>
+            </w:r>
+            <w:r>
+              <w:rPr>
+                <w:rFonts w:ascii="Garamond" w:eastAsia="Garamond" w:hAnsi="Garamond" w:cs="Garamond"/>
+                <w:sz w:val="20"/>
+                <w:szCs w:val="20"/>
+              </w:rPr>
+              <w:t xml:space="preserve"> (95.60% in Class XII) who builds things people use: the </w:t>
+            </w:r>
+            <w:r>
+              <w:rPr>
+                <w:rFonts w:ascii="Garamond" w:eastAsia="Garamond" w:hAnsi="Garamond" w:cs="Garamond"/>
+                <w:b/>
+                <w:sz w:val="20"/>
+                <w:szCs w:val="20"/>
+              </w:rPr>
+              <w:t>Students' Council web app</w:t>
+            </w:r>
+            <w:r>
+              <w:rPr>
+                <w:rFonts w:ascii="Garamond" w:eastAsia="Garamond" w:hAnsi="Garamond" w:cs="Garamond"/>
+                <w:sz w:val="20"/>
+                <w:szCs w:val="20"/>
+              </w:rPr>
+              <w:t xml:space="preserve">, a QR-pass ticketing site and live browser games, all built with </w:t>
+            </w:r>
+            <w:r>
+              <w:rPr>
+                <w:rFonts w:ascii="Garamond" w:eastAsia="Garamond" w:hAnsi="Garamond" w:cs="Garamond"/>
+                <w:b/>
+                <w:sz w:val="20"/>
+                <w:szCs w:val="20"/>
+              </w:rPr>
+              <w:t>AI coding tools</w:t>
+            </w:r>
+            <w:r>
+              <w:rPr>
+                <w:rFonts w:ascii="Garamond" w:eastAsia="Garamond" w:hAnsi="Garamond" w:cs="Garamond"/>
+                <w:sz w:val="20"/>
+                <w:szCs w:val="20"/>
+              </w:rPr>
+              <w:t xml:space="preserve">. </w:t>
+            </w:r>
+            <w:r>
+              <w:rPr>
+                <w:rFonts w:ascii="Garamond" w:eastAsia="Garamond" w:hAnsi="Garamond" w:cs="Garamond"/>
+                <w:b/>
+                <w:sz w:val="20"/>
+                <w:szCs w:val="20"/>
+              </w:rPr>
+              <w:t>Senior Marketing Manager</w:t>
+            </w:r>
+            <w:r>
+              <w:rPr>
+                <w:rFonts w:ascii="Garamond" w:eastAsia="Garamond" w:hAnsi="Garamond" w:cs="Garamond"/>
+                <w:sz w:val="20"/>
+                <w:szCs w:val="20"/>
+              </w:rPr>
+              <w:t xml:space="preserve"> at NextGenix, HR Intern at Jarurat Care Foundation and Council Member at IIMK; also started Blind Bluff, a small games brand. Comfortable with budgets, sponsor pipelines, sales and taking an idea to a live product.</w:t>
             </w:r>
           </w:p>
         </w:tc>
       </w:tr>
-    </w:tbl>
-    <w:tbl>
-      <w:tblPr>
-        <w:tblW w:w="11325" w:type="dxa"/>
-        <w:tblInd w:w="180" w:type="dxa"/>
-        <w:tblBorders>
-          <w:top w:val="single" w:sz="8" w:space="0" w:color="000000"/>
-          <w:left w:val="single" w:sz="8" w:space="0" w:color="000000"/>
-          <w:bottom w:val="single" w:sz="8" w:space="0" w:color="000000"/>
-          <w:right w:val="single" w:sz="8" w:space="0" w:color="000000"/>
-          <w:insideH w:val="single" w:sz="4" w:space="0" w:color="000000"/>
-          <w:insideV w:val="single" w:sz="4" w:space="0" w:color="000000"/>
-        </w:tblBorders>
-        <w:tblLayout w:type="fixed"/>
-        <w:tblLook w:val="0400" w:firstRow="0" w:lastRow="0" w:firstColumn="0" w:lastColumn="0" w:noHBand="0" w:noVBand="1"/>
-      </w:tblPr>
-      <w:tblGrid>
-        <w:gridCol w:w="11325"/>
-      </w:tblGrid>
       <w:tr>
         <w:trPr>
+          <w:gridBefore w:val="1"/>
+          <w:wBefore w:w="10" w:type="dxa"/>
           <w:trHeight w:val="67"/>
         </w:trPr>
         <w:tc>
           <w:tcPr>
             <w:tcW w:w="11325" w:type="dxa"/>
+            <w:gridSpan w:val="7"/>
             <w:tcBorders>
               <w:top w:val="single" w:sz="4" w:space="0" w:color="000000"/>
             </w:tcBorders>
@@ -360,186 +273,31 @@
           <w:p>
             <w:pPr>
               <w:spacing w:line="240" w:lineRule="auto"/>
+              <w:ind w:left="360"/>
               <w:jc w:val="center"/>
               <w:rPr>
                 <w:rFonts w:ascii="Garamond" w:eastAsia="Garamond" w:hAnsi="Garamond" w:cs="Garamond"/>
                 <w:b/>
-                <w:color w:val="000000"/>
-                <w:sz w:val="20"/>
-                <w:szCs w:val="20"/>
-              </w:rPr>
-            </w:pPr>
-            <w:r>
-              <w:rPr>
-                <w:rFonts w:ascii="Garamond" w:hAnsi="Garamond"/>
-                <w:b/>
-                <w:bCs/>
-                <w:sz w:val="20"/>
-                <w:szCs w:val="20"/>
-              </w:rPr>
-              <w:t>Objective</w:t>
-            </w:r>
-          </w:p>
-        </w:tc>
-      </w:tr>
-    </w:tbl>
-    <w:tbl>
-      <w:tblPr>
-        <w:tblStyle w:val="a"/>
-        <w:tblW w:w="11325" w:type="dxa"/>
-        <w:tblInd w:w="180" w:type="dxa"/>
-        <w:tblBorders>
-          <w:top w:val="single" w:sz="8" w:space="0" w:color="000000"/>
-          <w:left w:val="single" w:sz="8" w:space="0" w:color="000000"/>
-          <w:bottom w:val="single" w:sz="8" w:space="0" w:color="000000"/>
-          <w:right w:val="single" w:sz="8" w:space="0" w:color="000000"/>
-          <w:insideH w:val="single" w:sz="4" w:space="0" w:color="000000"/>
-          <w:insideV w:val="single" w:sz="4" w:space="0" w:color="000000"/>
-        </w:tblBorders>
-        <w:tblLayout w:type="fixed"/>
-        <w:tblLook w:val="0400" w:firstRow="0" w:lastRow="0" w:firstColumn="0" w:lastColumn="0" w:noHBand="0" w:noVBand="1"/>
-      </w:tblPr>
-      <w:tblGrid>
-        <w:gridCol w:w="1665"/>
-        <w:gridCol w:w="413"/>
-        <w:gridCol w:w="2272"/>
-        <w:gridCol w:w="5960"/>
-        <w:gridCol w:w="982"/>
-        <w:gridCol w:w="33"/>
-      </w:tblGrid>
-      <w:tr>
-        <w:trPr>
-          <w:gridAfter w:val="1"/>
-          <w:wAfter w:w="33" w:type="dxa"/>
-          <w:trHeight w:val="67"/>
-        </w:trPr>
-        <w:tc>
-          <w:tcPr>
-            <w:tcW w:w="11292" w:type="dxa"/>
-            <w:gridSpan w:val="5"/>
-            <w:tcBorders>
-              <w:bottom w:val="single" w:sz="4" w:space="0" w:color="000000"/>
-            </w:tcBorders>
-            <w:shd w:val="clear" w:color="auto" w:fill="FFFFFF"/>
-            <w:vAlign w:val="center"/>
-          </w:tcPr>
-          <w:p>
-            <w:pPr>
-              <w:spacing w:line="240" w:lineRule="auto"/>
-              <w:rPr>
-                <w:rFonts w:ascii="Garamond" w:eastAsia="Garamond" w:hAnsi="Garamond" w:cs="Garamond"/>
-                <w:sz w:val="20"/>
-                <w:szCs w:val="20"/>
-              </w:rPr>
-            </w:pPr>
-            <w:r>
-              <w:rPr>
-                <w:rFonts w:ascii="Garamond" w:hAnsi="Garamond"/>
-                <w:sz w:val="20"/>
-                <w:szCs w:val="20"/>
-              </w:rPr>
-              <w:t xml:space="preserve">My Objective in life is to continuously </w:t>
-            </w:r>
-            <w:r>
-              <w:rPr>
-                <w:rFonts w:ascii="Garamond" w:hAnsi="Garamond"/>
-                <w:b/>
-                <w:bCs/>
-                <w:sz w:val="20"/>
-                <w:szCs w:val="20"/>
-              </w:rPr>
-              <w:t>acquire knowledge</w:t>
-            </w:r>
-            <w:r>
-              <w:rPr>
-                <w:rFonts w:ascii="Garamond" w:hAnsi="Garamond"/>
-                <w:sz w:val="20"/>
-                <w:szCs w:val="20"/>
-              </w:rPr>
-              <w:t xml:space="preserve">, </w:t>
-            </w:r>
-            <w:r>
-              <w:rPr>
-                <w:rFonts w:ascii="Garamond" w:hAnsi="Garamond"/>
-                <w:b/>
-                <w:bCs/>
-                <w:sz w:val="20"/>
-                <w:szCs w:val="20"/>
-              </w:rPr>
-              <w:t>work diligently</w:t>
-            </w:r>
-            <w:r>
-              <w:rPr>
-                <w:rFonts w:ascii="Garamond" w:hAnsi="Garamond"/>
-                <w:sz w:val="20"/>
-                <w:szCs w:val="20"/>
-              </w:rPr>
-              <w:t xml:space="preserve">, and have </w:t>
-            </w:r>
-            <w:r>
-              <w:rPr>
-                <w:rFonts w:ascii="Garamond" w:hAnsi="Garamond"/>
-                <w:b/>
-                <w:bCs/>
-                <w:sz w:val="20"/>
-                <w:szCs w:val="20"/>
-              </w:rPr>
-              <w:t>perseverance</w:t>
-            </w:r>
-            <w:r>
-              <w:rPr>
-                <w:rFonts w:ascii="Garamond" w:hAnsi="Garamond"/>
-                <w:sz w:val="20"/>
-                <w:szCs w:val="20"/>
-              </w:rPr>
-              <w:t xml:space="preserve"> to realise the great life</w:t>
-            </w:r>
-            <w:r>
-              <w:t>.</w:t>
+                <w:sz w:val="26"/>
+                <w:szCs w:val="26"/>
+              </w:rPr>
+            </w:pPr>
+            <w:r>
+              <w:rPr>
+                <w:rFonts w:ascii="Garamond" w:eastAsia="Garamond" w:hAnsi="Garamond" w:cs="Garamond"/>
+                <w:b/>
+                <w:sz w:val="26"/>
+                <w:szCs w:val="26"/>
+              </w:rPr>
+              <w:t>ACADEMIC QUALIFICATIONS</w:t>
             </w:r>
           </w:p>
         </w:tc>
       </w:tr>
       <w:tr>
         <w:trPr>
-          <w:trHeight w:val="67"/>
-        </w:trPr>
-        <w:tc>
-          <w:tcPr>
-            <w:tcW w:w="11325" w:type="dxa"/>
-            <w:gridSpan w:val="6"/>
-            <w:tcBorders>
-              <w:top w:val="single" w:sz="4" w:space="0" w:color="000000"/>
-            </w:tcBorders>
-            <w:shd w:val="clear" w:color="auto" w:fill="BFBFBF"/>
-            <w:vAlign w:val="center"/>
-          </w:tcPr>
-          <w:p>
-            <w:pPr>
-              <w:spacing w:line="240" w:lineRule="auto"/>
-              <w:ind w:left="360"/>
-              <w:jc w:val="center"/>
-              <w:rPr>
-                <w:rFonts w:ascii="Garamond" w:eastAsia="Garamond" w:hAnsi="Garamond" w:cs="Garamond"/>
-                <w:b/>
-                <w:sz w:val="26"/>
-                <w:szCs w:val="26"/>
-              </w:rPr>
-            </w:pPr>
-            <w:r>
-              <w:rPr>
-                <w:rFonts w:ascii="Garamond" w:eastAsia="Garamond" w:hAnsi="Garamond" w:cs="Garamond"/>
-                <w:b/>
-                <w:sz w:val="26"/>
-                <w:szCs w:val="26"/>
-              </w:rPr>
-              <w:t>ACADEMIC QUALIFICATIONS</w:t>
-            </w:r>
-          </w:p>
-        </w:tc>
-      </w:tr>
-      <w:tr>
-        <w:trPr>
+          <w:gridBefore w:val="1"/>
+          <w:wBefore w:w="10" w:type="dxa"/>
           <w:trHeight w:val="308"/>
         </w:trPr>
         <w:tc>
@@ -602,6 +360,7 @@
         <w:tc>
           <w:tcPr>
             <w:tcW w:w="5960" w:type="dxa"/>
+            <w:gridSpan w:val="2"/>
             <w:shd w:val="clear" w:color="auto" w:fill="D9D9D9"/>
             <w:vAlign w:val="center"/>
           </w:tcPr>
@@ -659,6 +418,8 @@
       </w:tr>
       <w:tr>
         <w:trPr>
+          <w:gridBefore w:val="1"/>
+          <w:wBefore w:w="10" w:type="dxa"/>
           <w:trHeight w:val="67"/>
         </w:trPr>
         <w:tc>
@@ -713,6 +474,7 @@
         <w:tc>
           <w:tcPr>
             <w:tcW w:w="5960" w:type="dxa"/>
+            <w:gridSpan w:val="2"/>
           </w:tcPr>
           <w:p>
             <w:pPr>
@@ -730,7 +492,7 @@
                 <w:sz w:val="20"/>
                 <w:szCs w:val="20"/>
               </w:rPr>
-              <w:t xml:space="preserve">Indian Institute of Management Kozhikode</w:t>
+              <w:t>Indian Institute of Management Kozhikode</w:t>
             </w:r>
           </w:p>
         </w:tc>
@@ -762,6 +524,8 @@
       </w:tr>
       <w:tr>
         <w:trPr>
+          <w:gridBefore w:val="1"/>
+          <w:wBefore w:w="10" w:type="dxa"/>
           <w:trHeight w:val="67"/>
         </w:trPr>
         <w:tc>
@@ -816,6 +580,7 @@
         <w:tc>
           <w:tcPr>
             <w:tcW w:w="5960" w:type="dxa"/>
+            <w:gridSpan w:val="2"/>
           </w:tcPr>
           <w:p>
             <w:pPr>
@@ -865,6 +630,8 @@
       </w:tr>
       <w:tr>
         <w:trPr>
+          <w:gridBefore w:val="1"/>
+          <w:wBefore w:w="10" w:type="dxa"/>
           <w:trHeight w:val="67"/>
         </w:trPr>
         <w:tc>
@@ -919,6 +686,7 @@
         <w:tc>
           <w:tcPr>
             <w:tcW w:w="5960" w:type="dxa"/>
+            <w:gridSpan w:val="2"/>
           </w:tcPr>
           <w:p>
             <w:pPr>
@@ -968,12 +736,14 @@
       </w:tr>
       <w:tr>
         <w:trPr>
+          <w:gridBefore w:val="1"/>
+          <w:wBefore w:w="10" w:type="dxa"/>
           <w:trHeight w:val="67"/>
         </w:trPr>
         <w:tc>
           <w:tcPr>
             <w:tcW w:w="11325" w:type="dxa"/>
-            <w:gridSpan w:val="6"/>
+            <w:gridSpan w:val="7"/>
             <w:shd w:val="clear" w:color="auto" w:fill="BFBFBF"/>
             <w:vAlign w:val="center"/>
           </w:tcPr>
@@ -1001,6 +771,10 @@
         </w:tc>
       </w:tr>
       <w:tr>
+        <w:trPr>
+          <w:gridBefore w:val="1"/>
+          <w:wBefore w:w="10" w:type="dxa"/>
+        </w:trPr>
         <w:tc>
           <w:tcPr>
             <w:tcW w:w="2078" w:type="dxa"/>
@@ -1027,14 +801,14 @@
                 <w:sz w:val="20"/>
                 <w:szCs w:val="20"/>
               </w:rPr>
-              <w:t xml:space="preserve">Own Venture | Blind Bluff</w:t>
+              <w:t>Own Venture | Blind Bluff</w:t>
             </w:r>
           </w:p>
         </w:tc>
         <w:tc>
           <w:tcPr>
             <w:tcW w:w="8232" w:type="dxa"/>
-            <w:gridSpan w:val="2"/>
+            <w:gridSpan w:val="3"/>
             <w:tcBorders>
               <w:right w:val="nil"/>
             </w:tcBorders>
@@ -1055,61 +829,58 @@
                 <w:sz w:val="20"/>
                 <w:szCs w:val="20"/>
               </w:rPr>
-              <w:t xml:space="preserve">Building </w:t>
-            </w:r>
-            <w:r>
-              <w:rPr>
-                <w:rFonts w:ascii="Garamond" w:eastAsia="Garamond" w:hAnsi="Garamond" w:cs="Garamond"/>
-                <w:b/>
-                <w:bCs/>
-                <w:sz w:val="20"/>
-                <w:szCs w:val="20"/>
-              </w:rPr>
-              <w:t xml:space="preserve">Blind Bluff (blindbluff.com)</w:t>
-            </w:r>
-            <w:r>
-              <w:rPr>
-                <w:rFonts w:ascii="Garamond" w:eastAsia="Garamond" w:hAnsi="Garamond" w:cs="Garamond"/>
-                <w:sz w:val="20"/>
-                <w:szCs w:val="20"/>
-              </w:rPr>
-              <w:t xml:space="preserve"> — a Kochi-based brand making </w:t>
-            </w:r>
-            <w:r>
-              <w:rPr>
-                <w:rFonts w:ascii="Garamond" w:eastAsia="Garamond" w:hAnsi="Garamond" w:cs="Garamond"/>
-                <w:b/>
-                <w:bCs/>
-                <w:sz w:val="20"/>
-                <w:szCs w:val="20"/>
-              </w:rPr>
-              <w:t xml:space="preserve">murder mystery, card and party games</w:t>
-            </w:r>
-            <w:r>
-              <w:rPr>
-                <w:rFonts w:ascii="Garamond" w:eastAsia="Garamond" w:hAnsi="Garamond" w:cs="Garamond"/>
-                <w:sz w:val="20"/>
-                <w:szCs w:val="20"/>
-              </w:rPr>
-              <w:t xml:space="preserve">, shipping across India. </w:t>
-            </w:r>
-            <w:r>
-              <w:rPr>
-                <w:rFonts w:ascii="Garamond" w:eastAsia="Garamond" w:hAnsi="Garamond" w:cs="Garamond"/>
-                <w:b/>
-                <w:bCs/>
-                <w:sz w:val="20"/>
-                <w:szCs w:val="20"/>
-              </w:rPr>
-              <w:t xml:space="preserve">Live storefront</w:t>
-            </w:r>
-            <w:r>
-              <w:rPr>
-                <w:rFonts w:ascii="Garamond" w:eastAsia="Garamond" w:hAnsi="Garamond" w:cs="Garamond"/>
-                <w:sz w:val="20"/>
-                <w:szCs w:val="20"/>
-              </w:rPr>
-              <w:t xml:space="preserve"> with 3 card games on sale and 6 titles (incl. 3 murder mysteries) in production; custom mystery nights for private and corporate events.</w:t>
+              <w:t xml:space="preserve">Started </w:t>
+            </w:r>
+            <w:r>
+              <w:rPr>
+                <w:rFonts w:ascii="Garamond" w:eastAsia="Garamond" w:hAnsi="Garamond" w:cs="Garamond"/>
+                <w:b/>
+                <w:sz w:val="20"/>
+                <w:szCs w:val="20"/>
+              </w:rPr>
+              <w:t>Blind Bluff (blindbluff.com)</w:t>
+            </w:r>
+            <w:r>
+              <w:rPr>
+                <w:rFonts w:ascii="Garamond" w:eastAsia="Garamond" w:hAnsi="Garamond" w:cs="Garamond"/>
+                <w:sz w:val="20"/>
+                <w:szCs w:val="20"/>
+              </w:rPr>
+              <w:t xml:space="preserve">, a small Kochi-based brand making murder mystery, card and party games, shipping across India: </w:t>
+            </w:r>
+            <w:r>
+              <w:rPr>
+                <w:rFonts w:ascii="Garamond" w:eastAsia="Garamond" w:hAnsi="Garamond" w:cs="Garamond"/>
+                <w:b/>
+                <w:sz w:val="20"/>
+                <w:szCs w:val="20"/>
+              </w:rPr>
+              <w:t>3 card games on sale</w:t>
+            </w:r>
+            <w:r>
+              <w:rPr>
+                <w:rFonts w:ascii="Garamond" w:eastAsia="Garamond" w:hAnsi="Garamond" w:cs="Garamond"/>
+                <w:sz w:val="20"/>
+                <w:szCs w:val="20"/>
+              </w:rPr>
+              <w:t xml:space="preserve">, </w:t>
+            </w:r>
+            <w:r>
+              <w:rPr>
+                <w:rFonts w:ascii="Garamond" w:eastAsia="Garamond" w:hAnsi="Garamond" w:cs="Garamond"/>
+                <w:b/>
+                <w:sz w:val="20"/>
+                <w:szCs w:val="20"/>
+              </w:rPr>
+              <w:t>6 titles in production</w:t>
+            </w:r>
+            <w:r>
+              <w:rPr>
+                <w:rFonts w:ascii="Garamond" w:eastAsia="Garamond" w:hAnsi="Garamond" w:cs="Garamond"/>
+                <w:sz w:val="20"/>
+                <w:szCs w:val="20"/>
+              </w:rPr>
+              <w:t>; custom mystery nights for private and corporate events.</w:t>
             </w:r>
           </w:p>
         </w:tc>
@@ -1139,12 +910,16 @@
                 <w:sz w:val="20"/>
                 <w:szCs w:val="20"/>
               </w:rPr>
-              <w:t xml:space="preserve">2026 – Present</w:t>
+              <w:t>2026 – Present</w:t>
             </w:r>
           </w:p>
         </w:tc>
       </w:tr>
       <w:tr>
+        <w:trPr>
+          <w:gridBefore w:val="1"/>
+          <w:wBefore w:w="10" w:type="dxa"/>
+        </w:trPr>
         <w:tc>
           <w:tcPr>
             <w:tcW w:w="2078" w:type="dxa"/>
@@ -1171,14 +946,14 @@
                 <w:sz w:val="20"/>
                 <w:szCs w:val="20"/>
               </w:rPr>
-              <w:t xml:space="preserve">Senior Marketing Manager | NextGenix</w:t>
+              <w:t>Senior Marketing Manager | NextGenix</w:t>
             </w:r>
           </w:p>
         </w:tc>
         <w:tc>
           <w:tcPr>
             <w:tcW w:w="8232" w:type="dxa"/>
-            <w:gridSpan w:val="2"/>
+            <w:gridSpan w:val="3"/>
             <w:tcBorders>
               <w:right w:val="nil"/>
             </w:tcBorders>
@@ -1201,7 +976,7 @@
                 <w:sz w:val="20"/>
                 <w:szCs w:val="20"/>
               </w:rPr>
-              <w:t xml:space="preserve">Lead a sales team</w:t>
+              <w:t>Lead a sales team</w:t>
             </w:r>
             <w:r>
               <w:rPr>
@@ -1219,7 +994,7 @@
                 <w:sz w:val="20"/>
                 <w:szCs w:val="20"/>
               </w:rPr>
-              <w:t xml:space="preserve">client relationships</w:t>
+              <w:t>client relationships</w:t>
             </w:r>
             <w:r>
               <w:rPr>
@@ -1237,7 +1012,7 @@
                 <w:sz w:val="20"/>
                 <w:szCs w:val="20"/>
               </w:rPr>
-              <w:t xml:space="preserve">campaign execution</w:t>
+              <w:t>campaign execution</w:t>
             </w:r>
             <w:r>
               <w:rPr>
@@ -1255,15 +1030,15 @@
                 <w:sz w:val="20"/>
                 <w:szCs w:val="20"/>
               </w:rPr>
-              <w:t xml:space="preserve">sales strategy and client servicing</w:t>
-            </w:r>
-            <w:r>
-              <w:rPr>
-                <w:rFonts w:ascii="Garamond" w:eastAsia="Garamond" w:hAnsi="Garamond" w:cs="Garamond"/>
-                <w:sz w:val="20"/>
-                <w:szCs w:val="20"/>
-              </w:rPr>
-              <w:t xml:space="preserve">.</w:t>
+              <w:t>sales strategy and client servicing</w:t>
+            </w:r>
+            <w:r>
+              <w:rPr>
+                <w:rFonts w:ascii="Garamond" w:eastAsia="Garamond" w:hAnsi="Garamond" w:cs="Garamond"/>
+                <w:sz w:val="20"/>
+                <w:szCs w:val="20"/>
+              </w:rPr>
+              <w:t>.</w:t>
             </w:r>
           </w:p>
         </w:tc>
@@ -1293,12 +1068,16 @@
                 <w:sz w:val="20"/>
                 <w:szCs w:val="20"/>
               </w:rPr>
-              <w:t xml:space="preserve">Jul 2026 – Present</w:t>
+              <w:t>Jul 2026 – Present</w:t>
             </w:r>
           </w:p>
         </w:tc>
       </w:tr>
       <w:tr>
+        <w:trPr>
+          <w:gridBefore w:val="1"/>
+          <w:wBefore w:w="10" w:type="dxa"/>
+        </w:trPr>
         <w:tc>
           <w:tcPr>
             <w:tcW w:w="2078" w:type="dxa"/>
@@ -1325,14 +1104,14 @@
                 <w:sz w:val="20"/>
                 <w:szCs w:val="20"/>
               </w:rPr>
-              <w:t xml:space="preserve">HR Intern | Jarurat Care Foundation</w:t>
+              <w:t>HR Intern | Jarurat Care Foundation</w:t>
             </w:r>
           </w:p>
         </w:tc>
         <w:tc>
           <w:tcPr>
             <w:tcW w:w="8232" w:type="dxa"/>
-            <w:gridSpan w:val="2"/>
+            <w:gridSpan w:val="3"/>
             <w:tcBorders>
               <w:right w:val="nil"/>
             </w:tcBorders>
@@ -1355,33 +1134,35 @@
                 <w:sz w:val="20"/>
                 <w:szCs w:val="20"/>
               </w:rPr>
-              <w:t xml:space="preserve">Support HR operations</w:t>
-            </w:r>
-            <w:r>
-              <w:rPr>
-                <w:rFonts w:ascii="Garamond" w:eastAsia="Garamond" w:hAnsi="Garamond" w:cs="Garamond"/>
-                <w:sz w:val="20"/>
-                <w:szCs w:val="20"/>
-              </w:rPr>
-              <w:t xml:space="preserve"> — candidate coordination, interview scheduling and confirmations — at a healthcare NGO supporting </w:t>
-            </w:r>
-            <w:r>
-              <w:rPr>
-                <w:rFonts w:ascii="Garamond" w:eastAsia="Garamond" w:hAnsi="Garamond" w:cs="Garamond"/>
-                <w:b/>
-                <w:bCs/>
-                <w:sz w:val="20"/>
-                <w:szCs w:val="20"/>
-              </w:rPr>
-              <w:t xml:space="preserve">cancer patients and caregivers</w:t>
-            </w:r>
-            <w:r>
-              <w:rPr>
-                <w:rFonts w:ascii="Garamond" w:eastAsia="Garamond" w:hAnsi="Garamond" w:cs="Garamond"/>
-                <w:sz w:val="20"/>
-                <w:szCs w:val="20"/>
-              </w:rPr>
-              <w:t xml:space="preserve"> across India.</w:t>
+              <w:t>HR operations</w:t>
+            </w:r>
+            <w:r>
+              <w:rPr>
+                <w:rFonts w:ascii="Garamond" w:eastAsia="Garamond" w:hAnsi="Garamond" w:cs="Garamond"/>
+                <w:bCs/>
+                <w:sz w:val="20"/>
+                <w:szCs w:val="20"/>
+              </w:rPr>
+              <w:t xml:space="preserve"> at a cancer-care NGO (candidate coordination, interview scheduling); built a </w:t>
+            </w:r>
+            <w:r>
+              <w:rPr>
+                <w:rFonts w:ascii="Garamond" w:eastAsia="Garamond" w:hAnsi="Garamond" w:cs="Garamond"/>
+                <w:b/>
+                <w:bCs/>
+                <w:sz w:val="20"/>
+                <w:szCs w:val="20"/>
+              </w:rPr>
+              <w:t>Python/Selenium WhatsApp bot</w:t>
+            </w:r>
+            <w:r>
+              <w:rPr>
+                <w:rFonts w:ascii="Garamond" w:eastAsia="Garamond" w:hAnsi="Garamond" w:cs="Garamond"/>
+                <w:bCs/>
+                <w:sz w:val="20"/>
+                <w:szCs w:val="20"/>
+              </w:rPr>
+              <w:t xml:space="preserve"> that sends interview confirmations automatically.</w:t>
             </w:r>
           </w:p>
         </w:tc>
@@ -1411,19 +1192,21 @@
                 <w:sz w:val="20"/>
                 <w:szCs w:val="20"/>
               </w:rPr>
-              <w:t xml:space="preserve">Jul – Oct 2026</w:t>
+              <w:t>Jul – Oct 2026</w:t>
             </w:r>
           </w:p>
         </w:tc>
       </w:tr>
       <w:tr>
         <w:trPr>
+          <w:gridBefore w:val="1"/>
+          <w:wBefore w:w="10" w:type="dxa"/>
           <w:trHeight w:val="67"/>
         </w:trPr>
         <w:tc>
           <w:tcPr>
             <w:tcW w:w="11325" w:type="dxa"/>
-            <w:gridSpan w:val="6"/>
+            <w:gridSpan w:val="7"/>
             <w:shd w:val="clear" w:color="auto" w:fill="BFBFBF"/>
             <w:vAlign w:val="center"/>
           </w:tcPr>
@@ -1452,6 +1235,8 @@
       </w:tr>
       <w:tr>
         <w:trPr>
+          <w:gridBefore w:val="1"/>
+          <w:wBefore w:w="10" w:type="dxa"/>
           <w:trHeight w:val="67"/>
         </w:trPr>
         <w:tc>
@@ -1486,7 +1271,7 @@
         <w:tc>
           <w:tcPr>
             <w:tcW w:w="8232" w:type="dxa"/>
-            <w:gridSpan w:val="2"/>
+            <w:gridSpan w:val="3"/>
             <w:tcBorders>
               <w:right w:val="nil"/>
             </w:tcBorders>
@@ -1509,7 +1294,7 @@
                 <w:sz w:val="20"/>
                 <w:szCs w:val="20"/>
               </w:rPr>
-              <w:t xml:space="preserve">Spearhead end-to-end logistics</w:t>
+              <w:t>Spearhead end-to-end logistics</w:t>
             </w:r>
             <w:r>
               <w:rPr>
@@ -1527,7 +1312,7 @@
                 <w:sz w:val="20"/>
                 <w:szCs w:val="20"/>
               </w:rPr>
-              <w:t xml:space="preserve">manage committee budgets</w:t>
+              <w:t>manage committee budgets</w:t>
             </w:r>
             <w:r>
               <w:rPr>
@@ -1545,7 +1330,7 @@
                 <w:sz w:val="20"/>
                 <w:szCs w:val="20"/>
               </w:rPr>
-              <w:t xml:space="preserve">100+ contact B2B sponsor outreach pipeline</w:t>
+              <w:t>100+ contact B2B sponsor outreach pipeline</w:t>
             </w:r>
             <w:r>
               <w:rPr>
@@ -1563,7 +1348,7 @@
                 <w:sz w:val="20"/>
                 <w:szCs w:val="20"/>
               </w:rPr>
-              <w:t xml:space="preserve">P&amp;L</w:t>
+              <w:t>P&amp;L</w:t>
             </w:r>
             <w:r>
               <w:rPr>
@@ -1581,7 +1366,7 @@
                 <w:sz w:val="20"/>
                 <w:szCs w:val="20"/>
               </w:rPr>
-              <w:t xml:space="preserve">strategic communications</w:t>
+              <w:t>strategic communications</w:t>
             </w:r>
             <w:r>
               <w:rPr>
@@ -1619,13 +1404,15 @@
                 <w:sz w:val="20"/>
                 <w:szCs w:val="20"/>
               </w:rPr>
-              <w:t xml:space="preserve">2026</w:t>
+              <w:t>2026</w:t>
             </w:r>
           </w:p>
         </w:tc>
       </w:tr>
       <w:tr>
         <w:trPr>
+          <w:gridBefore w:val="1"/>
+          <w:wBefore w:w="10" w:type="dxa"/>
           <w:trHeight w:val="67"/>
         </w:trPr>
         <w:tc>
@@ -1654,6 +1441,14 @@
                 <w:szCs w:val="20"/>
               </w:rPr>
               <w:t xml:space="preserve">Head Boy, </w:t>
+            </w:r>
+            <w:r>
+              <w:rPr>
+                <w:rFonts w:ascii="Garamond" w:eastAsia="Garamond" w:hAnsi="Garamond" w:cs="Garamond"/>
+                <w:b/>
+                <w:sz w:val="20"/>
+                <w:szCs w:val="20"/>
+              </w:rPr>
               <w:br/>
               <w:t>St. Arnold’s School</w:t>
             </w:r>
@@ -1662,7 +1457,7 @@
         <w:tc>
           <w:tcPr>
             <w:tcW w:w="8232" w:type="dxa"/>
-            <w:gridSpan w:val="2"/>
+            <w:gridSpan w:val="3"/>
             <w:tcBorders>
               <w:right w:val="nil"/>
             </w:tcBorders>
@@ -1685,7 +1480,7 @@
                 <w:sz w:val="20"/>
                 <w:szCs w:val="20"/>
               </w:rPr>
-              <w:t xml:space="preserve">Led the student council</w:t>
+              <w:t>Led the student council</w:t>
             </w:r>
             <w:r>
               <w:rPr>
@@ -1703,7 +1498,7 @@
                 <w:sz w:val="20"/>
                 <w:szCs w:val="20"/>
               </w:rPr>
-              <w:t xml:space="preserve">shortlisted 20 MUN delegates</w:t>
+              <w:t>shortlisted 20 MUN delegates</w:t>
             </w:r>
             <w:r>
               <w:rPr>
@@ -1721,7 +1516,7 @@
                 <w:sz w:val="20"/>
                 <w:szCs w:val="20"/>
               </w:rPr>
-              <w:t xml:space="preserve">discipline</w:t>
+              <w:t>discipline</w:t>
             </w:r>
             <w:r>
               <w:rPr>
@@ -1739,15 +1534,15 @@
                 <w:sz w:val="20"/>
                 <w:szCs w:val="20"/>
               </w:rPr>
-              <w:t xml:space="preserve">growth-oriented culture</w:t>
-            </w:r>
-            <w:r>
-              <w:rPr>
-                <w:rFonts w:ascii="Garamond" w:eastAsia="Garamond" w:hAnsi="Garamond" w:cs="Garamond"/>
-                <w:sz w:val="20"/>
-                <w:szCs w:val="20"/>
-              </w:rPr>
-              <w:t xml:space="preserve">.</w:t>
+              <w:t>growth-oriented culture</w:t>
+            </w:r>
+            <w:r>
+              <w:rPr>
+                <w:rFonts w:ascii="Garamond" w:eastAsia="Garamond" w:hAnsi="Garamond" w:cs="Garamond"/>
+                <w:sz w:val="20"/>
+                <w:szCs w:val="20"/>
+              </w:rPr>
+              <w:t>.</w:t>
             </w:r>
           </w:p>
         </w:tc>
@@ -1777,19 +1572,21 @@
                 <w:sz w:val="20"/>
                 <w:szCs w:val="20"/>
               </w:rPr>
-              <w:t xml:space="preserve">2024-25</w:t>
+              <w:t>2024-25</w:t>
             </w:r>
           </w:p>
         </w:tc>
       </w:tr>
       <w:tr>
         <w:trPr>
+          <w:gridBefore w:val="1"/>
+          <w:wBefore w:w="10" w:type="dxa"/>
           <w:trHeight w:val="67"/>
         </w:trPr>
         <w:tc>
           <w:tcPr>
             <w:tcW w:w="11325" w:type="dxa"/>
-            <w:gridSpan w:val="6"/>
+            <w:gridSpan w:val="7"/>
             <w:shd w:val="clear" w:color="auto" w:fill="BFBFBF"/>
             <w:vAlign w:val="center"/>
           </w:tcPr>
@@ -1818,6 +1615,8 @@
       </w:tr>
       <w:tr>
         <w:trPr>
+          <w:gridBefore w:val="1"/>
+          <w:wBefore w:w="10" w:type="dxa"/>
           <w:trHeight w:val="67"/>
         </w:trPr>
         <w:tc>
@@ -1852,7 +1651,7 @@
         <w:tc>
           <w:tcPr>
             <w:tcW w:w="8232" w:type="dxa"/>
-            <w:gridSpan w:val="2"/>
+            <w:gridSpan w:val="3"/>
             <w:tcBorders>
               <w:right w:val="nil"/>
             </w:tcBorders>
@@ -1880,7 +1679,7 @@
                 <w:sz w:val="20"/>
                 <w:szCs w:val="20"/>
               </w:rPr>
-              <w:t xml:space="preserve">Rapid Chess:</w:t>
+              <w:t>Rapid Chess:</w:t>
             </w:r>
             <w:r>
               <w:rPr>
@@ -1914,7 +1713,7 @@
                 <w:sz w:val="20"/>
                 <w:szCs w:val="20"/>
               </w:rPr>
-              <w:t xml:space="preserve">MUN:</w:t>
+              <w:t>MUN:</w:t>
             </w:r>
             <w:r>
               <w:rPr>
@@ -1948,7 +1747,7 @@
                 <w:sz w:val="20"/>
                 <w:szCs w:val="20"/>
               </w:rPr>
-              <w:t xml:space="preserve">Research &amp; Speaking:</w:t>
+              <w:t>Research &amp; Speaking:</w:t>
             </w:r>
             <w:r>
               <w:rPr>
@@ -1984,12 +1783,16 @@
                 <w:sz w:val="20"/>
                 <w:szCs w:val="20"/>
               </w:rPr>
-              <w:t xml:space="preserve">2024-25</w:t>
+              <w:t>2024-25</w:t>
             </w:r>
           </w:p>
         </w:tc>
       </w:tr>
       <w:tr>
+        <w:trPr>
+          <w:gridBefore w:val="1"/>
+          <w:wBefore w:w="10" w:type="dxa"/>
+        </w:trPr>
         <w:tc>
           <w:tcPr>
             <w:tcW w:w="2078" w:type="dxa"/>
@@ -2016,14 +1819,14 @@
                 <w:sz w:val="20"/>
                 <w:szCs w:val="20"/>
               </w:rPr>
-              <w:t xml:space="preserve">Projects</w:t>
+              <w:t>Projects</w:t>
             </w:r>
           </w:p>
         </w:tc>
         <w:tc>
           <w:tcPr>
             <w:tcW w:w="8232" w:type="dxa"/>
-            <w:gridSpan w:val="2"/>
+            <w:gridSpan w:val="3"/>
             <w:tcBorders>
               <w:right w:val="nil"/>
             </w:tcBorders>
@@ -2051,15 +1854,73 @@
                 <w:sz w:val="20"/>
                 <w:szCs w:val="20"/>
               </w:rPr>
-              <w:t xml:space="preserve">Built small tools:</w:t>
-            </w:r>
-            <w:r>
-              <w:rPr>
-                <w:rFonts w:ascii="Garamond" w:eastAsia="Garamond" w:hAnsi="Garamond" w:cs="Garamond"/>
-                <w:sz w:val="20"/>
-                <w:szCs w:val="20"/>
-              </w:rPr>
-              <w:t xml:space="preserve"> induction-week browser games (escape room, murder mystery, live 100-player quiz); Firebase/React app for Student Council meeting records; lead-enrichment pipeline, Google Maps scraper and 76-college contact database for NextGenix; Python/Selenium WhatsApp automation for interview confirmations at Jarurat Care.</w:t>
+              <w:t>Students' Council web app (scouncilbms.vercel.app)</w:t>
+            </w:r>
+            <w:r>
+              <w:rPr>
+                <w:rFonts w:ascii="Garamond" w:eastAsia="Garamond" w:hAnsi="Garamond" w:cs="Garamond"/>
+                <w:bCs/>
+                <w:sz w:val="20"/>
+                <w:szCs w:val="20"/>
+              </w:rPr>
+              <w:t xml:space="preserve"> – built solo with </w:t>
+            </w:r>
+            <w:r>
+              <w:rPr>
+                <w:rFonts w:ascii="Garamond" w:eastAsia="Garamond" w:hAnsi="Garamond" w:cs="Garamond"/>
+                <w:b/>
+                <w:bCs/>
+                <w:sz w:val="20"/>
+                <w:szCs w:val="20"/>
+              </w:rPr>
+              <w:t>Claude Code</w:t>
+            </w:r>
+            <w:r>
+              <w:rPr>
+                <w:rFonts w:ascii="Garamond" w:eastAsia="Garamond" w:hAnsi="Garamond" w:cs="Garamond"/>
+                <w:bCs/>
+                <w:sz w:val="20"/>
+                <w:szCs w:val="20"/>
+              </w:rPr>
+              <w:t xml:space="preserve"> on </w:t>
+            </w:r>
+            <w:r>
+              <w:rPr>
+                <w:rFonts w:ascii="Garamond" w:eastAsia="Garamond" w:hAnsi="Garamond" w:cs="Garamond"/>
+                <w:b/>
+                <w:bCs/>
+                <w:sz w:val="20"/>
+                <w:szCs w:val="20"/>
+              </w:rPr>
+              <w:t>Next.js + Supabase</w:t>
+            </w:r>
+            <w:r>
+              <w:rPr>
+                <w:rFonts w:ascii="Garamond" w:eastAsia="Garamond" w:hAnsi="Garamond" w:cs="Garamond"/>
+                <w:bCs/>
+                <w:sz w:val="20"/>
+                <w:szCs w:val="20"/>
+              </w:rPr>
+              <w:t xml:space="preserve">: public site for 4 committees and 10 clubs (events, calendar, gallery, notices, search) and a members' portal with multi-person tasks, attendance, committee chat, access-controlled documents and event/expense reports. Also: a </w:t>
+            </w:r>
+            <w:r>
+              <w:rPr>
+                <w:rFonts w:ascii="Garamond" w:eastAsia="Garamond" w:hAnsi="Garamond" w:cs="Garamond"/>
+                <w:b/>
+                <w:bCs/>
+                <w:sz w:val="20"/>
+                <w:szCs w:val="20"/>
+              </w:rPr>
+              <w:t>live multiplayer guessing game</w:t>
+            </w:r>
+            <w:r>
+              <w:rPr>
+                <w:rFonts w:ascii="Garamond" w:eastAsia="Garamond" w:hAnsi="Garamond" w:cs="Garamond"/>
+                <w:bCs/>
+                <w:sz w:val="20"/>
+                <w:szCs w:val="20"/>
+              </w:rPr>
+              <w:t xml:space="preserve"> players join from their phones; induction-week browser games (escape room, murder mystery, 100-player quiz); lead-enrichment pipeline, Maps scraper and 76-college database (NextGenix).</w:t>
             </w:r>
           </w:p>
         </w:tc>
@@ -2089,12 +1950,16 @@
                 <w:sz w:val="20"/>
                 <w:szCs w:val="20"/>
               </w:rPr>
-              <w:t xml:space="preserve">2026</w:t>
+              <w:t>2026</w:t>
             </w:r>
           </w:p>
         </w:tc>
       </w:tr>
       <w:tr>
+        <w:trPr>
+          <w:gridBefore w:val="1"/>
+          <w:wBefore w:w="10" w:type="dxa"/>
+        </w:trPr>
         <w:tc>
           <w:tcPr>
             <w:tcW w:w="2078" w:type="dxa"/>
@@ -2121,14 +1986,14 @@
                 <w:sz w:val="20"/>
                 <w:szCs w:val="20"/>
               </w:rPr>
-              <w:t xml:space="preserve">Initiatives</w:t>
+              <w:t>Initiatives</w:t>
             </w:r>
           </w:p>
         </w:tc>
         <w:tc>
           <w:tcPr>
             <w:tcW w:w="8232" w:type="dxa"/>
-            <w:gridSpan w:val="2"/>
+            <w:gridSpan w:val="3"/>
             <w:tcBorders>
               <w:right w:val="nil"/>
             </w:tcBorders>
@@ -2156,7 +2021,7 @@
                 <w:sz w:val="20"/>
                 <w:szCs w:val="20"/>
               </w:rPr>
-              <w:t xml:space="preserve">Organised and ran:</w:t>
+              <w:t>Organised and ran:</w:t>
             </w:r>
             <w:r>
               <w:rPr>
@@ -2194,13 +2059,15 @@
                 <w:sz w:val="20"/>
                 <w:szCs w:val="20"/>
               </w:rPr>
-              <w:t xml:space="preserve">2026</w:t>
+              <w:t>2026</w:t>
             </w:r>
           </w:p>
         </w:tc>
       </w:tr>
       <w:tr>
         <w:trPr>
+          <w:gridBefore w:val="1"/>
+          <w:wBefore w:w="10" w:type="dxa"/>
           <w:trHeight w:val="67"/>
         </w:trPr>
         <w:tc>
@@ -2235,7 +2102,7 @@
         <w:tc>
           <w:tcPr>
             <w:tcW w:w="8232" w:type="dxa"/>
-            <w:gridSpan w:val="2"/>
+            <w:gridSpan w:val="3"/>
             <w:tcBorders>
               <w:right w:val="nil"/>
             </w:tcBorders>
@@ -2263,7 +2130,7 @@
                 <w:sz w:val="20"/>
                 <w:szCs w:val="20"/>
               </w:rPr>
-              <w:t xml:space="preserve">Sports &amp; Training:</w:t>
+              <w:t>Sports &amp; Training:</w:t>
             </w:r>
             <w:r>
               <w:rPr>
@@ -2281,7 +2148,7 @@
                 <w:sz w:val="20"/>
                 <w:szCs w:val="20"/>
               </w:rPr>
-              <w:t xml:space="preserve">Inter-IPM College Badminton Tournament</w:t>
+              <w:t>Inter-IPM College Badminton Tournament</w:t>
             </w:r>
             <w:r>
               <w:rPr>
@@ -2299,7 +2166,7 @@
                 <w:sz w:val="20"/>
                 <w:szCs w:val="20"/>
               </w:rPr>
-              <w:t xml:space="preserve">NCC ‘A’ Certificate</w:t>
+              <w:t>NCC ‘A’ Certificate</w:t>
             </w:r>
             <w:r>
               <w:rPr>
@@ -2335,19 +2202,21 @@
                 <w:sz w:val="20"/>
                 <w:szCs w:val="20"/>
               </w:rPr>
-              <w:t xml:space="preserve">2026</w:t>
+              <w:t>2026</w:t>
             </w:r>
           </w:p>
         </w:tc>
       </w:tr>
       <w:tr>
         <w:trPr>
+          <w:gridBefore w:val="1"/>
+          <w:wBefore w:w="10" w:type="dxa"/>
           <w:trHeight w:val="67"/>
         </w:trPr>
         <w:tc>
           <w:tcPr>
             <w:tcW w:w="11325" w:type="dxa"/>
-            <w:gridSpan w:val="6"/>
+            <w:gridSpan w:val="7"/>
             <w:shd w:val="clear" w:color="auto" w:fill="BFBFBF"/>
             <w:vAlign w:val="center"/>
           </w:tcPr>
@@ -2376,6 +2245,8 @@
       </w:tr>
       <w:tr>
         <w:trPr>
+          <w:gridBefore w:val="1"/>
+          <w:wBefore w:w="10" w:type="dxa"/>
           <w:trHeight w:val="251"/>
         </w:trPr>
         <w:tc>
@@ -2414,7 +2285,7 @@
         <w:tc>
           <w:tcPr>
             <w:tcW w:w="9247" w:type="dxa"/>
-            <w:gridSpan w:val="4"/>
+            <w:gridSpan w:val="5"/>
             <w:tcBorders>
               <w:bottom w:val="single" w:sz="4" w:space="0" w:color="000000"/>
             </w:tcBorders>
@@ -2442,13 +2313,15 @@
                 <w:sz w:val="20"/>
                 <w:szCs w:val="20"/>
               </w:rPr>
-              <w:t xml:space="preserve">Event Management, Budgeting &amp; P&amp;L Tracking, B2B Outreach &amp; Sales Coordination, Data Analysis &amp; Reporting, Strategic Thinking, Public Speaking.</w:t>
+              <w:t>Event Management, Budgeting &amp; P&amp;L Tracking, B2B Outreach &amp; Sales Coordination, Data Analysis &amp; Reporting, Strategic Thinking, Public Speaking.</w:t>
             </w:r>
           </w:p>
         </w:tc>
       </w:tr>
       <w:tr>
         <w:trPr>
+          <w:gridBefore w:val="1"/>
+          <w:wBefore w:w="10" w:type="dxa"/>
           <w:trHeight w:val="251"/>
         </w:trPr>
         <w:tc>
@@ -2488,7 +2361,7 @@
         <w:tc>
           <w:tcPr>
             <w:tcW w:w="9247" w:type="dxa"/>
-            <w:gridSpan w:val="4"/>
+            <w:gridSpan w:val="5"/>
             <w:tcBorders>
               <w:bottom w:val="single" w:sz="4" w:space="0" w:color="000000"/>
             </w:tcBorders>
@@ -2516,11 +2389,50 @@
                 <w:sz w:val="20"/>
                 <w:szCs w:val="20"/>
               </w:rPr>
-              <w:t xml:space="preserve">Python (Selenium, BeautifulSoup, REST APIs), Firebase &amp; React, HTML/JS</w:t>
-            </w:r>
-            <w:r>
-              <w:rPr>
-                <w:rFonts w:ascii="Garamond" w:eastAsia="Garamond" w:hAnsi="Garamond" w:cs="Garamond"/>
+              <w:t>AI-assisted development (Claude Code)</w:t>
+            </w:r>
+            <w:r>
+              <w:rPr>
+                <w:rFonts w:ascii="Garamond" w:eastAsia="Garamond" w:hAnsi="Garamond" w:cs="Garamond"/>
+                <w:bCs/>
+                <w:sz w:val="20"/>
+                <w:szCs w:val="20"/>
+              </w:rPr>
+              <w:t xml:space="preserve">; </w:t>
+            </w:r>
+            <w:r>
+              <w:rPr>
+                <w:rFonts w:ascii="Garamond" w:eastAsia="Garamond" w:hAnsi="Garamond" w:cs="Garamond"/>
+                <w:b/>
+                <w:bCs/>
+                <w:sz w:val="20"/>
+                <w:szCs w:val="20"/>
+              </w:rPr>
+              <w:t>Next.js, Supabase, Firebase &amp; React, HTML/JS</w:t>
+            </w:r>
+            <w:r>
+              <w:rPr>
+                <w:rFonts w:ascii="Garamond" w:eastAsia="Garamond" w:hAnsi="Garamond" w:cs="Garamond"/>
+                <w:bCs/>
+                <w:sz w:val="20"/>
+                <w:szCs w:val="20"/>
+              </w:rPr>
+              <w:t xml:space="preserve">; </w:t>
+            </w:r>
+            <w:r>
+              <w:rPr>
+                <w:rFonts w:ascii="Garamond" w:eastAsia="Garamond" w:hAnsi="Garamond" w:cs="Garamond"/>
+                <w:b/>
+                <w:bCs/>
+                <w:sz w:val="20"/>
+                <w:szCs w:val="20"/>
+              </w:rPr>
+              <w:t>Python (Selenium, BeautifulSoup, pandas, REST APIs)</w:t>
+            </w:r>
+            <w:r>
+              <w:rPr>
+                <w:rFonts w:ascii="Garamond" w:eastAsia="Garamond" w:hAnsi="Garamond" w:cs="Garamond"/>
+                <w:bCs/>
                 <w:sz w:val="20"/>
                 <w:szCs w:val="20"/>
               </w:rPr>
@@ -2534,11 +2446,12 @@
                 <w:sz w:val="20"/>
                 <w:szCs w:val="20"/>
               </w:rPr>
-              <w:t xml:space="preserve">Excel/Google Sheets</w:t>
-            </w:r>
-            <w:r>
-              <w:rPr>
-                <w:rFonts w:ascii="Garamond" w:eastAsia="Garamond" w:hAnsi="Garamond" w:cs="Garamond"/>
+              <w:t>Excel/Google Sheets</w:t>
+            </w:r>
+            <w:r>
+              <w:rPr>
+                <w:rFonts w:ascii="Garamond" w:eastAsia="Garamond" w:hAnsi="Garamond" w:cs="Garamond"/>
+                <w:bCs/>
                 <w:sz w:val="20"/>
                 <w:szCs w:val="20"/>
               </w:rPr>
@@ -2552,11 +2465,12 @@
                 <w:sz w:val="20"/>
                 <w:szCs w:val="20"/>
               </w:rPr>
-              <w:t xml:space="preserve">DaVinci Resolve</w:t>
-            </w:r>
-            <w:r>
-              <w:rPr>
-                <w:rFonts w:ascii="Garamond" w:eastAsia="Garamond" w:hAnsi="Garamond" w:cs="Garamond"/>
+              <w:t>DaVinci Resolve</w:t>
+            </w:r>
+            <w:r>
+              <w:rPr>
+                <w:rFonts w:ascii="Garamond" w:eastAsia="Garamond" w:hAnsi="Garamond" w:cs="Garamond"/>
+                <w:bCs/>
                 <w:sz w:val="20"/>
                 <w:szCs w:val="20"/>
               </w:rPr>
@@ -2570,239 +2484,16 @@
                 <w:sz w:val="20"/>
                 <w:szCs w:val="20"/>
               </w:rPr>
-              <w:t xml:space="preserve">SQL &amp; Google Data Analytics</w:t>
-            </w:r>
-            <w:r>
-              <w:rPr>
-                <w:rFonts w:ascii="Garamond" w:eastAsia="Garamond" w:hAnsi="Garamond" w:cs="Garamond"/>
+              <w:t>SQL &amp; Google Data Analytics</w:t>
+            </w:r>
+            <w:r>
+              <w:rPr>
+                <w:rFonts w:ascii="Garamond" w:eastAsia="Garamond" w:hAnsi="Garamond" w:cs="Garamond"/>
+                <w:bCs/>
                 <w:sz w:val="20"/>
                 <w:szCs w:val="20"/>
               </w:rPr>
               <w:t xml:space="preserve"> (Coursera) in progress.</w:t>
-            </w:r>
-          </w:p>
-        </w:tc>
-      </w:tr>
-      <w:tr>
-        <w:trPr>
-          <w:trHeight w:val="251"/>
-        </w:trPr>
-        <w:tc>
-          <w:tcPr>
-            <w:tcW w:w="2078" w:type="dxa"/>
-            <w:gridSpan w:val="2"/>
-            <w:shd w:val="clear" w:color="auto" w:fill="D9D9D9"/>
-            <w:vAlign w:val="center"/>
-          </w:tcPr>
-          <w:p>
-            <w:pPr>
-              <w:spacing w:line="240" w:lineRule="auto"/>
-              <w:jc w:val="center"/>
-              <w:rPr>
-                <w:rFonts w:ascii="Garamond" w:eastAsia="Garamond" w:hAnsi="Garamond" w:cs="Garamond"/>
-                <w:b/>
-                <w:sz w:val="20"/>
-                <w:szCs w:val="20"/>
-              </w:rPr>
-            </w:pPr>
-            <w:r>
-              <w:rPr>
-                <w:rFonts w:ascii="Garamond" w:eastAsia="Garamond" w:hAnsi="Garamond" w:cs="Garamond"/>
-                <w:b/>
-                <w:sz w:val="20"/>
-                <w:szCs w:val="20"/>
-              </w:rPr>
-              <w:t>Soft Skills</w:t>
-            </w:r>
-          </w:p>
-        </w:tc>
-        <w:tc>
-          <w:tcPr>
-            <w:tcW w:w="9247" w:type="dxa"/>
-            <w:gridSpan w:val="4"/>
-          </w:tcPr>
-          <w:p>
-            <w:pPr>
-              <w:numPr>
-                <w:ilvl w:val="0"/>
-                <w:numId w:val="3"/>
-              </w:numPr>
-              <w:spacing w:line="240" w:lineRule="auto"/>
-              <w:ind w:left="176"/>
-              <w:rPr>
-                <w:rFonts w:ascii="Garamond" w:eastAsia="Garamond" w:hAnsi="Garamond" w:cs="Garamond"/>
-                <w:bCs/>
-                <w:sz w:val="20"/>
-                <w:szCs w:val="20"/>
-              </w:rPr>
-            </w:pPr>
-            <w:r>
-              <w:rPr>
-                <w:rFonts w:ascii="Garamond" w:eastAsia="Garamond" w:hAnsi="Garamond" w:cs="Garamond"/>
-                <w:b/>
-                <w:bCs/>
-                <w:sz w:val="20"/>
-                <w:szCs w:val="20"/>
-              </w:rPr>
-              <w:t xml:space="preserve">Problem-Solving, Cross-functional Collaboration, Stakeholder Management, Clear Verbal &amp; Written Communication.</w:t>
-            </w:r>
-          </w:p>
-        </w:tc>
-      </w:tr>
-    </w:tbl>
-    <w:tbl>
-      <w:tblPr>
-        <w:tblW w:w="11325" w:type="dxa"/>
-        <w:tblInd w:w="180" w:type="dxa"/>
-        <w:tblBorders>
-          <w:top w:val="single" w:sz="8" w:space="0" w:color="000000"/>
-          <w:left w:val="single" w:sz="8" w:space="0" w:color="000000"/>
-          <w:bottom w:val="single" w:sz="8" w:space="0" w:color="000000"/>
-          <w:right w:val="single" w:sz="8" w:space="0" w:color="000000"/>
-          <w:insideH w:val="single" w:sz="4" w:space="0" w:color="000000"/>
-          <w:insideV w:val="single" w:sz="4" w:space="0" w:color="000000"/>
-        </w:tblBorders>
-        <w:tblLayout w:type="fixed"/>
-        <w:tblLook w:val="0400" w:firstRow="0" w:lastRow="0" w:firstColumn="0" w:lastColumn="0" w:noHBand="0" w:noVBand="1"/>
-      </w:tblPr>
-      <w:tblGrid>
-        <w:gridCol w:w="2078"/>
-        <w:gridCol w:w="9247"/>
-      </w:tblGrid>
-      <w:tr>
-        <w:trPr>
-          <w:trHeight w:val="67"/>
-        </w:trPr>
-        <w:tc>
-          <w:tcPr>
-            <w:tcW w:w="11325" w:type="dxa"/>
-            <w:gridSpan w:val="2"/>
-            <w:shd w:val="clear" w:color="auto" w:fill="BFBFBF"/>
-            <w:vAlign w:val="center"/>
-          </w:tcPr>
-          <w:p>
-            <w:pPr>
-              <w:spacing w:line="240" w:lineRule="auto"/>
-              <w:jc w:val="center"/>
-              <w:rPr>
-                <w:rFonts w:ascii="Garamond" w:eastAsia="Garamond" w:hAnsi="Garamond" w:cs="Garamond"/>
-                <w:b/>
-                <w:sz w:val="20"/>
-                <w:szCs w:val="20"/>
-              </w:rPr>
-            </w:pPr>
-            <w:r>
-              <w:rPr>
-                <w:rFonts w:ascii="Garamond" w:eastAsia="Garamond" w:hAnsi="Garamond" w:cs="Garamond"/>
-                <w:b/>
-                <w:sz w:val="20"/>
-                <w:szCs w:val="20"/>
-              </w:rPr>
-              <w:t>Hobbies</w:t>
-            </w:r>
-          </w:p>
-        </w:tc>
-      </w:tr>
-      <w:tr>
-        <w:trPr>
-          <w:trHeight w:val="251"/>
-        </w:trPr>
-        <w:tc>
-          <w:tcPr>
-            <w:tcW w:w="2078" w:type="dxa"/>
-            <w:tcBorders>
-              <w:bottom w:val="single" w:sz="4" w:space="0" w:color="000000"/>
-            </w:tcBorders>
-            <w:shd w:val="clear" w:color="auto" w:fill="D9D9D9"/>
-            <w:vAlign w:val="center"/>
-          </w:tcPr>
-          <w:p>
-            <w:pPr>
-              <w:spacing w:line="240" w:lineRule="auto"/>
-              <w:jc w:val="center"/>
-              <w:rPr>
-                <w:rFonts w:ascii="Garamond" w:eastAsia="Garamond" w:hAnsi="Garamond" w:cs="Garamond"/>
-                <w:b/>
-                <w:sz w:val="20"/>
-                <w:szCs w:val="20"/>
-              </w:rPr>
-            </w:pPr>
-            <w:r>
-              <w:rPr>
-                <w:rFonts w:ascii="Garamond" w:eastAsia="Garamond" w:hAnsi="Garamond" w:cs="Garamond"/>
-                <w:b/>
-                <w:sz w:val="20"/>
-                <w:szCs w:val="20"/>
-              </w:rPr>
-              <w:t>Playing Chess</w:t>
-            </w:r>
-          </w:p>
-        </w:tc>
-        <w:tc>
-          <w:tcPr>
-            <w:tcW w:w="9247" w:type="dxa"/>
-            <w:tcBorders>
-              <w:bottom w:val="single" w:sz="4" w:space="0" w:color="000000"/>
-            </w:tcBorders>
-          </w:tcPr>
-          <w:p>
-            <w:pPr>
-              <w:numPr>
-                <w:ilvl w:val="0"/>
-                <w:numId w:val="3"/>
-              </w:numPr>
-              <w:spacing w:line="240" w:lineRule="auto"/>
-              <w:jc w:val="both"/>
-              <w:rPr>
-                <w:rFonts w:ascii="Garamond" w:eastAsia="Garamond" w:hAnsi="Garamond" w:cs="Garamond"/>
-                <w:b/>
-                <w:sz w:val="20"/>
-                <w:szCs w:val="20"/>
-              </w:rPr>
-            </w:pPr>
-            <w:r>
-              <w:rPr>
-                <w:rFonts w:ascii="Garamond" w:hAnsi="Garamond"/>
-                <w:sz w:val="20"/>
-                <w:szCs w:val="20"/>
-              </w:rPr>
-              <w:t xml:space="preserve">Enhances </w:t>
-            </w:r>
-            <w:r>
-              <w:rPr>
-                <w:rFonts w:ascii="Garamond" w:hAnsi="Garamond"/>
-                <w:b/>
-                <w:bCs/>
-                <w:sz w:val="20"/>
-                <w:szCs w:val="20"/>
-              </w:rPr>
-              <w:t>strategic thinking</w:t>
-            </w:r>
-            <w:r>
-              <w:rPr>
-                <w:rFonts w:ascii="Garamond" w:hAnsi="Garamond"/>
-                <w:sz w:val="20"/>
-                <w:szCs w:val="20"/>
-              </w:rPr>
-              <w:t xml:space="preserve"> and helps stay </w:t>
-            </w:r>
-            <w:r>
-              <w:rPr>
-                <w:rFonts w:ascii="Garamond" w:hAnsi="Garamond"/>
-                <w:b/>
-                <w:bCs/>
-                <w:sz w:val="20"/>
-                <w:szCs w:val="20"/>
-              </w:rPr>
-              <w:t>calm</w:t>
-            </w:r>
-            <w:r>
-              <w:rPr>
-                <w:rFonts w:ascii="Garamond" w:hAnsi="Garamond"/>
-                <w:sz w:val="20"/>
-                <w:szCs w:val="20"/>
-              </w:rPr>
-              <w:t xml:space="preserve"> under pressure.</w:t>
             </w:r>
           </w:p>
         </w:tc>
@@ -2810,7 +2501,7 @@
     </w:tbl>
     <w:p>
       <w:pPr>
-        <w:spacing w:before="0" w:after="0" w:line="14" w:lineRule="exact"/>
+        <w:spacing w:line="14" w:lineRule="exact"/>
         <w:rPr>
           <w:sz w:val="2"/>
           <w:szCs w:val="2"/>
@@ -2870,36 +2561,6 @@
         <w:rFonts w:ascii="Garamond" w:eastAsia="Garamond" w:hAnsi="Garamond" w:cs="Garamond"/>
       </w:rPr>
       <w:t>Email: bms25jeet@iimk.ac.in | Phone: +91-93296 41726 | LinkedIn: linkedin.com/in/jeetjhawar | Portfolio: jeetjhawar.github.io | GitHub: github.com/JEETJHAWAR</w:t>
-    </w:r>
-    <w:r>
-      <w:rPr>
-        <w:rFonts w:ascii="Garamond" w:eastAsia="Garamond" w:hAnsi="Garamond" w:cs="Garamond"/>
-      </w:rPr>
-      <w:t xml:space="preserve"/>
-    </w:r>
-    <w:r>
-      <w:rPr>
-        <w:rFonts w:ascii="Garamond" w:eastAsia="Garamond" w:hAnsi="Garamond" w:cs="Garamond"/>
-      </w:rPr>
-      <w:t xml:space="preserve"/>
-    </w:r>
-    <w:r>
-      <w:rPr>
-        <w:rFonts w:ascii="Garamond" w:eastAsia="Garamond" w:hAnsi="Garamond" w:cs="Garamond"/>
-      </w:rPr>
-      <w:t/>
-    </w:r>
-    <w:r>
-      <w:rPr>
-        <w:rFonts w:ascii="Garamond" w:eastAsia="Garamond" w:hAnsi="Garamond" w:cs="Garamond"/>
-      </w:rPr>
-      <w:t xml:space="preserve"/>
-    </w:r>
-    <w:r>
-      <w:rPr>
-        <w:rFonts w:ascii="Garamond" w:eastAsia="Garamond" w:hAnsi="Garamond" w:cs="Garamond"/>
-      </w:rPr>
-      <w:t/>
     </w:r>
   </w:p>
 </w:ftr>

</xml_diff>